<commit_message>
Revise documentation and project deliverables for the Uganda Health MOU. Update the build_dos-uganda_docs.py script to reflect changes in the Statement of Interest, including new objectives and a focus on interoperability. Enhance the Word, PDF, and PowerPoint outputs with updated titles, subtitles, and content to align with the latest project guidelines. Introduce a new Grants URL for reference and ensure all documents maintain consistency with the project's branding and messaging standards.
</commit_message>
<xml_diff>
--- a/applications/dos-uganda/documents/dos-uganda_word.docx
+++ b/applications/dos-uganda/documents/dos-uganda_word.docx
@@ -4,7 +4,7 @@
   <w:body>
     <w:p>
       <w:pPr>
-        <w:spacing w:after="80"/>
+        <w:spacing w:after="60"/>
         <w:jc w:val="center"/>
       </w:pPr>
       <w:r>
@@ -13,9 +13,41 @@
           <w:b/>
           <w:i w:val="0"/>
           <w:color w:val="0D6E6E"/>
+          <w:sz w:val="22"/>
+        </w:rPr>
+        <w:t>U.S. Department of State / GHSD — Advancing Global Health (DFOP0017890)</w:t>
+      </w:r>
+    </w:p>
+    <w:p>
+      <w:pPr>
+        <w:spacing w:after="60"/>
+        <w:jc w:val="center"/>
+      </w:pPr>
+      <w:r>
+        <w:rPr>
+          <w:rFonts w:ascii="Calibri" w:hAnsi="Calibri" w:eastAsia="Calibri"/>
+          <w:b/>
+          <w:i w:val="0"/>
+          <w:color w:val="0A1F2E"/>
+          <w:sz w:val="40"/>
+        </w:rPr>
+        <w:t>Statement of Interest — Step 1</w:t>
+      </w:r>
+    </w:p>
+    <w:p>
+      <w:pPr>
+        <w:spacing w:after="60"/>
+        <w:jc w:val="center"/>
+      </w:pPr>
+      <w:r>
+        <w:rPr>
+          <w:rFonts w:ascii="Calibri" w:hAnsi="Calibri" w:eastAsia="Calibri"/>
+          <w:b/>
+          <w:i/>
+          <w:color w:val="C45C26"/>
           <w:sz w:val="24"/>
         </w:rPr>
-        <w:t>U.S.–Uganda Health MOU — Funding Opportunity DFOP0017890</w:t>
+        <w:t>FairBanks Medical Centre  ·  FairBanks Community Reach  ·  FCHIP</w:t>
       </w:r>
     </w:p>
     <w:p>
@@ -26,49 +58,17 @@
       <w:r>
         <w:rPr>
           <w:rFonts w:ascii="Calibri" w:hAnsi="Calibri" w:eastAsia="Calibri"/>
-          <w:b/>
-          <w:i w:val="0"/>
-          <w:color w:val="0A1F2E"/>
-          <w:sz w:val="44"/>
+          <w:b w:val="0"/>
+          <w:i/>
+          <w:color w:val="3A4A54"/>
+          <w:sz w:val="20"/>
         </w:rPr>
-        <w:t>Statement of Interest — Objective 4 Digital Health Scale-Up</w:t>
+        <w:t>Addendum E: Health Foreign Assistance MOU Implementation in Uganda  |  Objective 4: Strengthen and Scale Digital Health Systems</w:t>
       </w:r>
     </w:p>
     <w:p>
       <w:pPr>
-        <w:spacing w:after="80"/>
-        <w:jc w:val="center"/>
-      </w:pPr>
-      <w:r>
-        <w:rPr>
-          <w:rFonts w:ascii="Calibri" w:hAnsi="Calibri" w:eastAsia="Calibri"/>
-          <w:b/>
-          <w:i/>
-          <w:color w:val="C45C26"/>
-          <w:sz w:val="26"/>
-        </w:rPr>
-        <w:t>FairBanks Community Health Intelligence Platform (FCHIP)</w:t>
-      </w:r>
-    </w:p>
-    <w:p>
-      <w:pPr>
-        <w:spacing w:after="120"/>
-        <w:jc w:val="center"/>
-      </w:pPr>
-      <w:r>
-        <w:rPr>
-          <w:rFonts w:ascii="Calibri" w:hAnsi="Calibri" w:eastAsia="Calibri"/>
-          <w:b w:val="0"/>
-          <w:i/>
-          <w:color w:val="3A4A54"/>
-          <w:sz w:val="24"/>
-        </w:rPr>
-        <w:t>Community-to-facility intelligence interoperable with eCHIS and DHIS2</w:t>
-      </w:r>
-    </w:p>
-    <w:p>
-      <w:pPr>
-        <w:spacing w:after="240"/>
+        <w:spacing w:after="160"/>
         <w:jc w:val="center"/>
       </w:pPr>
       <w:r>
@@ -89,7 +89,7 @@
       <w:r>
         <w:drawing>
           <wp:inline xmlns:a="http://schemas.openxmlformats.org/drawingml/2006/main" xmlns:pic="http://schemas.openxmlformats.org/drawingml/2006/picture">
-            <wp:extent cx="5486400" cy="3084141"/>
+            <wp:extent cx="4937760" cy="2775727"/>
             <wp:docPr id="1" name="Picture 1"/>
             <wp:cNvGraphicFramePr>
               <a:graphicFrameLocks noChangeAspect="1"/>
@@ -110,7 +110,7 @@
                   <pic:spPr>
                     <a:xfrm>
                       <a:off x="0" y="0"/>
-                      <a:ext cx="5486400" cy="3084141"/>
+                      <a:ext cx="4937760" cy="2775727"/>
                     </a:xfrm>
                     <a:prstGeom prst="rect"/>
                   </pic:spPr>
@@ -123,7 +123,7 @@
     </w:p>
     <w:p>
       <w:pPr>
-        <w:spacing w:after="200"/>
+        <w:spacing w:after="160"/>
         <w:jc w:val="center"/>
       </w:pPr>
       <w:r>
@@ -132,9 +132,25 @@
           <w:b w:val="0"/>
           <w:i/>
           <w:color w:val="3A4A54"/>
+          <w:sz w:val="16"/>
+        </w:rPr>
+        <w:t>FairBanks — community health ecosystem rooted in Uganda</w:t>
+      </w:r>
+    </w:p>
+    <w:p>
+      <w:pPr>
+        <w:spacing w:after="80"/>
+        <w:jc w:val="center"/>
+      </w:pPr>
+      <w:r>
+        <w:rPr>
+          <w:rFonts w:ascii="Calibri" w:hAnsi="Calibri" w:eastAsia="Calibri"/>
+          <w:b w:val="0"/>
+          <w:i w:val="0"/>
+          <w:color w:val="3A4A54"/>
           <w:sz w:val="18"/>
         </w:rPr>
-        <w:t>FairBanks — community health ecosystem rooted in Uganda</w:t>
+        <w:t>SOI deadline: 31 July 2026, 5:00 PM EDT  |  Opportunity: DFOP0017890  |  Addendum E — Uganda Health MOU</w:t>
       </w:r>
     </w:p>
     <w:p>
@@ -144,7 +160,7 @@
     </w:p>
     <w:p>
       <w:pPr>
-        <w:spacing w:before="280" w:after="120"/>
+        <w:spacing w:before="240" w:after="100"/>
       </w:pPr>
       <w:r>
         <w:rPr>
@@ -152,14 +168,14 @@
           <w:b/>
           <w:i w:val="0"/>
           <w:color w:val="0A1F2E"/>
-          <w:sz w:val="40"/>
+          <w:sz w:val="32"/>
         </w:rPr>
-        <w:t>I. Statement of Interest</w:t>
+        <w:t>I. The Problem We Address</w:t>
       </w:r>
     </w:p>
     <w:p>
       <w:pPr>
-        <w:spacing w:after="160"/>
+        <w:spacing w:after="120"/>
         <w:jc w:val="left"/>
       </w:pPr>
       <w:r>
@@ -168,14 +184,14 @@
           <w:b w:val="0"/>
           <w:i w:val="0"/>
           <w:color w:val="1E2F38"/>
-          <w:sz w:val="22"/>
+          <w:sz w:val="20"/>
         </w:rPr>
-        <w:t>FairBanks Medical Centre and FairBanks Community Reach respectfully submit this Statement of Interest under Objective 4: scaling digital health systems in Uganda. We propose to extend and interoperate community-generated health data — captured by Community Health Workers and Village Health Teams — with national platforms (eCHIS, DHIS2, facility EMRs) through FairBanks Community Health Intelligence Platform (FCHIP).</w:t>
+        <w:t>Uganda's five-year health transition (April 2026-December 2030) asks facilities, districts, and communities to keep HIV, TB, malaria, maternal and child health, immunisation, and outbreak services strong while shifting toward government-led, performance-based programming. That shift only works if decision-makers see what is happening at the last mile - not weeks later in paper registers.</w:t>
       </w:r>
     </w:p>
     <w:p>
       <w:pPr>
-        <w:spacing w:after="160"/>
+        <w:spacing w:after="120"/>
         <w:jc w:val="left"/>
       </w:pPr>
       <w:r>
@@ -184,14 +200,14 @@
           <w:b w:val="0"/>
           <w:i w:val="0"/>
           <w:color w:val="1E2F38"/>
-          <w:sz w:val="22"/>
+          <w:sz w:val="20"/>
         </w:rPr>
-        <w:t>FairBanks is a Ugandan social enterprise with a functioning medical centre, active outreach in Kampala communities, and established CHW/VHT relationships. We are not proposing a standalone app silo. We are proposing a bridge layer that strengthens Uganda's digital health architecture while keeping communities at the centre of care.</w:t>
+        <w:t>Community Health Workers and Village Health Teams already walk households and refer patients. Too often their work never reaches eCHIS, DHIS2, facility EMRs, or district dashboards in a usable form. National digital systems then miss early fever clusters, missed antenatal visits, immunisation gaps, and stock pressure. The result is reactive care, weak accountability, and higher risk that transition gains reverse.</w:t>
       </w:r>
     </w:p>
     <w:p>
       <w:pPr>
-        <w:spacing w:before="280" w:after="120"/>
+        <w:spacing w:before="240" w:after="100"/>
       </w:pPr>
       <w:r>
         <w:rPr>
@@ -199,9 +215,580 @@
           <w:b/>
           <w:i w:val="0"/>
           <w:color w:val="0A1F2E"/>
-          <w:sz w:val="40"/>
+          <w:sz w:val="32"/>
         </w:rPr>
-        <w:t>II. Organizational Capacity</w:t>
+        <w:t>II. Statement of Interest</w:t>
+      </w:r>
+    </w:p>
+    <w:p>
+      <w:pPr>
+        <w:spacing w:after="120"/>
+        <w:jc w:val="left"/>
+      </w:pPr>
+      <w:r>
+        <w:rPr>
+          <w:rFonts w:ascii="Calibri" w:hAnsi="Calibri" w:eastAsia="Calibri"/>
+          <w:b w:val="0"/>
+          <w:i w:val="0"/>
+          <w:color w:val="1E2F38"/>
+          <w:sz w:val="20"/>
+        </w:rPr>
+        <w:t>FairBanks Medical Centre and FairBanks Community Reach respectfully submit this Statement of Interest under Track 2, Objective 4 of the Uganda MOU Implementation Addendum: strengthen and scale digital health systems with full interoperability, government ownership, and sustainable operations.</w:t>
+      </w:r>
+    </w:p>
+    <w:p>
+      <w:pPr>
+        <w:spacing w:after="120"/>
+        <w:jc w:val="left"/>
+      </w:pPr>
+      <w:r>
+        <w:rPr>
+          <w:rFonts w:ascii="Calibri" w:hAnsi="Calibri" w:eastAsia="Calibri"/>
+          <w:b w:val="0"/>
+          <w:i w:val="0"/>
+          <w:color w:val="1E2F38"/>
+          <w:sz w:val="20"/>
+        </w:rPr>
+        <w:t>We propose to pilot and then transfer a community-to-facility intelligence layer - the FairBanks Community Health Intelligence Platform (FCHIP) - that captures CHW/VHT household and visit data offline, syncs securely, maps indicators to national reporting elements, and feeds facility and district action. FCHIP is not a parallel silo. It is a bridge that makes Uganda's existing digital stack (eCHIS, DHIS2, facility EMRs, and related national platforms) more complete at community level and more useful for prevention.</w:t>
+      </w:r>
+    </w:p>
+    <w:p>
+      <w:pPr>
+        <w:spacing w:before="240" w:after="100"/>
+      </w:pPr>
+      <w:r>
+        <w:rPr>
+          <w:rFonts w:ascii="Calibri" w:hAnsi="Calibri" w:eastAsia="Calibri"/>
+          <w:b/>
+          <w:i w:val="0"/>
+          <w:color w:val="0A1F2E"/>
+          <w:sz w:val="32"/>
+        </w:rPr>
+        <w:t>III. Win-Win Value Proposition</w:t>
+      </w:r>
+    </w:p>
+    <w:p>
+      <w:pPr>
+        <w:spacing w:after="120"/>
+        <w:jc w:val="left"/>
+      </w:pPr>
+      <w:r>
+        <w:rPr>
+          <w:rFonts w:ascii="Calibri" w:hAnsi="Calibri" w:eastAsia="Calibri"/>
+          <w:b w:val="0"/>
+          <w:i/>
+          <w:color w:val="1E2F38"/>
+          <w:sz w:val="20"/>
+        </w:rPr>
+        <w:t>This partnership is designed so each party gains something durable - not a one-sided software purchase.</w:t>
+      </w:r>
+    </w:p>
+    <w:tbl>
+      <w:tblPr>
+        <w:tblW w:type="auto" w:w="0"/>
+        <w:jc w:val="center"/>
+        <w:tblLook w:firstColumn="1" w:firstRow="1" w:lastColumn="0" w:lastRow="0" w:noHBand="0" w:noVBand="1" w:val="04A0"/>
+      </w:tblPr>
+      <w:tblGrid>
+        <w:gridCol w:w="4968"/>
+        <w:gridCol w:w="4968"/>
+      </w:tblGrid>
+      <w:tr>
+        <w:tc>
+          <w:tcPr>
+            <w:tcW w:type="dxa" w:w="3024"/>
+            <w:shd w:fill="0D6E6E"/>
+            <w:tcBorders>
+              <w:top w:val="single" w:sz="8" w:color="0D6E6E"/>
+              <w:left w:val="single" w:sz="8" w:color="0D6E6E"/>
+              <w:bottom w:val="single" w:sz="8" w:color="0D6E6E"/>
+              <w:right w:val="single" w:sz="8" w:color="0D6E6E"/>
+            </w:tcBorders>
+          </w:tcPr>
+          <w:p>
+            <w:r/>
+            <w:r>
+              <w:rPr>
+                <w:rFonts w:ascii="Calibri" w:hAnsi="Calibri" w:eastAsia="Calibri"/>
+                <w:b/>
+                <w:i w:val="0"/>
+                <w:color w:val="FFFFFF"/>
+                <w:sz w:val="18"/>
+              </w:rPr>
+              <w:t>Who gains</w:t>
+            </w:r>
+          </w:p>
+        </w:tc>
+        <w:tc>
+          <w:tcPr>
+            <w:tcW w:type="dxa" w:w="6480"/>
+            <w:shd w:fill="0D6E6E"/>
+            <w:tcBorders>
+              <w:top w:val="single" w:sz="8" w:color="0D6E6E"/>
+              <w:left w:val="single" w:sz="8" w:color="0D6E6E"/>
+              <w:bottom w:val="single" w:sz="8" w:color="0D6E6E"/>
+              <w:right w:val="single" w:sz="8" w:color="0D6E6E"/>
+            </w:tcBorders>
+          </w:tcPr>
+          <w:p>
+            <w:r/>
+            <w:r>
+              <w:rPr>
+                <w:rFonts w:ascii="Calibri" w:hAnsi="Calibri" w:eastAsia="Calibri"/>
+                <w:b/>
+                <w:i w:val="0"/>
+                <w:color w:val="FFFFFF"/>
+                <w:sz w:val="18"/>
+              </w:rPr>
+              <w:t>What they gain</w:t>
+            </w:r>
+          </w:p>
+        </w:tc>
+      </w:tr>
+      <w:tr>
+        <w:tc>
+          <w:tcPr>
+            <w:tcW w:type="dxa" w:w="3024"/>
+            <w:tcBorders>
+              <w:top w:val="single" w:sz="8" w:color="D0DCDC"/>
+              <w:left w:val="single" w:sz="8" w:color="D0DCDC"/>
+              <w:bottom w:val="single" w:sz="8" w:color="D0DCDC"/>
+              <w:right w:val="single" w:sz="8" w:color="D0DCDC"/>
+            </w:tcBorders>
+          </w:tcPr>
+          <w:p>
+            <w:r/>
+            <w:r>
+              <w:rPr>
+                <w:rFonts w:ascii="Calibri" w:hAnsi="Calibri" w:eastAsia="Calibri"/>
+                <w:b w:val="0"/>
+                <w:i w:val="0"/>
+                <w:color w:val="1E2F38"/>
+                <w:sz w:val="18"/>
+              </w:rPr>
+              <w:t>Uganda / Ministry of Health</w:t>
+            </w:r>
+          </w:p>
+        </w:tc>
+        <w:tc>
+          <w:tcPr>
+            <w:tcW w:type="dxa" w:w="6480"/>
+            <w:tcBorders>
+              <w:top w:val="single" w:sz="8" w:color="D0DCDC"/>
+              <w:left w:val="single" w:sz="8" w:color="D0DCDC"/>
+              <w:bottom w:val="single" w:sz="8" w:color="D0DCDC"/>
+              <w:right w:val="single" w:sz="8" w:color="D0DCDC"/>
+            </w:tcBorders>
+          </w:tcPr>
+          <w:p>
+            <w:r/>
+            <w:r>
+              <w:rPr>
+                <w:rFonts w:ascii="Calibri" w:hAnsi="Calibri" w:eastAsia="Calibri"/>
+                <w:b w:val="0"/>
+                <w:i w:val="0"/>
+                <w:color w:val="1E2F38"/>
+                <w:sz w:val="18"/>
+              </w:rPr>
+              <w:t>Richer last-mile data into eCHIS and DHIS2; clearer referral closure; documented handoff pathways toward government ownership and reduced dependence on parallel partner tools.</w:t>
+            </w:r>
+          </w:p>
+        </w:tc>
+      </w:tr>
+      <w:tr>
+        <w:tc>
+          <w:tcPr>
+            <w:tcW w:type="dxa" w:w="3024"/>
+            <w:shd w:fill="F7F5F0"/>
+            <w:tcBorders>
+              <w:top w:val="single" w:sz="8" w:color="D0DCDC"/>
+              <w:left w:val="single" w:sz="8" w:color="D0DCDC"/>
+              <w:bottom w:val="single" w:sz="8" w:color="D0DCDC"/>
+              <w:right w:val="single" w:sz="8" w:color="D0DCDC"/>
+            </w:tcBorders>
+          </w:tcPr>
+          <w:p>
+            <w:r/>
+            <w:r>
+              <w:rPr>
+                <w:rFonts w:ascii="Calibri" w:hAnsi="Calibri" w:eastAsia="Calibri"/>
+                <w:b w:val="0"/>
+                <w:i w:val="0"/>
+                <w:color w:val="1E2F38"/>
+                <w:sz w:val="18"/>
+              </w:rPr>
+              <w:t>U.S. Department of State / GHSD</w:t>
+            </w:r>
+          </w:p>
+        </w:tc>
+        <w:tc>
+          <w:tcPr>
+            <w:tcW w:type="dxa" w:w="6480"/>
+            <w:shd w:fill="F7F5F0"/>
+            <w:tcBorders>
+              <w:top w:val="single" w:sz="8" w:color="D0DCDC"/>
+              <w:left w:val="single" w:sz="8" w:color="D0DCDC"/>
+              <w:bottom w:val="single" w:sz="8" w:color="D0DCDC"/>
+              <w:right w:val="single" w:sz="8" w:color="D0DCDC"/>
+            </w:tcBorders>
+          </w:tcPr>
+          <w:p>
+            <w:r/>
+            <w:r>
+              <w:rPr>
+                <w:rFonts w:ascii="Calibri" w:hAnsi="Calibri" w:eastAsia="Calibri"/>
+                <w:b w:val="0"/>
+                <w:i w:val="0"/>
+                <w:color w:val="1E2F38"/>
+                <w:sz w:val="18"/>
+              </w:rPr>
+              <w:t>A Ugandan implementer with a live clinic and community network that protects essential services while proving interoperable digital scale-up under the MOU - accountable, measurable, and transferable.</w:t>
+            </w:r>
+          </w:p>
+        </w:tc>
+      </w:tr>
+      <w:tr>
+        <w:tc>
+          <w:tcPr>
+            <w:tcW w:type="dxa" w:w="3024"/>
+            <w:tcBorders>
+              <w:top w:val="single" w:sz="8" w:color="D0DCDC"/>
+              <w:left w:val="single" w:sz="8" w:color="D0DCDC"/>
+              <w:bottom w:val="single" w:sz="8" w:color="D0DCDC"/>
+              <w:right w:val="single" w:sz="8" w:color="D0DCDC"/>
+            </w:tcBorders>
+          </w:tcPr>
+          <w:p>
+            <w:r/>
+            <w:r>
+              <w:rPr>
+                <w:rFonts w:ascii="Calibri" w:hAnsi="Calibri" w:eastAsia="Calibri"/>
+                <w:b w:val="0"/>
+                <w:i w:val="0"/>
+                <w:color w:val="1E2F38"/>
+                <w:sz w:val="18"/>
+              </w:rPr>
+              <w:t>Districts &amp; facilities</w:t>
+            </w:r>
+          </w:p>
+        </w:tc>
+        <w:tc>
+          <w:tcPr>
+            <w:tcW w:type="dxa" w:w="6480"/>
+            <w:tcBorders>
+              <w:top w:val="single" w:sz="8" w:color="D0DCDC"/>
+              <w:left w:val="single" w:sz="8" w:color="D0DCDC"/>
+              <w:bottom w:val="single" w:sz="8" w:color="D0DCDC"/>
+              <w:right w:val="single" w:sz="8" w:color="D0DCDC"/>
+            </w:tcBorders>
+          </w:tcPr>
+          <w:p>
+            <w:r/>
+            <w:r>
+              <w:rPr>
+                <w:rFonts w:ascii="Calibri" w:hAnsi="Calibri" w:eastAsia="Calibri"/>
+                <w:b w:val="0"/>
+                <w:i w:val="0"/>
+                <w:color w:val="1E2F38"/>
+                <w:sz w:val="18"/>
+              </w:rPr>
+              <w:t>Dashboards for outreach targeting, referral follow-up, and programme monitoring; GIS hotspot views that support planning without waiting for outbreaks to arrive at the ward.</w:t>
+            </w:r>
+          </w:p>
+        </w:tc>
+      </w:tr>
+      <w:tr>
+        <w:tc>
+          <w:tcPr>
+            <w:tcW w:type="dxa" w:w="3024"/>
+            <w:shd w:fill="F7F5F0"/>
+            <w:tcBorders>
+              <w:top w:val="single" w:sz="8" w:color="D0DCDC"/>
+              <w:left w:val="single" w:sz="8" w:color="D0DCDC"/>
+              <w:bottom w:val="single" w:sz="8" w:color="D0DCDC"/>
+              <w:right w:val="single" w:sz="8" w:color="D0DCDC"/>
+            </w:tcBorders>
+          </w:tcPr>
+          <w:p>
+            <w:r/>
+            <w:r>
+              <w:rPr>
+                <w:rFonts w:ascii="Calibri" w:hAnsi="Calibri" w:eastAsia="Calibri"/>
+                <w:b w:val="0"/>
+                <w:i w:val="0"/>
+                <w:color w:val="1E2F38"/>
+                <w:sz w:val="18"/>
+              </w:rPr>
+              <w:t>Communities &amp; CHWs/VHTs</w:t>
+            </w:r>
+          </w:p>
+        </w:tc>
+        <w:tc>
+          <w:tcPr>
+            <w:tcW w:type="dxa" w:w="6480"/>
+            <w:shd w:fill="F7F5F0"/>
+            <w:tcBorders>
+              <w:top w:val="single" w:sz="8" w:color="D0DCDC"/>
+              <w:left w:val="single" w:sz="8" w:color="D0DCDC"/>
+              <w:bottom w:val="single" w:sz="8" w:color="D0DCDC"/>
+              <w:right w:val="single" w:sz="8" w:color="D0DCDC"/>
+            </w:tcBorders>
+          </w:tcPr>
+          <w:p>
+            <w:r/>
+            <w:r>
+              <w:rPr>
+                <w:rFonts w:ascii="Calibri" w:hAnsi="Calibri" w:eastAsia="Calibri"/>
+                <w:b w:val="0"/>
+                <w:i w:val="0"/>
+                <w:color w:val="1E2F38"/>
+                <w:sz w:val="18"/>
+              </w:rPr>
+              <w:t>Simple offline tools, faster support from the medical centre, and care that reaches mothers, children, older persons, and people with chronic conditions before crises.</w:t>
+            </w:r>
+          </w:p>
+        </w:tc>
+      </w:tr>
+      <w:tr>
+        <w:tc>
+          <w:tcPr>
+            <w:tcW w:type="dxa" w:w="3024"/>
+            <w:tcBorders>
+              <w:top w:val="single" w:sz="8" w:color="D0DCDC"/>
+              <w:left w:val="single" w:sz="8" w:color="D0DCDC"/>
+              <w:bottom w:val="single" w:sz="8" w:color="D0DCDC"/>
+              <w:right w:val="single" w:sz="8" w:color="D0DCDC"/>
+            </w:tcBorders>
+          </w:tcPr>
+          <w:p>
+            <w:r/>
+            <w:r>
+              <w:rPr>
+                <w:rFonts w:ascii="Calibri" w:hAnsi="Calibri" w:eastAsia="Calibri"/>
+                <w:b w:val="0"/>
+                <w:i w:val="0"/>
+                <w:color w:val="1E2F38"/>
+                <w:sz w:val="18"/>
+              </w:rPr>
+              <w:t>FairBanks / FCHIP</w:t>
+            </w:r>
+          </w:p>
+        </w:tc>
+        <w:tc>
+          <w:tcPr>
+            <w:tcW w:type="dxa" w:w="6480"/>
+            <w:tcBorders>
+              <w:top w:val="single" w:sz="8" w:color="D0DCDC"/>
+              <w:left w:val="single" w:sz="8" w:color="D0DCDC"/>
+              <w:bottom w:val="single" w:sz="8" w:color="D0DCDC"/>
+              <w:right w:val="single" w:sz="8" w:color="D0DCDC"/>
+            </w:tcBorders>
+          </w:tcPr>
+          <w:p>
+            <w:r/>
+            <w:r>
+              <w:rPr>
+                <w:rFonts w:ascii="Calibri" w:hAnsi="Calibri" w:eastAsia="Calibri"/>
+                <w:b w:val="0"/>
+                <w:i w:val="0"/>
+                <w:color w:val="1E2F38"/>
+                <w:sz w:val="18"/>
+              </w:rPr>
+              <w:t>Room to refine and document a production-grade interoperability model inside a real catchment - then share specifications, training packages, and transfer plans with MoH-aligned partners.</w:t>
+            </w:r>
+          </w:p>
+        </w:tc>
+      </w:tr>
+    </w:tbl>
+    <w:p/>
+    <w:p>
+      <w:pPr>
+        <w:spacing w:before="240" w:after="100"/>
+      </w:pPr>
+      <w:r>
+        <w:rPr>
+          <w:rFonts w:ascii="Calibri" w:hAnsi="Calibri" w:eastAsia="Calibri"/>
+          <w:b/>
+          <w:i w:val="0"/>
+          <w:color w:val="0A1F2E"/>
+          <w:sz w:val="32"/>
+        </w:rPr>
+        <w:t>IV. Proposed Objectives (Objective 4)</w:t>
+      </w:r>
+    </w:p>
+    <w:p>
+      <w:pPr>
+        <w:pStyle w:val="ListBullet"/>
+        <w:spacing w:after="40"/>
+      </w:pPr>
+      <w:r>
+        <w:rPr>
+          <w:rFonts w:ascii="Calibri" w:hAnsi="Calibri" w:eastAsia="Calibri"/>
+          <w:b w:val="0"/>
+          <w:i w:val="0"/>
+          <w:color w:val="1E2F38"/>
+          <w:sz w:val="20"/>
+        </w:rPr>
+        <w:t>O1. Deploy offline-capable CHW/VHT capture aligned with eCHIS household and visit concepts across FairBanks Community Reach catchments.</w:t>
+      </w:r>
+    </w:p>
+    <w:p>
+      <w:pPr>
+        <w:pStyle w:val="ListBullet"/>
+        <w:spacing w:after="40"/>
+      </w:pPr>
+      <w:r>
+        <w:rPr>
+          <w:rFonts w:ascii="Calibri" w:hAnsi="Calibri" w:eastAsia="Calibri"/>
+          <w:b w:val="0"/>
+          <w:i w:val="0"/>
+          <w:color w:val="1E2F38"/>
+          <w:sz w:val="20"/>
+        </w:rPr>
+        <w:t>O2. Establish a secure sync and role-based access pipeline linking community records to FairBanks Medical Centre workflows and authorised district viewers.</w:t>
+      </w:r>
+    </w:p>
+    <w:p>
+      <w:pPr>
+        <w:pStyle w:val="ListBullet"/>
+        <w:spacing w:after="40"/>
+      </w:pPr>
+      <w:r>
+        <w:rPr>
+          <w:rFonts w:ascii="Calibri" w:hAnsi="Calibri" w:eastAsia="Calibri"/>
+          <w:b w:val="0"/>
+          <w:i w:val="0"/>
+          <w:color w:val="1E2F38"/>
+          <w:sz w:val="20"/>
+        </w:rPr>
+        <w:t>O3. Map community indicators to DHIS2 reporting elements and demonstrate aggregate submission pathways for MNCH, immunisation, NCD screening, and disease surveillance signals.</w:t>
+      </w:r>
+    </w:p>
+    <w:p>
+      <w:pPr>
+        <w:pStyle w:val="ListBullet"/>
+        <w:spacing w:after="40"/>
+      </w:pPr>
+      <w:r>
+        <w:rPr>
+          <w:rFonts w:ascii="Calibri" w:hAnsi="Calibri" w:eastAsia="Calibri"/>
+          <w:b w:val="0"/>
+          <w:i w:val="0"/>
+          <w:color w:val="1E2F38"/>
+          <w:sz w:val="20"/>
+        </w:rPr>
+        <w:t>O4. Deliver facility and programme dashboards plus GIS hotspot views that trigger outreach, referrals, and supply planning actions.</w:t>
+      </w:r>
+    </w:p>
+    <w:p>
+      <w:pPr>
+        <w:pStyle w:val="ListBullet"/>
+        <w:spacing w:after="40"/>
+      </w:pPr>
+      <w:r>
+        <w:rPr>
+          <w:rFonts w:ascii="Calibri" w:hAnsi="Calibri" w:eastAsia="Calibri"/>
+          <w:b w:val="0"/>
+          <w:i w:val="0"/>
+          <w:color w:val="1E2F38"/>
+          <w:sz w:val="20"/>
+        </w:rPr>
+        <w:t>O5. Produce interoperability specifications, data-governance protocols, training curricula, and a staged government-ownership transition plan suitable for full-proposal detailed design.</w:t>
+      </w:r>
+    </w:p>
+    <w:p>
+      <w:pPr>
+        <w:spacing w:before="240" w:after="100"/>
+      </w:pPr>
+      <w:r>
+        <w:rPr>
+          <w:rFonts w:ascii="Calibri" w:hAnsi="Calibri" w:eastAsia="Calibri"/>
+          <w:b/>
+          <w:i w:val="0"/>
+          <w:color w:val="0A1F2E"/>
+          <w:sz w:val="32"/>
+        </w:rPr>
+        <w:t>V. Project Approach</w:t>
+      </w:r>
+    </w:p>
+    <w:p>
+      <w:pPr>
+        <w:spacing w:after="100"/>
+        <w:jc w:val="left"/>
+      </w:pPr>
+      <w:r>
+        <w:rPr>
+          <w:rFonts w:ascii="Calibri" w:hAnsi="Calibri" w:eastAsia="Calibri"/>
+          <w:b w:val="0"/>
+          <w:i w:val="0"/>
+          <w:color w:val="1E2F38"/>
+          <w:sz w:val="20"/>
+        </w:rPr>
+        <w:t>Anchor in a live cascade: community members identify needs; CHWs/VHTs collect and educate; FairBanks Community Reach runs outreach and home visits; FairBanks Medical Centre provides clinical care, diagnostics, pharmacy, and referrals; FCHIP is the intelligence layer that closes the data-and-feedback loop.</w:t>
+      </w:r>
+    </w:p>
+    <w:p>
+      <w:pPr>
+        <w:spacing w:after="100"/>
+        <w:jc w:val="left"/>
+      </w:pPr>
+      <w:r>
+        <w:rPr>
+          <w:rFonts w:ascii="Calibri" w:hAnsi="Calibri" w:eastAsia="Calibri"/>
+          <w:b w:val="0"/>
+          <w:i w:val="0"/>
+          <w:color w:val="1E2F38"/>
+          <w:sz w:val="20"/>
+        </w:rPr>
+        <w:t>Build API-first, standards-aware exports - not a closed proprietary vault. Prioritise interoperability with eCHIS (household/visit concepts), DHIS2 (aggregate indicators), facility EMR encounter/referral handoff, and readiness for national warehouse feeds when schemas are confirmed.</w:t>
+      </w:r>
+    </w:p>
+    <w:p>
+      <w:pPr>
+        <w:spacing w:after="100"/>
+        <w:jc w:val="left"/>
+      </w:pPr>
+      <w:r>
+        <w:rPr>
+          <w:rFonts w:ascii="Calibri" w:hAnsi="Calibri" w:eastAsia="Calibri"/>
+          <w:b w:val="0"/>
+          <w:i w:val="0"/>
+          <w:color w:val="1E2F38"/>
+          <w:sz w:val="20"/>
+        </w:rPr>
+        <w:t>Protect essential services during transition: structure community data around HIV/TB/malaria flags where relevant, maternal and child pathways, immunisation follow-up, and outbreak early warning so digital work reinforces - not distracts from - service continuity.</w:t>
+      </w:r>
+    </w:p>
+    <w:p>
+      <w:pPr>
+        <w:spacing w:after="100"/>
+        <w:jc w:val="left"/>
+      </w:pPr>
+      <w:r>
+        <w:rPr>
+          <w:rFonts w:ascii="Calibri" w:hAnsi="Calibri" w:eastAsia="Calibri"/>
+          <w:b w:val="0"/>
+          <w:i w:val="0"/>
+          <w:color w:val="1E2F38"/>
+          <w:sz w:val="20"/>
+        </w:rPr>
+        <w:t>Co-design forms and alerts with CHWs, facility staff, and local leaders; train Ugandan data stewards and developers; document every interface for MoH review.</w:t>
+      </w:r>
+    </w:p>
+    <w:p>
+      <w:pPr>
+        <w:spacing w:after="100"/>
+        <w:jc w:val="left"/>
+      </w:pPr>
+      <w:r>
+        <w:rPr>
+          <w:rFonts w:ascii="Calibri" w:hAnsi="Calibri" w:eastAsia="Calibri"/>
+          <w:b w:val="0"/>
+          <w:i w:val="0"/>
+          <w:color w:val="1E2F38"/>
+          <w:sz w:val="20"/>
+        </w:rPr>
+        <w:t>Start where FairBanks already operates (Bukoto, Kyebando, Kisaasi, Kamwokya, Kikaaya and surrounding communities), then design for district replication using Uganda's existing CHW/VHT architecture.</w:t>
       </w:r>
     </w:p>
     <w:p>
@@ -211,7 +798,7 @@
       <w:r>
         <w:drawing>
           <wp:inline xmlns:a="http://schemas.openxmlformats.org/drawingml/2006/main" xmlns:pic="http://schemas.openxmlformats.org/drawingml/2006/picture">
-            <wp:extent cx="4663440" cy="3108960"/>
+            <wp:extent cx="4390688" cy="2926080"/>
             <wp:docPr id="2" name="Picture 2"/>
             <wp:cNvGraphicFramePr>
               <a:graphicFrameLocks noChangeAspect="1"/>
@@ -220,7 +807,7 @@
               <a:graphicData uri="http://schemas.openxmlformats.org/drawingml/2006/picture">
                 <pic:pic>
                   <pic:nvPicPr>
-                    <pic:cNvPr id="0" name="facility_exterior_sign_opt.jpg"/>
+                    <pic:cNvPr id="0" name="data_flow_iso_labeled_opt.jpg"/>
                     <pic:cNvPicPr/>
                   </pic:nvPicPr>
                   <pic:blipFill>
@@ -232,7 +819,7 @@
                   <pic:spPr>
                     <a:xfrm>
                       <a:off x="0" y="0"/>
-                      <a:ext cx="4663440" cy="3108960"/>
+                      <a:ext cx="4390688" cy="2926080"/>
                     </a:xfrm>
                     <a:prstGeom prst="rect"/>
                   </pic:spPr>
@@ -245,7 +832,7 @@
     </w:p>
     <w:p>
       <w:pPr>
-        <w:spacing w:after="200"/>
+        <w:spacing w:after="160"/>
         <w:jc w:val="center"/>
       </w:pPr>
       <w:r>
@@ -254,94 +841,14 @@
           <w:b w:val="0"/>
           <w:i/>
           <w:color w:val="3A4A54"/>
-          <w:sz w:val="18"/>
+          <w:sz w:val="16"/>
         </w:rPr>
-        <w:t>FairBanks Medical Centre — clinical anchor for community data</w:t>
+        <w:t>Community cascade → FCHIP → national digital health systems</w:t>
       </w:r>
     </w:p>
     <w:p>
       <w:pPr>
-        <w:pStyle w:val="ListBullet"/>
-        <w:spacing w:after="60"/>
-      </w:pPr>
-      <w:r>
-        <w:rPr>
-          <w:rFonts w:ascii="Calibri" w:hAnsi="Calibri" w:eastAsia="Calibri"/>
-          <w:b w:val="0"/>
-          <w:i w:val="0"/>
-          <w:color w:val="1E2F38"/>
-          <w:sz w:val="22"/>
-        </w:rPr>
-        <w:t>Operating medical centre with pharmacy, diagnostics, and referral pathways</w:t>
-      </w:r>
-    </w:p>
-    <w:p>
-      <w:pPr>
-        <w:pStyle w:val="ListBullet"/>
-        <w:spacing w:after="60"/>
-      </w:pPr>
-      <w:r>
-        <w:rPr>
-          <w:rFonts w:ascii="Calibri" w:hAnsi="Calibri" w:eastAsia="Calibri"/>
-          <w:b w:val="0"/>
-          <w:i w:val="0"/>
-          <w:color w:val="1E2F38"/>
-          <w:sz w:val="22"/>
-        </w:rPr>
-        <w:t>Community Reach programmes: maternal &amp; child health, Gericare, NCD screening, school health</w:t>
-      </w:r>
-    </w:p>
-    <w:p>
-      <w:pPr>
-        <w:pStyle w:val="ListBullet"/>
-        <w:spacing w:after="60"/>
-      </w:pPr>
-      <w:r>
-        <w:rPr>
-          <w:rFonts w:ascii="Calibri" w:hAnsi="Calibri" w:eastAsia="Calibri"/>
-          <w:b w:val="0"/>
-          <w:i w:val="0"/>
-          <w:color w:val="1E2F38"/>
-          <w:sz w:val="22"/>
-        </w:rPr>
-        <w:t>Active CHW/VHT networks in Bukoto, Kyebando, Kisaasi, Kamwokya, Kikaaya</w:t>
-      </w:r>
-    </w:p>
-    <w:p>
-      <w:pPr>
-        <w:pStyle w:val="ListBullet"/>
-        <w:spacing w:after="60"/>
-      </w:pPr>
-      <w:r>
-        <w:rPr>
-          <w:rFonts w:ascii="Calibri" w:hAnsi="Calibri" w:eastAsia="Calibri"/>
-          <w:b w:val="0"/>
-          <w:i w:val="0"/>
-          <w:color w:val="1E2F38"/>
-          <w:sz w:val="22"/>
-        </w:rPr>
-        <w:t>Digital health records foundation and pharmacy dispensing data already in use</w:t>
-      </w:r>
-    </w:p>
-    <w:p>
-      <w:pPr>
-        <w:pStyle w:val="ListBullet"/>
-        <w:spacing w:after="60"/>
-      </w:pPr>
-      <w:r>
-        <w:rPr>
-          <w:rFonts w:ascii="Calibri" w:hAnsi="Calibri" w:eastAsia="Calibri"/>
-          <w:b w:val="0"/>
-          <w:i w:val="0"/>
-          <w:color w:val="1E2F38"/>
-          <w:sz w:val="22"/>
-        </w:rPr>
-        <w:t>Research partnerships and ethical data governance experience</w:t>
-      </w:r>
-    </w:p>
-    <w:p>
-      <w:pPr>
-        <w:spacing w:before="280" w:after="120"/>
+        <w:spacing w:before="240" w:after="100"/>
       </w:pPr>
       <w:r>
         <w:rPr>
@@ -349,9 +856,9 @@
           <w:b/>
           <w:i w:val="0"/>
           <w:color w:val="0A1F2E"/>
-          <w:sz w:val="40"/>
+          <w:sz w:val="32"/>
         </w:rPr>
-        <w:t>III. Alignment with Objective 4</w:t>
+        <w:t>VI. Expected Outcomes</w:t>
       </w:r>
     </w:p>
     <w:tbl>
@@ -361,8 +868,491 @@
         <w:tblLook w:firstColumn="1" w:firstRow="1" w:lastColumn="0" w:lastRow="0" w:noHBand="0" w:noVBand="1" w:val="04A0"/>
       </w:tblPr>
       <w:tblGrid>
-        <w:gridCol w:w="4896"/>
-        <w:gridCol w:w="4896"/>
+        <w:gridCol w:w="4968"/>
+        <w:gridCol w:w="4968"/>
+      </w:tblGrid>
+      <w:tr>
+        <w:tc>
+          <w:tcPr>
+            <w:tcW w:type="dxa" w:w="2448"/>
+            <w:shd w:fill="0D6E6E"/>
+            <w:tcBorders>
+              <w:top w:val="single" w:sz="8" w:color="0D6E6E"/>
+              <w:left w:val="single" w:sz="8" w:color="0D6E6E"/>
+              <w:bottom w:val="single" w:sz="8" w:color="0D6E6E"/>
+              <w:right w:val="single" w:sz="8" w:color="0D6E6E"/>
+            </w:tcBorders>
+          </w:tcPr>
+          <w:p>
+            <w:r/>
+            <w:r>
+              <w:rPr>
+                <w:rFonts w:ascii="Calibri" w:hAnsi="Calibri" w:eastAsia="Calibri"/>
+                <w:b/>
+                <w:i w:val="0"/>
+                <w:color w:val="FFFFFF"/>
+                <w:sz w:val="18"/>
+              </w:rPr>
+              <w:t>Outcome</w:t>
+            </w:r>
+          </w:p>
+        </w:tc>
+        <w:tc>
+          <w:tcPr>
+            <w:tcW w:type="dxa" w:w="7056"/>
+            <w:shd w:fill="0D6E6E"/>
+            <w:tcBorders>
+              <w:top w:val="single" w:sz="8" w:color="0D6E6E"/>
+              <w:left w:val="single" w:sz="8" w:color="0D6E6E"/>
+              <w:bottom w:val="single" w:sz="8" w:color="0D6E6E"/>
+              <w:right w:val="single" w:sz="8" w:color="0D6E6E"/>
+            </w:tcBorders>
+          </w:tcPr>
+          <w:p>
+            <w:r/>
+            <w:r>
+              <w:rPr>
+                <w:rFonts w:ascii="Calibri" w:hAnsi="Calibri" w:eastAsia="Calibri"/>
+                <w:b/>
+                <w:i w:val="0"/>
+                <w:color w:val="FFFFFF"/>
+                <w:sz w:val="18"/>
+              </w:rPr>
+              <w:t>What success looks like</w:t>
+            </w:r>
+          </w:p>
+        </w:tc>
+      </w:tr>
+      <w:tr>
+        <w:tc>
+          <w:tcPr>
+            <w:tcW w:type="dxa" w:w="2448"/>
+            <w:tcBorders>
+              <w:top w:val="single" w:sz="8" w:color="D0DCDC"/>
+              <w:left w:val="single" w:sz="8" w:color="D0DCDC"/>
+              <w:bottom w:val="single" w:sz="8" w:color="D0DCDC"/>
+              <w:right w:val="single" w:sz="8" w:color="D0DCDC"/>
+            </w:tcBorders>
+          </w:tcPr>
+          <w:p>
+            <w:r/>
+            <w:r>
+              <w:rPr>
+                <w:rFonts w:ascii="Calibri" w:hAnsi="Calibri" w:eastAsia="Calibri"/>
+                <w:b w:val="0"/>
+                <w:i w:val="0"/>
+                <w:color w:val="1E2F38"/>
+                <w:sz w:val="18"/>
+              </w:rPr>
+              <w:t>Digital completeness</w:t>
+            </w:r>
+          </w:p>
+        </w:tc>
+        <w:tc>
+          <w:tcPr>
+            <w:tcW w:type="dxa" w:w="7056"/>
+            <w:tcBorders>
+              <w:top w:val="single" w:sz="8" w:color="D0DCDC"/>
+              <w:left w:val="single" w:sz="8" w:color="D0DCDC"/>
+              <w:bottom w:val="single" w:sz="8" w:color="D0DCDC"/>
+              <w:right w:val="single" w:sz="8" w:color="D0DCDC"/>
+            </w:tcBorders>
+          </w:tcPr>
+          <w:p>
+            <w:r/>
+            <w:r>
+              <w:rPr>
+                <w:rFonts w:ascii="Calibri" w:hAnsi="Calibri" w:eastAsia="Calibri"/>
+                <w:b w:val="0"/>
+                <w:i w:val="0"/>
+                <w:color w:val="1E2F38"/>
+                <w:sz w:val="18"/>
+              </w:rPr>
+              <w:t>Increase structured community visit capture flowing into facility and aggregate reporting pathways within the pilot catchment.</w:t>
+            </w:r>
+          </w:p>
+        </w:tc>
+      </w:tr>
+      <w:tr>
+        <w:tc>
+          <w:tcPr>
+            <w:tcW w:type="dxa" w:w="2448"/>
+            <w:shd w:fill="F7F5F0"/>
+            <w:tcBorders>
+              <w:top w:val="single" w:sz="8" w:color="D0DCDC"/>
+              <w:left w:val="single" w:sz="8" w:color="D0DCDC"/>
+              <w:bottom w:val="single" w:sz="8" w:color="D0DCDC"/>
+              <w:right w:val="single" w:sz="8" w:color="D0DCDC"/>
+            </w:tcBorders>
+          </w:tcPr>
+          <w:p>
+            <w:r/>
+            <w:r>
+              <w:rPr>
+                <w:rFonts w:ascii="Calibri" w:hAnsi="Calibri" w:eastAsia="Calibri"/>
+                <w:b w:val="0"/>
+                <w:i w:val="0"/>
+                <w:color w:val="1E2F38"/>
+                <w:sz w:val="18"/>
+              </w:rPr>
+              <w:t>Interoperability proof</w:t>
+            </w:r>
+          </w:p>
+        </w:tc>
+        <w:tc>
+          <w:tcPr>
+            <w:tcW w:type="dxa" w:w="7056"/>
+            <w:shd w:fill="F7F5F0"/>
+            <w:tcBorders>
+              <w:top w:val="single" w:sz="8" w:color="D0DCDC"/>
+              <w:left w:val="single" w:sz="8" w:color="D0DCDC"/>
+              <w:bottom w:val="single" w:sz="8" w:color="D0DCDC"/>
+              <w:right w:val="single" w:sz="8" w:color="D0DCDC"/>
+            </w:tcBorders>
+          </w:tcPr>
+          <w:p>
+            <w:r/>
+            <w:r>
+              <w:rPr>
+                <w:rFonts w:ascii="Calibri" w:hAnsi="Calibri" w:eastAsia="Calibri"/>
+                <w:b w:val="0"/>
+                <w:i w:val="0"/>
+                <w:color w:val="1E2F38"/>
+                <w:sz w:val="18"/>
+              </w:rPr>
+              <w:t>Working mappings and demo exports for eCHIS-aligned records and DHIS2 aggregates, with open documentation for MoH and partners.</w:t>
+            </w:r>
+          </w:p>
+        </w:tc>
+      </w:tr>
+      <w:tr>
+        <w:tc>
+          <w:tcPr>
+            <w:tcW w:type="dxa" w:w="2448"/>
+            <w:tcBorders>
+              <w:top w:val="single" w:sz="8" w:color="D0DCDC"/>
+              <w:left w:val="single" w:sz="8" w:color="D0DCDC"/>
+              <w:bottom w:val="single" w:sz="8" w:color="D0DCDC"/>
+              <w:right w:val="single" w:sz="8" w:color="D0DCDC"/>
+            </w:tcBorders>
+          </w:tcPr>
+          <w:p>
+            <w:r/>
+            <w:r>
+              <w:rPr>
+                <w:rFonts w:ascii="Calibri" w:hAnsi="Calibri" w:eastAsia="Calibri"/>
+                <w:b w:val="0"/>
+                <w:i w:val="0"/>
+                <w:color w:val="1E2F38"/>
+                <w:sz w:val="18"/>
+              </w:rPr>
+              <w:t>Service continuity signals</w:t>
+            </w:r>
+          </w:p>
+        </w:tc>
+        <w:tc>
+          <w:tcPr>
+            <w:tcW w:type="dxa" w:w="7056"/>
+            <w:tcBorders>
+              <w:top w:val="single" w:sz="8" w:color="D0DCDC"/>
+              <w:left w:val="single" w:sz="8" w:color="D0DCDC"/>
+              <w:bottom w:val="single" w:sz="8" w:color="D0DCDC"/>
+              <w:right w:val="single" w:sz="8" w:color="D0DCDC"/>
+            </w:tcBorders>
+          </w:tcPr>
+          <w:p>
+            <w:r/>
+            <w:r>
+              <w:rPr>
+                <w:rFonts w:ascii="Calibri" w:hAnsi="Calibri" w:eastAsia="Calibri"/>
+                <w:b w:val="0"/>
+                <w:i w:val="0"/>
+                <w:color w:val="1E2F38"/>
+                <w:sz w:val="18"/>
+              </w:rPr>
+              <w:t>Earlier alerts for missed ANC, immunisation gaps, fever clusters, and referral drop-offs - linked to CHW follow-up and clinic action.</w:t>
+            </w:r>
+          </w:p>
+        </w:tc>
+      </w:tr>
+      <w:tr>
+        <w:tc>
+          <w:tcPr>
+            <w:tcW w:type="dxa" w:w="2448"/>
+            <w:shd w:fill="F7F5F0"/>
+            <w:tcBorders>
+              <w:top w:val="single" w:sz="8" w:color="D0DCDC"/>
+              <w:left w:val="single" w:sz="8" w:color="D0DCDC"/>
+              <w:bottom w:val="single" w:sz="8" w:color="D0DCDC"/>
+              <w:right w:val="single" w:sz="8" w:color="D0DCDC"/>
+            </w:tcBorders>
+          </w:tcPr>
+          <w:p>
+            <w:r/>
+            <w:r>
+              <w:rPr>
+                <w:rFonts w:ascii="Calibri" w:hAnsi="Calibri" w:eastAsia="Calibri"/>
+                <w:b w:val="0"/>
+                <w:i w:val="0"/>
+                <w:color w:val="1E2F38"/>
+                <w:sz w:val="18"/>
+              </w:rPr>
+              <w:t>Accountability</w:t>
+            </w:r>
+          </w:p>
+        </w:tc>
+        <w:tc>
+          <w:tcPr>
+            <w:tcW w:type="dxa" w:w="7056"/>
+            <w:shd w:fill="F7F5F0"/>
+            <w:tcBorders>
+              <w:top w:val="single" w:sz="8" w:color="D0DCDC"/>
+              <w:left w:val="single" w:sz="8" w:color="D0DCDC"/>
+              <w:bottom w:val="single" w:sz="8" w:color="D0DCDC"/>
+              <w:right w:val="single" w:sz="8" w:color="D0DCDC"/>
+            </w:tcBorders>
+          </w:tcPr>
+          <w:p>
+            <w:r/>
+            <w:r>
+              <w:rPr>
+                <w:rFonts w:ascii="Calibri" w:hAnsi="Calibri" w:eastAsia="Calibri"/>
+                <w:b w:val="0"/>
+                <w:i w:val="0"/>
+                <w:color w:val="1E2F38"/>
+                <w:sz w:val="18"/>
+              </w:rPr>
+              <w:t>Role-based audit trails, data-quality checks, and programme dashboards usable for performance-oriented district conversations.</w:t>
+            </w:r>
+          </w:p>
+        </w:tc>
+      </w:tr>
+      <w:tr>
+        <w:tc>
+          <w:tcPr>
+            <w:tcW w:type="dxa" w:w="2448"/>
+            <w:tcBorders>
+              <w:top w:val="single" w:sz="8" w:color="D0DCDC"/>
+              <w:left w:val="single" w:sz="8" w:color="D0DCDC"/>
+              <w:bottom w:val="single" w:sz="8" w:color="D0DCDC"/>
+              <w:right w:val="single" w:sz="8" w:color="D0DCDC"/>
+            </w:tcBorders>
+          </w:tcPr>
+          <w:p>
+            <w:r/>
+            <w:r>
+              <w:rPr>
+                <w:rFonts w:ascii="Calibri" w:hAnsi="Calibri" w:eastAsia="Calibri"/>
+                <w:b w:val="0"/>
+                <w:i w:val="0"/>
+                <w:color w:val="1E2F38"/>
+                <w:sz w:val="18"/>
+              </w:rPr>
+              <w:t>Ownership readiness</w:t>
+            </w:r>
+          </w:p>
+        </w:tc>
+        <w:tc>
+          <w:tcPr>
+            <w:tcW w:type="dxa" w:w="7056"/>
+            <w:tcBorders>
+              <w:top w:val="single" w:sz="8" w:color="D0DCDC"/>
+              <w:left w:val="single" w:sz="8" w:color="D0DCDC"/>
+              <w:bottom w:val="single" w:sz="8" w:color="D0DCDC"/>
+              <w:right w:val="single" w:sz="8" w:color="D0DCDC"/>
+            </w:tcBorders>
+          </w:tcPr>
+          <w:p>
+            <w:r/>
+            <w:r>
+              <w:rPr>
+                <w:rFonts w:ascii="Calibri" w:hAnsi="Calibri" w:eastAsia="Calibri"/>
+                <w:b w:val="0"/>
+                <w:i w:val="0"/>
+                <w:color w:val="1E2F38"/>
+                <w:sz w:val="18"/>
+              </w:rPr>
+              <w:t>Handoff package: source documentation, SOPs, training, hosting options, and a costed path to transfer recurrent operations toward domestic systems.</w:t>
+            </w:r>
+          </w:p>
+        </w:tc>
+      </w:tr>
+    </w:tbl>
+    <w:p/>
+    <w:p>
+      <w:pPr>
+        <w:spacing w:before="240" w:after="100"/>
+      </w:pPr>
+      <w:r>
+        <w:rPr>
+          <w:rFonts w:ascii="Calibri" w:hAnsi="Calibri" w:eastAsia="Calibri"/>
+          <w:b/>
+          <w:i w:val="0"/>
+          <w:color w:val="0A1F2E"/>
+          <w:sz w:val="32"/>
+        </w:rPr>
+        <w:t>VII. Organizational Capacity</w:t>
+      </w:r>
+    </w:p>
+    <w:p>
+      <w:pPr>
+        <w:jc w:val="center"/>
+      </w:pPr>
+      <w:r>
+        <w:drawing>
+          <wp:inline xmlns:a="http://schemas.openxmlformats.org/drawingml/2006/main" xmlns:pic="http://schemas.openxmlformats.org/drawingml/2006/picture">
+            <wp:extent cx="4389120" cy="2926080"/>
+            <wp:docPr id="3" name="Picture 3"/>
+            <wp:cNvGraphicFramePr>
+              <a:graphicFrameLocks noChangeAspect="1"/>
+            </wp:cNvGraphicFramePr>
+            <a:graphic>
+              <a:graphicData uri="http://schemas.openxmlformats.org/drawingml/2006/picture">
+                <pic:pic>
+                  <pic:nvPicPr>
+                    <pic:cNvPr id="0" name="facility_exterior_sign_opt.jpg"/>
+                    <pic:cNvPicPr/>
+                  </pic:nvPicPr>
+                  <pic:blipFill>
+                    <a:blip r:embed="rId11"/>
+                    <a:stretch>
+                      <a:fillRect/>
+                    </a:stretch>
+                  </pic:blipFill>
+                  <pic:spPr>
+                    <a:xfrm>
+                      <a:off x="0" y="0"/>
+                      <a:ext cx="4389120" cy="2926080"/>
+                    </a:xfrm>
+                    <a:prstGeom prst="rect"/>
+                  </pic:spPr>
+                </pic:pic>
+              </a:graphicData>
+            </a:graphic>
+          </wp:inline>
+        </w:drawing>
+      </w:r>
+    </w:p>
+    <w:p>
+      <w:pPr>
+        <w:spacing w:after="160"/>
+        <w:jc w:val="center"/>
+      </w:pPr>
+      <w:r>
+        <w:rPr>
+          <w:rFonts w:ascii="Calibri" w:hAnsi="Calibri" w:eastAsia="Calibri"/>
+          <w:b w:val="0"/>
+          <w:i/>
+          <w:color w:val="3A4A54"/>
+          <w:sz w:val="16"/>
+        </w:rPr>
+        <w:t>FairBanks Medical Centre — clinical anchor for community data</w:t>
+      </w:r>
+    </w:p>
+    <w:p>
+      <w:pPr>
+        <w:pStyle w:val="ListBullet"/>
+        <w:spacing w:after="40"/>
+      </w:pPr>
+      <w:r>
+        <w:rPr>
+          <w:rFonts w:ascii="Calibri" w:hAnsi="Calibri" w:eastAsia="Calibri"/>
+          <w:b w:val="0"/>
+          <w:i w:val="0"/>
+          <w:color w:val="1E2F38"/>
+          <w:sz w:val="20"/>
+        </w:rPr>
+        <w:t>Ugandan social enterprise with a functioning medical centre - clinical care, diagnostics, pharmacy, and referral pathways already in daily use.</w:t>
+      </w:r>
+    </w:p>
+    <w:p>
+      <w:pPr>
+        <w:pStyle w:val="ListBullet"/>
+        <w:spacing w:after="40"/>
+      </w:pPr>
+      <w:r>
+        <w:rPr>
+          <w:rFonts w:ascii="Calibri" w:hAnsi="Calibri" w:eastAsia="Calibri"/>
+          <w:b w:val="0"/>
+          <w:i w:val="0"/>
+          <w:color w:val="1E2F38"/>
+          <w:sz w:val="20"/>
+        </w:rPr>
+        <w:t>Active FairBanks Community Reach programmes: maternal and child health, Gericare, chronic disease screening, school and corporate health outreach.</w:t>
+      </w:r>
+    </w:p>
+    <w:p>
+      <w:pPr>
+        <w:pStyle w:val="ListBullet"/>
+        <w:spacing w:after="40"/>
+      </w:pPr>
+      <w:r>
+        <w:rPr>
+          <w:rFonts w:ascii="Calibri" w:hAnsi="Calibri" w:eastAsia="Calibri"/>
+          <w:b w:val="0"/>
+          <w:i w:val="0"/>
+          <w:color w:val="1E2F38"/>
+          <w:sz w:val="20"/>
+        </w:rPr>
+        <w:t>Established CHW/VHT relationships in Kampala-area communities named above - real users, not a greenfield pilot.</w:t>
+      </w:r>
+    </w:p>
+    <w:p>
+      <w:pPr>
+        <w:pStyle w:val="ListBullet"/>
+        <w:spacing w:after="40"/>
+      </w:pPr>
+      <w:r>
+        <w:rPr>
+          <w:rFonts w:ascii="Calibri" w:hAnsi="Calibri" w:eastAsia="Calibri"/>
+          <w:b w:val="0"/>
+          <w:i w:val="0"/>
+          <w:color w:val="1E2F38"/>
+          <w:sz w:val="20"/>
+        </w:rPr>
+        <w:t>Digital health records foundation and pharmacy dispensing data already supporting facility operations.</w:t>
+      </w:r>
+    </w:p>
+    <w:p>
+      <w:pPr>
+        <w:pStyle w:val="ListBullet"/>
+        <w:spacing w:after="40"/>
+      </w:pPr>
+      <w:r>
+        <w:rPr>
+          <w:rFonts w:ascii="Calibri" w:hAnsi="Calibri" w:eastAsia="Calibri"/>
+          <w:b w:val="0"/>
+          <w:i w:val="0"/>
+          <w:color w:val="1E2F38"/>
+          <w:sz w:val="20"/>
+        </w:rPr>
+        <w:t>Research orientation and partnership practice - evidence, ethics, and skills development sit inside the FairBanks community health model.</w:t>
+      </w:r>
+    </w:p>
+    <w:p>
+      <w:pPr>
+        <w:spacing w:before="240" w:after="100"/>
+      </w:pPr>
+      <w:r>
+        <w:rPr>
+          <w:rFonts w:ascii="Calibri" w:hAnsi="Calibri" w:eastAsia="Calibri"/>
+          <w:b/>
+          <w:i w:val="0"/>
+          <w:color w:val="0A1F2E"/>
+          <w:sz w:val="32"/>
+        </w:rPr>
+        <w:t>VIII. Interoperability Approach</w:t>
+      </w:r>
+    </w:p>
+    <w:tbl>
+      <w:tblPr>
+        <w:tblW w:type="auto" w:w="0"/>
+        <w:jc w:val="center"/>
+        <w:tblLook w:firstColumn="1" w:firstRow="1" w:lastColumn="0" w:lastRow="0" w:noHBand="0" w:noVBand="1" w:val="04A0"/>
+      </w:tblPr>
+      <w:tblGrid>
+        <w:gridCol w:w="4968"/>
+        <w:gridCol w:w="4968"/>
       </w:tblGrid>
       <w:tr>
         <w:tc>
@@ -384,15 +1374,15 @@
                 <w:b/>
                 <w:i w:val="0"/>
                 <w:color w:val="FFFFFF"/>
-                <w:sz w:val="20"/>
+                <w:sz w:val="18"/>
               </w:rPr>
-              <w:t>Element</w:t>
+              <w:t>Platform</w:t>
             </w:r>
           </w:p>
         </w:tc>
         <w:tc>
           <w:tcPr>
-            <w:tcW w:type="dxa" w:w="6336"/>
+            <w:tcW w:type="dxa" w:w="6624"/>
             <w:shd w:fill="0D6E6E"/>
             <w:tcBorders>
               <w:top w:val="single" w:sz="8" w:color="0D6E6E"/>
@@ -409,9 +1399,9 @@
                 <w:b/>
                 <w:i w:val="0"/>
                 <w:color w:val="FFFFFF"/>
-                <w:sz w:val="20"/>
+                <w:sz w:val="18"/>
               </w:rPr>
-              <w:t>FairBanks / FCHIP response</w:t>
+              <w:t>Integration pathway</w:t>
             </w:r>
           </w:p>
         </w:tc>
@@ -435,15 +1425,15 @@
                 <w:b w:val="0"/>
                 <w:i w:val="0"/>
                 <w:color w:val="1E2F38"/>
-                <w:sz w:val="20"/>
+                <w:sz w:val="18"/>
               </w:rPr>
-              <w:t>Objective 4 intent</w:t>
+              <w:t>eCHIS</w:t>
             </w:r>
           </w:p>
         </w:tc>
         <w:tc>
           <w:tcPr>
-            <w:tcW w:type="dxa" w:w="6336"/>
+            <w:tcW w:type="dxa" w:w="6624"/>
             <w:tcBorders>
               <w:top w:val="single" w:sz="8" w:color="D0DCDC"/>
               <w:left w:val="single" w:sz="8" w:color="D0DCDC"/>
@@ -459,9 +1449,9 @@
                 <w:b w:val="0"/>
                 <w:i w:val="0"/>
                 <w:color w:val="1E2F38"/>
-                <w:sz w:val="20"/>
+                <w:sz w:val="18"/>
               </w:rPr>
-              <w:t>Scale EMRs, eCHIS, DHIS2, iHRIS, and national data warehouse capacity</w:t>
+              <w:t>Household registration, visit logs, referral flags via structured mobile capture</w:t>
             </w:r>
           </w:p>
         </w:tc>
@@ -486,15 +1476,15 @@
                 <w:b w:val="0"/>
                 <w:i w:val="0"/>
                 <w:color w:val="1E2F38"/>
-                <w:sz w:val="20"/>
+                <w:sz w:val="18"/>
               </w:rPr>
-              <w:t>FairBanks response</w:t>
+              <w:t>DHIS2</w:t>
             </w:r>
           </w:p>
         </w:tc>
         <w:tc>
           <w:tcPr>
-            <w:tcW w:type="dxa" w:w="6336"/>
+            <w:tcW w:type="dxa" w:w="6624"/>
             <w:shd w:fill="F7F5F0"/>
             <w:tcBorders>
               <w:top w:val="single" w:sz="8" w:color="D0DCDC"/>
@@ -511,9 +1501,9 @@
                 <w:b w:val="0"/>
                 <w:i w:val="0"/>
                 <w:color w:val="1E2F38"/>
-                <w:sz w:val="20"/>
+                <w:sz w:val="18"/>
               </w:rPr>
-              <w:t>FCHIP extends last-mile capture and feeds structured community data upstream</w:t>
+              <w:t>Aggregate exports for immunisation, ANC, NCD screening, disease surveillance</w:t>
             </w:r>
           </w:p>
         </w:tc>
@@ -537,15 +1527,15 @@
                 <w:b w:val="0"/>
                 <w:i w:val="0"/>
                 <w:color w:val="1E2F38"/>
-                <w:sz w:val="20"/>
+                <w:sz w:val="18"/>
               </w:rPr>
-              <w:t>Interoperability</w:t>
+              <w:t>Facility EMR</w:t>
             </w:r>
           </w:p>
         </w:tc>
         <w:tc>
           <w:tcPr>
-            <w:tcW w:type="dxa" w:w="6336"/>
+            <w:tcW w:type="dxa" w:w="6624"/>
             <w:tcBorders>
               <w:top w:val="single" w:sz="8" w:color="D0DCDC"/>
               <w:left w:val="single" w:sz="8" w:color="D0DCDC"/>
@@ -561,9 +1551,9 @@
                 <w:b w:val="0"/>
                 <w:i w:val="0"/>
                 <w:color w:val="1E2F38"/>
-                <w:sz w:val="20"/>
+                <w:sz w:val="18"/>
               </w:rPr>
-              <w:t>API-first exports mapped to DHIS2 indicators; eCHIS-aligned household records</w:t>
+              <w:t>Referral handoff and encounter linkage at FairBanks Medical Centre</w:t>
             </w:r>
           </w:p>
         </w:tc>
@@ -588,9 +1578,245 @@
                 <w:b w:val="0"/>
                 <w:i w:val="0"/>
                 <w:color w:val="1E2F38"/>
-                <w:sz w:val="20"/>
+                <w:sz w:val="18"/>
               </w:rPr>
-              <w:t>Not a replacement</w:t>
+              <w:t>National warehouse / related systems</w:t>
+            </w:r>
+          </w:p>
+        </w:tc>
+        <w:tc>
+          <w:tcPr>
+            <w:tcW w:type="dxa" w:w="6624"/>
+            <w:shd w:fill="F7F5F0"/>
+            <w:tcBorders>
+              <w:top w:val="single" w:sz="8" w:color="D0DCDC"/>
+              <w:left w:val="single" w:sz="8" w:color="D0DCDC"/>
+              <w:bottom w:val="single" w:sz="8" w:color="D0DCDC"/>
+              <w:right w:val="single" w:sz="8" w:color="D0DCDC"/>
+            </w:tcBorders>
+          </w:tcPr>
+          <w:p>
+            <w:r/>
+            <w:r>
+              <w:rPr>
+                <w:rFonts w:ascii="Calibri" w:hAnsi="Calibri" w:eastAsia="Calibri"/>
+                <w:b w:val="0"/>
+                <w:i w:val="0"/>
+                <w:color w:val="1E2F38"/>
+                <w:sz w:val="18"/>
+              </w:rPr>
+              <w:t>Standardised JSON/API feeds when national schema is confirmed</w:t>
+            </w:r>
+          </w:p>
+        </w:tc>
+      </w:tr>
+    </w:tbl>
+    <w:p/>
+    <w:p>
+      <w:pPr>
+        <w:jc w:val="center"/>
+      </w:pPr>
+      <w:r>
+        <w:drawing>
+          <wp:inline xmlns:a="http://schemas.openxmlformats.org/drawingml/2006/main" xmlns:pic="http://schemas.openxmlformats.org/drawingml/2006/picture">
+            <wp:extent cx="4389120" cy="2926080"/>
+            <wp:docPr id="4" name="Picture 4"/>
+            <wp:cNvGraphicFramePr>
+              <a:graphicFrameLocks noChangeAspect="1"/>
+            </wp:cNvGraphicFramePr>
+            <a:graphic>
+              <a:graphicData uri="http://schemas.openxmlformats.org/drawingml/2006/picture">
+                <pic:pic>
+                  <pic:nvPicPr>
+                    <pic:cNvPr id="0" name="dashboard_demo_opt.jpg"/>
+                    <pic:cNvPicPr/>
+                  </pic:nvPicPr>
+                  <pic:blipFill>
+                    <a:blip r:embed="rId12"/>
+                    <a:stretch>
+                      <a:fillRect/>
+                    </a:stretch>
+                  </pic:blipFill>
+                  <pic:spPr>
+                    <a:xfrm>
+                      <a:off x="0" y="0"/>
+                      <a:ext cx="4389120" cy="2926080"/>
+                    </a:xfrm>
+                    <a:prstGeom prst="rect"/>
+                  </pic:spPr>
+                </pic:pic>
+              </a:graphicData>
+            </a:graphic>
+          </wp:inline>
+        </w:drawing>
+      </w:r>
+    </w:p>
+    <w:p>
+      <w:pPr>
+        <w:spacing w:after="160"/>
+        <w:jc w:val="center"/>
+      </w:pPr>
+      <w:r>
+        <w:rPr>
+          <w:rFonts w:ascii="Calibri" w:hAnsi="Calibri" w:eastAsia="Calibri"/>
+          <w:b w:val="0"/>
+          <w:i/>
+          <w:color w:val="3A4A54"/>
+          <w:sz w:val="16"/>
+        </w:rPr>
+        <w:t>Facility and programme dashboards for action</w:t>
+      </w:r>
+    </w:p>
+    <w:p>
+      <w:pPr>
+        <w:spacing w:before="240" w:after="100"/>
+      </w:pPr>
+      <w:r>
+        <w:rPr>
+          <w:rFonts w:ascii="Calibri" w:hAnsi="Calibri" w:eastAsia="Calibri"/>
+          <w:b/>
+          <w:i w:val="0"/>
+          <w:color w:val="0A1F2E"/>
+          <w:sz w:val="32"/>
+        </w:rPr>
+        <w:t>IX. Alignment with MOU Guiding Principles</w:t>
+      </w:r>
+    </w:p>
+    <w:tbl>
+      <w:tblPr>
+        <w:tblW w:type="auto" w:w="0"/>
+        <w:jc w:val="center"/>
+        <w:tblLook w:firstColumn="1" w:firstRow="1" w:lastColumn="0" w:lastRow="0" w:noHBand="0" w:noVBand="1" w:val="04A0"/>
+      </w:tblPr>
+      <w:tblGrid>
+        <w:gridCol w:w="4968"/>
+        <w:gridCol w:w="4968"/>
+      </w:tblGrid>
+      <w:tr>
+        <w:tc>
+          <w:tcPr>
+            <w:tcW w:type="dxa" w:w="3168"/>
+            <w:shd w:fill="0D6E6E"/>
+            <w:tcBorders>
+              <w:top w:val="single" w:sz="8" w:color="0D6E6E"/>
+              <w:left w:val="single" w:sz="8" w:color="0D6E6E"/>
+              <w:bottom w:val="single" w:sz="8" w:color="0D6E6E"/>
+              <w:right w:val="single" w:sz="8" w:color="0D6E6E"/>
+            </w:tcBorders>
+          </w:tcPr>
+          <w:p>
+            <w:r/>
+            <w:r>
+              <w:rPr>
+                <w:rFonts w:ascii="Calibri" w:hAnsi="Calibri" w:eastAsia="Calibri"/>
+                <w:b/>
+                <w:i w:val="0"/>
+                <w:color w:val="FFFFFF"/>
+                <w:sz w:val="18"/>
+              </w:rPr>
+              <w:t>Principle</w:t>
+            </w:r>
+          </w:p>
+        </w:tc>
+        <w:tc>
+          <w:tcPr>
+            <w:tcW w:type="dxa" w:w="6336"/>
+            <w:shd w:fill="0D6E6E"/>
+            <w:tcBorders>
+              <w:top w:val="single" w:sz="8" w:color="0D6E6E"/>
+              <w:left w:val="single" w:sz="8" w:color="0D6E6E"/>
+              <w:bottom w:val="single" w:sz="8" w:color="0D6E6E"/>
+              <w:right w:val="single" w:sz="8" w:color="0D6E6E"/>
+            </w:tcBorders>
+          </w:tcPr>
+          <w:p>
+            <w:r/>
+            <w:r>
+              <w:rPr>
+                <w:rFonts w:ascii="Calibri" w:hAnsi="Calibri" w:eastAsia="Calibri"/>
+                <w:b/>
+                <w:i w:val="0"/>
+                <w:color w:val="FFFFFF"/>
+                <w:sz w:val="18"/>
+              </w:rPr>
+              <w:t>How FairBanks responds</w:t>
+            </w:r>
+          </w:p>
+        </w:tc>
+      </w:tr>
+      <w:tr>
+        <w:tc>
+          <w:tcPr>
+            <w:tcW w:type="dxa" w:w="3168"/>
+            <w:tcBorders>
+              <w:top w:val="single" w:sz="8" w:color="D0DCDC"/>
+              <w:left w:val="single" w:sz="8" w:color="D0DCDC"/>
+              <w:bottom w:val="single" w:sz="8" w:color="D0DCDC"/>
+              <w:right w:val="single" w:sz="8" w:color="D0DCDC"/>
+            </w:tcBorders>
+          </w:tcPr>
+          <w:p>
+            <w:r/>
+            <w:r>
+              <w:rPr>
+                <w:rFonts w:ascii="Calibri" w:hAnsi="Calibri" w:eastAsia="Calibri"/>
+                <w:b w:val="0"/>
+                <w:i w:val="0"/>
+                <w:color w:val="1E2F38"/>
+                <w:sz w:val="18"/>
+              </w:rPr>
+              <w:t>Sustainability &amp; country ownership</w:t>
+            </w:r>
+          </w:p>
+        </w:tc>
+        <w:tc>
+          <w:tcPr>
+            <w:tcW w:type="dxa" w:w="6336"/>
+            <w:tcBorders>
+              <w:top w:val="single" w:sz="8" w:color="D0DCDC"/>
+              <w:left w:val="single" w:sz="8" w:color="D0DCDC"/>
+              <w:bottom w:val="single" w:sz="8" w:color="D0DCDC"/>
+              <w:right w:val="single" w:sz="8" w:color="D0DCDC"/>
+            </w:tcBorders>
+          </w:tcPr>
+          <w:p>
+            <w:r/>
+            <w:r>
+              <w:rPr>
+                <w:rFonts w:ascii="Calibri" w:hAnsi="Calibri" w:eastAsia="Calibri"/>
+                <w:b w:val="0"/>
+                <w:i w:val="0"/>
+                <w:color w:val="1E2F38"/>
+                <w:sz w:val="18"/>
+              </w:rPr>
+              <w:t>Design for MoH alignment and staged transfer of operations</w:t>
+            </w:r>
+          </w:p>
+        </w:tc>
+      </w:tr>
+      <w:tr>
+        <w:tc>
+          <w:tcPr>
+            <w:tcW w:type="dxa" w:w="3168"/>
+            <w:shd w:fill="F7F5F0"/>
+            <w:tcBorders>
+              <w:top w:val="single" w:sz="8" w:color="D0DCDC"/>
+              <w:left w:val="single" w:sz="8" w:color="D0DCDC"/>
+              <w:bottom w:val="single" w:sz="8" w:color="D0DCDC"/>
+              <w:right w:val="single" w:sz="8" w:color="D0DCDC"/>
+            </w:tcBorders>
+          </w:tcPr>
+          <w:p>
+            <w:r/>
+            <w:r>
+              <w:rPr>
+                <w:rFonts w:ascii="Calibri" w:hAnsi="Calibri" w:eastAsia="Calibri"/>
+                <w:b w:val="0"/>
+                <w:i w:val="0"/>
+                <w:color w:val="1E2F38"/>
+                <w:sz w:val="18"/>
+              </w:rPr>
+              <w:t>Protect essential services</w:t>
             </w:r>
           </w:p>
         </w:tc>
@@ -613,254 +1839,9 @@
                 <w:b w:val="0"/>
                 <w:i w:val="0"/>
                 <w:color w:val="1E2F38"/>
-                <w:sz w:val="20"/>
+                <w:sz w:val="18"/>
               </w:rPr>
-              <w:t>Complements MoH systems — adds predictive intelligence and community loop closure</w:t>
-            </w:r>
-          </w:p>
-        </w:tc>
-      </w:tr>
-    </w:tbl>
-    <w:p/>
-    <w:p>
-      <w:pPr>
-        <w:spacing w:before="280" w:after="120"/>
-      </w:pPr>
-      <w:r>
-        <w:rPr>
-          <w:rFonts w:ascii="Calibri" w:hAnsi="Calibri" w:eastAsia="Calibri"/>
-          <w:b/>
-          <w:i w:val="0"/>
-          <w:color w:val="0A1F2E"/>
-          <w:sz w:val="40"/>
-        </w:rPr>
-        <w:t>IV. Proposed Digital Health Activity</w:t>
-      </w:r>
-    </w:p>
-    <w:p>
-      <w:pPr>
-        <w:pStyle w:val="ListBullet"/>
-        <w:spacing w:after="60"/>
-      </w:pPr>
-      <w:r>
-        <w:rPr>
-          <w:rFonts w:ascii="Calibri" w:hAnsi="Calibri" w:eastAsia="Calibri"/>
-          <w:b w:val="0"/>
-          <w:i w:val="0"/>
-          <w:color w:val="1E2F38"/>
-          <w:sz w:val="22"/>
-        </w:rPr>
-        <w:t>Deploy offline-capable CHW capture aligned with eCHIS household and visit concepts</w:t>
-      </w:r>
-    </w:p>
-    <w:p>
-      <w:pPr>
-        <w:pStyle w:val="ListBullet"/>
-        <w:spacing w:after="60"/>
-      </w:pPr>
-      <w:r>
-        <w:rPr>
-          <w:rFonts w:ascii="Calibri" w:hAnsi="Calibri" w:eastAsia="Calibri"/>
-          <w:b w:val="0"/>
-          <w:i w:val="0"/>
-          <w:color w:val="1E2F38"/>
-          <w:sz w:val="22"/>
-        </w:rPr>
-        <w:t>Build secure sync pipeline with role-based access for CHWs, facilities, and district viewers</w:t>
-      </w:r>
-    </w:p>
-    <w:p>
-      <w:pPr>
-        <w:pStyle w:val="ListBullet"/>
-        <w:spacing w:after="60"/>
-      </w:pPr>
-      <w:r>
-        <w:rPr>
-          <w:rFonts w:ascii="Calibri" w:hAnsi="Calibri" w:eastAsia="Calibri"/>
-          <w:b w:val="0"/>
-          <w:i w:val="0"/>
-          <w:color w:val="1E2F38"/>
-          <w:sz w:val="22"/>
-        </w:rPr>
-        <w:t>Map community indicators to DHIS2 reporting elements for aggregate submission</w:t>
-      </w:r>
-    </w:p>
-    <w:p>
-      <w:pPr>
-        <w:pStyle w:val="ListBullet"/>
-        <w:spacing w:after="60"/>
-      </w:pPr>
-      <w:r>
-        <w:rPr>
-          <w:rFonts w:ascii="Calibri" w:hAnsi="Calibri" w:eastAsia="Calibri"/>
-          <w:b w:val="0"/>
-          <w:i w:val="0"/>
-          <w:color w:val="1E2F38"/>
-          <w:sz w:val="22"/>
-        </w:rPr>
-        <w:t>Provide facility dashboards for referrals, alerts, and programme monitoring</w:t>
-      </w:r>
-    </w:p>
-    <w:p>
-      <w:pPr>
-        <w:pStyle w:val="ListBullet"/>
-        <w:spacing w:after="60"/>
-      </w:pPr>
-      <w:r>
-        <w:rPr>
-          <w:rFonts w:ascii="Calibri" w:hAnsi="Calibri" w:eastAsia="Calibri"/>
-          <w:b w:val="0"/>
-          <w:i w:val="0"/>
-          <w:color w:val="1E2F38"/>
-          <w:sz w:val="22"/>
-        </w:rPr>
-        <w:t>Pilot GIS hotspot views to support targeted outreach and supply planning</w:t>
-      </w:r>
-    </w:p>
-    <w:p>
-      <w:pPr>
-        <w:pStyle w:val="ListBullet"/>
-        <w:spacing w:after="60"/>
-      </w:pPr>
-      <w:r>
-        <w:rPr>
-          <w:rFonts w:ascii="Calibri" w:hAnsi="Calibri" w:eastAsia="Calibri"/>
-          <w:b w:val="0"/>
-          <w:i w:val="0"/>
-          <w:color w:val="1E2F38"/>
-          <w:sz w:val="22"/>
-        </w:rPr>
-        <w:t>Document interoperability specifications for full proposal stage</w:t>
-      </w:r>
-    </w:p>
-    <w:p>
-      <w:pPr>
-        <w:jc w:val="center"/>
-      </w:pPr>
-      <w:r>
-        <w:drawing>
-          <wp:inline xmlns:a="http://schemas.openxmlformats.org/drawingml/2006/main" xmlns:pic="http://schemas.openxmlformats.org/drawingml/2006/picture">
-            <wp:extent cx="4665106" cy="3108960"/>
-            <wp:docPr id="3" name="Picture 3"/>
-            <wp:cNvGraphicFramePr>
-              <a:graphicFrameLocks noChangeAspect="1"/>
-            </wp:cNvGraphicFramePr>
-            <a:graphic>
-              <a:graphicData uri="http://schemas.openxmlformats.org/drawingml/2006/picture">
-                <pic:pic>
-                  <pic:nvPicPr>
-                    <pic:cNvPr id="0" name="data_flow_iso_labeled_opt.jpg"/>
-                    <pic:cNvPicPr/>
-                  </pic:nvPicPr>
-                  <pic:blipFill>
-                    <a:blip r:embed="rId11"/>
-                    <a:stretch>
-                      <a:fillRect/>
-                    </a:stretch>
-                  </pic:blipFill>
-                  <pic:spPr>
-                    <a:xfrm>
-                      <a:off x="0" y="0"/>
-                      <a:ext cx="4665106" cy="3108960"/>
-                    </a:xfrm>
-                    <a:prstGeom prst="rect"/>
-                  </pic:spPr>
-                </pic:pic>
-              </a:graphicData>
-            </a:graphic>
-          </wp:inline>
-        </w:drawing>
-      </w:r>
-    </w:p>
-    <w:p>
-      <w:pPr>
-        <w:spacing w:after="200"/>
-        <w:jc w:val="center"/>
-      </w:pPr>
-      <w:r>
-        <w:rPr>
-          <w:rFonts w:ascii="Calibri" w:hAnsi="Calibri" w:eastAsia="Calibri"/>
-          <w:b w:val="0"/>
-          <w:i/>
-          <w:color w:val="3A4A54"/>
-          <w:sz w:val="18"/>
-        </w:rPr>
-        <w:t>Community cascade → FCHIP → national digital health systems</w:t>
-      </w:r>
-    </w:p>
-    <w:p>
-      <w:pPr>
-        <w:spacing w:before="280" w:after="120"/>
-      </w:pPr>
-      <w:r>
-        <w:rPr>
-          <w:rFonts w:ascii="Calibri" w:hAnsi="Calibri" w:eastAsia="Calibri"/>
-          <w:b/>
-          <w:i w:val="0"/>
-          <w:color w:val="0A1F2E"/>
-          <w:sz w:val="40"/>
-        </w:rPr>
-        <w:t>V. Interoperability Approach</w:t>
-      </w:r>
-    </w:p>
-    <w:tbl>
-      <w:tblPr>
-        <w:tblW w:type="auto" w:w="0"/>
-        <w:jc w:val="center"/>
-        <w:tblLook w:firstColumn="1" w:firstRow="1" w:lastColumn="0" w:lastRow="0" w:noHBand="0" w:noVBand="1" w:val="04A0"/>
-      </w:tblPr>
-      <w:tblGrid>
-        <w:gridCol w:w="4896"/>
-        <w:gridCol w:w="4896"/>
-      </w:tblGrid>
-      <w:tr>
-        <w:tc>
-          <w:tcPr>
-            <w:tcW w:type="dxa" w:w="2304"/>
-            <w:shd w:fill="0D6E6E"/>
-            <w:tcBorders>
-              <w:top w:val="single" w:sz="8" w:color="0D6E6E"/>
-              <w:left w:val="single" w:sz="8" w:color="0D6E6E"/>
-              <w:bottom w:val="single" w:sz="8" w:color="0D6E6E"/>
-              <w:right w:val="single" w:sz="8" w:color="0D6E6E"/>
-            </w:tcBorders>
-          </w:tcPr>
-          <w:p>
-            <w:r/>
-            <w:r>
-              <w:rPr>
-                <w:rFonts w:ascii="Calibri" w:hAnsi="Calibri" w:eastAsia="Calibri"/>
-                <w:b/>
-                <w:i w:val="0"/>
-                <w:color w:val="FFFFFF"/>
-                <w:sz w:val="20"/>
-              </w:rPr>
-              <w:t>Platform</w:t>
-            </w:r>
-          </w:p>
-        </w:tc>
-        <w:tc>
-          <w:tcPr>
-            <w:tcW w:type="dxa" w:w="6912"/>
-            <w:shd w:fill="0D6E6E"/>
-            <w:tcBorders>
-              <w:top w:val="single" w:sz="8" w:color="0D6E6E"/>
-              <w:left w:val="single" w:sz="8" w:color="0D6E6E"/>
-              <w:bottom w:val="single" w:sz="8" w:color="0D6E6E"/>
-              <w:right w:val="single" w:sz="8" w:color="0D6E6E"/>
-            </w:tcBorders>
-          </w:tcPr>
-          <w:p>
-            <w:r/>
-            <w:r>
-              <w:rPr>
-                <w:rFonts w:ascii="Calibri" w:hAnsi="Calibri" w:eastAsia="Calibri"/>
-                <w:b/>
-                <w:i w:val="0"/>
-                <w:color w:val="FFFFFF"/>
-                <w:sz w:val="20"/>
-              </w:rPr>
-              <w:t>Integration pathway</w:t>
+              <w:t>Digital workflows reinforce HIV, TB, malaria, MNCH, immunisation</w:t>
             </w:r>
           </w:p>
         </w:tc>
@@ -868,7 +1849,7 @@
       <w:tr>
         <w:tc>
           <w:tcPr>
-            <w:tcW w:type="dxa" w:w="2304"/>
+            <w:tcW w:type="dxa" w:w="3168"/>
             <w:tcBorders>
               <w:top w:val="single" w:sz="8" w:color="D0DCDC"/>
               <w:left w:val="single" w:sz="8" w:color="D0DCDC"/>
@@ -884,15 +1865,15 @@
                 <w:b w:val="0"/>
                 <w:i w:val="0"/>
                 <w:color w:val="1E2F38"/>
-                <w:sz w:val="20"/>
+                <w:sz w:val="18"/>
               </w:rPr>
-              <w:t>eCHIS</w:t>
+              <w:t>Data-driven accountability</w:t>
             </w:r>
           </w:p>
         </w:tc>
         <w:tc>
           <w:tcPr>
-            <w:tcW w:type="dxa" w:w="6912"/>
+            <w:tcW w:type="dxa" w:w="6336"/>
             <w:tcBorders>
               <w:top w:val="single" w:sz="8" w:color="D0DCDC"/>
               <w:left w:val="single" w:sz="8" w:color="D0DCDC"/>
@@ -908,9 +1889,9 @@
                 <w:b w:val="0"/>
                 <w:i w:val="0"/>
                 <w:color w:val="1E2F38"/>
-                <w:sz w:val="20"/>
+                <w:sz w:val="18"/>
               </w:rPr>
-              <w:t>Household registration, visit logs, referral flags — structured mobile capture</w:t>
+              <w:t>Quality data for decisions - not parallel reporting burden</w:t>
             </w:r>
           </w:p>
         </w:tc>
@@ -918,7 +1899,7 @@
       <w:tr>
         <w:tc>
           <w:tcPr>
-            <w:tcW w:type="dxa" w:w="2304"/>
+            <w:tcW w:type="dxa" w:w="3168"/>
             <w:shd w:fill="F7F5F0"/>
             <w:tcBorders>
               <w:top w:val="single" w:sz="8" w:color="D0DCDC"/>
@@ -935,15 +1916,15 @@
                 <w:b w:val="0"/>
                 <w:i w:val="0"/>
                 <w:color w:val="1E2F38"/>
-                <w:sz w:val="20"/>
+                <w:sz w:val="18"/>
               </w:rPr>
-              <w:t>DHIS2</w:t>
+              <w:t>Integrated, people-centred care</w:t>
             </w:r>
           </w:p>
         </w:tc>
         <w:tc>
           <w:tcPr>
-            <w:tcW w:type="dxa" w:w="6912"/>
+            <w:tcW w:type="dxa" w:w="6336"/>
             <w:shd w:fill="F7F5F0"/>
             <w:tcBorders>
               <w:top w:val="single" w:sz="8" w:color="D0DCDC"/>
@@ -960,9 +1941,9 @@
                 <w:b w:val="0"/>
                 <w:i w:val="0"/>
                 <w:color w:val="1E2F38"/>
-                <w:sz w:val="20"/>
+                <w:sz w:val="18"/>
               </w:rPr>
-              <w:t>Aggregate exports for immunisation, ANC, NCD screening, disease surveillance</w:t>
+              <w:t>One community-to-facility loop; less fragmentation</w:t>
             </w:r>
           </w:p>
         </w:tc>
@@ -970,7 +1951,7 @@
       <w:tr>
         <w:tc>
           <w:tcPr>
-            <w:tcW w:type="dxa" w:w="2304"/>
+            <w:tcW w:type="dxa" w:w="3168"/>
             <w:tcBorders>
               <w:top w:val="single" w:sz="8" w:color="D0DCDC"/>
               <w:left w:val="single" w:sz="8" w:color="D0DCDC"/>
@@ -986,15 +1967,15 @@
                 <w:b w:val="0"/>
                 <w:i w:val="0"/>
                 <w:color w:val="1E2F38"/>
-                <w:sz w:val="20"/>
+                <w:sz w:val="18"/>
               </w:rPr>
-              <w:t>Facility EMR</w:t>
+              <w:t>Local partnerships</w:t>
             </w:r>
           </w:p>
         </w:tc>
         <w:tc>
           <w:tcPr>
-            <w:tcW w:type="dxa" w:w="6912"/>
+            <w:tcW w:type="dxa" w:w="6336"/>
             <w:tcBorders>
               <w:top w:val="single" w:sz="8" w:color="D0DCDC"/>
               <w:left w:val="single" w:sz="8" w:color="D0DCDC"/>
@@ -1010,9 +1991,9 @@
                 <w:b w:val="0"/>
                 <w:i w:val="0"/>
                 <w:color w:val="1E2F38"/>
-                <w:sz w:val="20"/>
+                <w:sz w:val="18"/>
               </w:rPr>
-              <w:t>Referral handoff and encounter linkage at FairBanks Medical Centre</w:t>
+              <w:t>Government, CHWs/VHTs, CBOs, academic and NGO partners</w:t>
             </w:r>
           </w:p>
         </w:tc>
@@ -1020,7 +2001,7 @@
       <w:tr>
         <w:tc>
           <w:tcPr>
-            <w:tcW w:type="dxa" w:w="2304"/>
+            <w:tcW w:type="dxa" w:w="3168"/>
             <w:shd w:fill="F7F5F0"/>
             <w:tcBorders>
               <w:top w:val="single" w:sz="8" w:color="D0DCDC"/>
@@ -1037,15 +2018,15 @@
                 <w:b w:val="0"/>
                 <w:i w:val="0"/>
                 <w:color w:val="1E2F38"/>
-                <w:sz w:val="20"/>
+                <w:sz w:val="18"/>
               </w:rPr>
-              <w:t>National warehouse</w:t>
+              <w:t>Evidence-based programming</w:t>
             </w:r>
           </w:p>
         </w:tc>
         <w:tc>
           <w:tcPr>
-            <w:tcW w:type="dxa" w:w="6912"/>
+            <w:tcW w:type="dxa" w:w="6336"/>
             <w:shd w:fill="F7F5F0"/>
             <w:tcBorders>
               <w:top w:val="single" w:sz="8" w:color="D0DCDC"/>
@@ -1062,9 +2043,9 @@
                 <w:b w:val="0"/>
                 <w:i w:val="0"/>
                 <w:color w:val="1E2F38"/>
-                <w:sz w:val="20"/>
+                <w:sz w:val="18"/>
               </w:rPr>
-              <w:t>Standardised JSON/API feeds when national schema is confirmed</w:t>
+              <w:t>Pilot in live catchments; measure; refine before scale</w:t>
             </w:r>
           </w:p>
         </w:tc>
@@ -1073,62 +2054,7 @@
     <w:p/>
     <w:p>
       <w:pPr>
-        <w:jc w:val="center"/>
-      </w:pPr>
-      <w:r>
-        <w:drawing>
-          <wp:inline xmlns:a="http://schemas.openxmlformats.org/drawingml/2006/main" xmlns:pic="http://schemas.openxmlformats.org/drawingml/2006/picture">
-            <wp:extent cx="4663440" cy="3108960"/>
-            <wp:docPr id="4" name="Picture 4"/>
-            <wp:cNvGraphicFramePr>
-              <a:graphicFrameLocks noChangeAspect="1"/>
-            </wp:cNvGraphicFramePr>
-            <a:graphic>
-              <a:graphicData uri="http://schemas.openxmlformats.org/drawingml/2006/picture">
-                <pic:pic>
-                  <pic:nvPicPr>
-                    <pic:cNvPr id="0" name="dashboard_demo_opt.jpg"/>
-                    <pic:cNvPicPr/>
-                  </pic:nvPicPr>
-                  <pic:blipFill>
-                    <a:blip r:embed="rId12"/>
-                    <a:stretch>
-                      <a:fillRect/>
-                    </a:stretch>
-                  </pic:blipFill>
-                  <pic:spPr>
-                    <a:xfrm>
-                      <a:off x="0" y="0"/>
-                      <a:ext cx="4663440" cy="3108960"/>
-                    </a:xfrm>
-                    <a:prstGeom prst="rect"/>
-                  </pic:spPr>
-                </pic:pic>
-              </a:graphicData>
-            </a:graphic>
-          </wp:inline>
-        </w:drawing>
-      </w:r>
-    </w:p>
-    <w:p>
-      <w:pPr>
-        <w:spacing w:after="200"/>
-        <w:jc w:val="center"/>
-      </w:pPr>
-      <w:r>
-        <w:rPr>
-          <w:rFonts w:ascii="Calibri" w:hAnsi="Calibri" w:eastAsia="Calibri"/>
-          <w:b w:val="0"/>
-          <w:i/>
-          <w:color w:val="3A4A54"/>
-          <w:sz w:val="18"/>
-        </w:rPr>
-        <w:t>Facility and programme dashboards for action, not data hoarding</w:t>
-      </w:r>
-    </w:p>
-    <w:p>
-      <w:pPr>
-        <w:spacing w:before="280" w:after="120"/>
+        <w:spacing w:before="240" w:after="100"/>
       </w:pPr>
       <w:r>
         <w:rPr>
@@ -1136,15 +2062,15 @@
           <w:b/>
           <w:i w:val="0"/>
           <w:color w:val="0A1F2E"/>
-          <w:sz w:val="40"/>
+          <w:sz w:val="32"/>
         </w:rPr>
-        <w:t>VI. Geographic Focus</w:t>
+        <w:t>X. Geographic Focus</w:t>
       </w:r>
     </w:p>
     <w:p>
       <w:pPr>
         <w:pStyle w:val="ListBullet"/>
-        <w:spacing w:after="60"/>
+        <w:spacing w:after="40"/>
       </w:pPr>
       <w:r>
         <w:rPr>
@@ -1152,15 +2078,15 @@
           <w:b w:val="0"/>
           <w:i w:val="0"/>
           <w:color w:val="1E2F38"/>
-          <w:sz w:val="22"/>
+          <w:sz w:val="20"/>
         </w:rPr>
-        <w:t>Primary pilot: FairBanks catchment — Kampala-area communities with live CHW operations</w:t>
+        <w:t>Primary pilot: FairBanks catchment - Kampala-area communities with live CHW operations.</w:t>
       </w:r>
     </w:p>
     <w:p>
       <w:pPr>
         <w:pStyle w:val="ListBullet"/>
-        <w:spacing w:after="60"/>
+        <w:spacing w:after="40"/>
       </w:pPr>
       <w:r>
         <w:rPr>
@@ -1168,15 +2094,15 @@
           <w:b w:val="0"/>
           <w:i w:val="0"/>
           <w:color w:val="1E2F38"/>
-          <w:sz w:val="22"/>
+          <w:sz w:val="20"/>
         </w:rPr>
-        <w:t>Scalable model: CHW/VHT systems exist nationwide; architecture designed for district replication</w:t>
+        <w:t>Scale path: architecture designed for district replication wherever CHW/VHT systems operate.</w:t>
       </w:r>
     </w:p>
     <w:p>
       <w:pPr>
         <w:pStyle w:val="ListBullet"/>
-        <w:spacing w:after="60"/>
+        <w:spacing w:after="40"/>
       </w:pPr>
       <w:r>
         <w:rPr>
@@ -1184,9 +2110,9 @@
           <w:b w:val="0"/>
           <w:i w:val="0"/>
           <w:color w:val="1E2F38"/>
-          <w:sz w:val="22"/>
+          <w:sz w:val="20"/>
         </w:rPr>
-        <w:t>Alignment with MOU geography: Ugandan organisations implementing under national health priorities</w:t>
+        <w:t>MOU fit: Ugandan organisation implementing under national health priorities and digital stack.</w:t>
       </w:r>
     </w:p>
     <w:p>
@@ -1196,7 +2122,7 @@
       <w:r>
         <w:drawing>
           <wp:inline xmlns:a="http://schemas.openxmlformats.org/drawingml/2006/main" xmlns:pic="http://schemas.openxmlformats.org/drawingml/2006/picture">
-            <wp:extent cx="4663440" cy="3108960"/>
+            <wp:extent cx="4389120" cy="2926080"/>
             <wp:docPr id="5" name="Picture 5"/>
             <wp:cNvGraphicFramePr>
               <a:graphicFrameLocks noChangeAspect="1"/>
@@ -1217,7 +2143,7 @@
                   <pic:spPr>
                     <a:xfrm>
                       <a:off x="0" y="0"/>
-                      <a:ext cx="4663440" cy="3108960"/>
+                      <a:ext cx="4389120" cy="2926080"/>
                     </a:xfrm>
                     <a:prstGeom prst="rect"/>
                   </pic:spPr>
@@ -1230,7 +2156,7 @@
     </w:p>
     <w:p>
       <w:pPr>
-        <w:spacing w:after="200"/>
+        <w:spacing w:after="160"/>
         <w:jc w:val="center"/>
       </w:pPr>
       <w:r>
@@ -1239,14 +2165,14 @@
           <w:b w:val="0"/>
           <w:i/>
           <w:color w:val="3A4A54"/>
-          <w:sz w:val="18"/>
+          <w:sz w:val="16"/>
         </w:rPr>
         <w:t>Live community outreach — pilot ground truth</w:t>
       </w:r>
     </w:p>
     <w:p>
       <w:pPr>
-        <w:spacing w:before="280" w:after="120"/>
+        <w:spacing w:before="240" w:after="100"/>
       </w:pPr>
       <w:r>
         <w:rPr>
@@ -1254,15 +2180,15 @@
           <w:b/>
           <w:i w:val="0"/>
           <w:color w:val="0A1F2E"/>
-          <w:sz w:val="40"/>
+          <w:sz w:val="32"/>
         </w:rPr>
-        <w:t>VII. Sustainability &amp; Local Ownership</w:t>
+        <w:t>XI. Sustainability &amp; Local Ownership</w:t>
       </w:r>
     </w:p>
     <w:p>
       <w:pPr>
         <w:pStyle w:val="ListBullet"/>
-        <w:spacing w:after="60"/>
+        <w:spacing w:after="40"/>
       </w:pPr>
       <w:r>
         <w:rPr>
@@ -1270,15 +2196,15 @@
           <w:b w:val="0"/>
           <w:i w:val="0"/>
           <w:color w:val="1E2F38"/>
-          <w:sz w:val="22"/>
+          <w:sz w:val="20"/>
         </w:rPr>
-        <w:t>FairBanks operates the medical centre and outreach without grant dependency for core services</w:t>
+        <w:t>Core clinic and outreach continue as FairBanks operations - the grant accelerates interoperable intelligence and transfer, not basic organisational survival.</w:t>
       </w:r>
     </w:p>
     <w:p>
       <w:pPr>
         <w:pStyle w:val="ListBullet"/>
-        <w:spacing w:after="60"/>
+        <w:spacing w:after="40"/>
       </w:pPr>
       <w:r>
         <w:rPr>
@@ -1286,15 +2212,15 @@
           <w:b w:val="0"/>
           <w:i w:val="0"/>
           <w:color w:val="1E2F38"/>
-          <w:sz w:val="22"/>
+          <w:sz w:val="20"/>
         </w:rPr>
-        <w:t>Revenue pathways: clinic subscriptions, district deployments, NGO programme monitoring, partner APIs</w:t>
+        <w:t>Diversified sustainability pathways after transfer: facility use, district deployments, NGO programme monitoring, partner APIs, and training packages.</w:t>
       </w:r>
     </w:p>
     <w:p>
       <w:pPr>
         <w:pStyle w:val="ListBullet"/>
-        <w:spacing w:after="60"/>
+        <w:spacing w:after="40"/>
       </w:pPr>
       <w:r>
         <w:rPr>
@@ -1302,15 +2228,15 @@
           <w:b w:val="0"/>
           <w:i w:val="0"/>
           <w:color w:val="1E2F38"/>
-          <w:sz w:val="22"/>
+          <w:sz w:val="20"/>
         </w:rPr>
-        <w:t>Local capacity: train Ugandan developers and data stewards; document systems for MoH handoff</w:t>
+        <w:t>Local capacity: train Ugandan developers, CHW supervisors, and data stewards; document systems for government handoff.</w:t>
       </w:r>
     </w:p>
     <w:p>
       <w:pPr>
         <w:pStyle w:val="ListBullet"/>
-        <w:spacing w:after="60"/>
+        <w:spacing w:after="40"/>
       </w:pPr>
       <w:r>
         <w:rPr>
@@ -1318,14 +2244,14 @@
           <w:b w:val="0"/>
           <w:i w:val="0"/>
           <w:color w:val="1E2F38"/>
-          <w:sz w:val="22"/>
+          <w:sz w:val="20"/>
         </w:rPr>
-        <w:t>Community ownership: CHWs and leaders co-design forms and alerts — not top-down IT</w:t>
+        <w:t>Community ownership: CHWs and leaders co-design forms and alerts - technology serves the cascade, not the other way around.</w:t>
       </w:r>
     </w:p>
     <w:p>
       <w:pPr>
-        <w:spacing w:before="280" w:after="120"/>
+        <w:spacing w:before="240" w:after="100"/>
       </w:pPr>
       <w:r>
         <w:rPr>
@@ -1333,15 +2259,15 @@
           <w:b/>
           <w:i w:val="0"/>
           <w:color w:val="0A1F2E"/>
-          <w:sz w:val="40"/>
+          <w:sz w:val="32"/>
         </w:rPr>
-        <w:t>VIII. Partnership Landscape</w:t>
+        <w:t>XII. Partnership Landscape</w:t>
       </w:r>
     </w:p>
     <w:p>
       <w:pPr>
         <w:pStyle w:val="ListBullet"/>
-        <w:spacing w:after="60"/>
+        <w:spacing w:after="40"/>
       </w:pPr>
       <w:r>
         <w:rPr>
@@ -1349,15 +2275,15 @@
           <w:b w:val="0"/>
           <w:i w:val="0"/>
           <w:color w:val="1E2F38"/>
-          <w:sz w:val="22"/>
+          <w:sz w:val="20"/>
         </w:rPr>
-        <w:t>Ministry of Health community health strategy alignment</w:t>
+        <w:t>Ministry of Health digital health and community health strategy alignment</w:t>
       </w:r>
     </w:p>
     <w:p>
       <w:pPr>
         <w:pStyle w:val="ListBullet"/>
-        <w:spacing w:after="60"/>
+        <w:spacing w:after="40"/>
       </w:pPr>
       <w:r>
         <w:rPr>
@@ -1365,15 +2291,15 @@
           <w:b w:val="0"/>
           <w:i w:val="0"/>
           <w:color w:val="1E2F38"/>
-          <w:sz w:val="22"/>
+          <w:sz w:val="20"/>
         </w:rPr>
-        <w:t>District health teams for aggregate reporting validation</w:t>
+        <w:t>District health teams for aggregate reporting validation and readiness dialogue</w:t>
       </w:r>
     </w:p>
     <w:p>
       <w:pPr>
         <w:pStyle w:val="ListBullet"/>
-        <w:spacing w:after="60"/>
+        <w:spacing w:after="40"/>
       </w:pPr>
       <w:r>
         <w:rPr>
@@ -1381,7 +2307,23 @@
           <w:b w:val="0"/>
           <w:i w:val="0"/>
           <w:color w:val="1E2F38"/>
-          <w:sz w:val="22"/>
+          <w:sz w:val="20"/>
+        </w:rPr>
+        <w:t>CHWs, VHTs, and community leaders as primary data partners</w:t>
+      </w:r>
+    </w:p>
+    <w:p>
+      <w:pPr>
+        <w:pStyle w:val="ListBullet"/>
+        <w:spacing w:after="40"/>
+      </w:pPr>
+      <w:r>
+        <w:rPr>
+          <w:rFonts w:ascii="Calibri" w:hAnsi="Calibri" w:eastAsia="Calibri"/>
+          <w:b w:val="0"/>
+          <w:i w:val="0"/>
+          <w:color w:val="1E2F38"/>
+          <w:sz w:val="20"/>
         </w:rPr>
         <w:t>Academic partners for evaluation and interoperability testing</w:t>
       </w:r>
@@ -1389,7 +2331,7 @@
     <w:p>
       <w:pPr>
         <w:pStyle w:val="ListBullet"/>
-        <w:spacing w:after="60"/>
+        <w:spacing w:after="40"/>
       </w:pPr>
       <w:r>
         <w:rPr>
@@ -1397,69 +2339,14 @@
           <w:b w:val="0"/>
           <w:i w:val="0"/>
           <w:color w:val="1E2F38"/>
-          <w:sz w:val="22"/>
+          <w:sz w:val="20"/>
         </w:rPr>
-        <w:t>NGOs and CBOs already working with FairBanks outreach programmes</w:t>
+        <w:t>NGOs and CBOs already collaborating with FairBanks Community Reach</w:t>
       </w:r>
     </w:p>
     <w:p>
       <w:pPr>
-        <w:jc w:val="center"/>
-      </w:pPr>
-      <w:r>
-        <w:drawing>
-          <wp:inline xmlns:a="http://schemas.openxmlformats.org/drawingml/2006/main" xmlns:pic="http://schemas.openxmlformats.org/drawingml/2006/picture">
-            <wp:extent cx="4665106" cy="3108960"/>
-            <wp:docPr id="6" name="Picture 6"/>
-            <wp:cNvGraphicFramePr>
-              <a:graphicFrameLocks noChangeAspect="1"/>
-            </wp:cNvGraphicFramePr>
-            <a:graphic>
-              <a:graphicData uri="http://schemas.openxmlformats.org/drawingml/2006/picture">
-                <pic:pic>
-                  <pic:nvPicPr>
-                    <pic:cNvPr id="0" name="gis_hotspots_opt.jpg"/>
-                    <pic:cNvPicPr/>
-                  </pic:nvPicPr>
-                  <pic:blipFill>
-                    <a:blip r:embed="rId14"/>
-                    <a:stretch>
-                      <a:fillRect/>
-                    </a:stretch>
-                  </pic:blipFill>
-                  <pic:spPr>
-                    <a:xfrm>
-                      <a:off x="0" y="0"/>
-                      <a:ext cx="4665106" cy="3108960"/>
-                    </a:xfrm>
-                    <a:prstGeom prst="rect"/>
-                  </pic:spPr>
-                </pic:pic>
-              </a:graphicData>
-            </a:graphic>
-          </wp:inline>
-        </w:drawing>
-      </w:r>
-    </w:p>
-    <w:p>
-      <w:pPr>
-        <w:spacing w:after="200"/>
-        <w:jc w:val="center"/>
-      </w:pPr>
-      <w:r>
-        <w:rPr>
-          <w:rFonts w:ascii="Calibri" w:hAnsi="Calibri" w:eastAsia="Calibri"/>
-          <w:b w:val="0"/>
-          <w:i/>
-          <w:color w:val="3A4A54"/>
-          <w:sz w:val="18"/>
-        </w:rPr>
-        <w:t>GIS views support district planning and targeted outreach</w:t>
-      </w:r>
-    </w:p>
-    <w:p>
-      <w:pPr>
-        <w:spacing w:before="280" w:after="120"/>
+        <w:spacing w:before="240" w:after="100"/>
       </w:pPr>
       <w:r>
         <w:rPr>
@@ -1467,9 +2354,9 @@
           <w:b/>
           <w:i w:val="0"/>
           <w:color w:val="0A1F2E"/>
-          <w:sz w:val="40"/>
+          <w:sz w:val="32"/>
         </w:rPr>
-        <w:t>IX. Readiness for Full Proposal</w:t>
+        <w:t>XIII. Readiness for Full Proposal</w:t>
       </w:r>
     </w:p>
     <w:p>
@@ -1483,14 +2370,14 @@
           <w:b w:val="0"/>
           <w:i w:val="0"/>
           <w:color w:val="1E2F38"/>
-          <w:sz w:val="22"/>
+          <w:sz w:val="20"/>
         </w:rPr>
-        <w:t>This Statement of Interest confirms FairBanks' intent to respond to Objective 4 with a community-rooted, interoperable digital health proposal. We welcome dialogue with implementing partners and MoH-aligned reviewers before full application submission.</w:t>
+        <w:t>This Statement of Interest confirms FairBanks' intent to advance Objective 4 with a community-rooted, interoperable, government-aligned digital health proposal. We seek invitation to Step 2 (full proposal), where we will detail workplans, budgets, M&amp;E, partnership letters, and a clear transition of staffing and recurrent costs toward sustainable Ugandan ownership.</w:t>
       </w:r>
     </w:p>
     <w:p>
       <w:pPr>
-        <w:spacing w:after="160"/>
+        <w:spacing w:after="40"/>
         <w:jc w:val="left"/>
       </w:pPr>
       <w:r>
@@ -1499,9 +2386,25 @@
           <w:b w:val="0"/>
           <w:i/>
           <w:color w:val="3A4A54"/>
-          <w:sz w:val="18"/>
+          <w:sz w:val="16"/>
         </w:rPr>
-        <w:t>Official opportunity: DFOP0017890. Statement of Interest deadline per programme page.</w:t>
+        <w:t>Official references: DFOP0017890 Addendum E (Uganda). Step 1 SOI. Narrative kept concise for Step 1 review.</w:t>
+      </w:r>
+    </w:p>
+    <w:p>
+      <w:pPr>
+        <w:spacing w:after="40"/>
+        <w:jc w:val="left"/>
+      </w:pPr>
+      <w:r>
+        <w:rPr>
+          <w:rFonts w:ascii="Calibri" w:hAnsi="Calibri" w:eastAsia="Calibri"/>
+          <w:b w:val="0"/>
+          <w:i w:val="0"/>
+          <w:color w:val="0D6E6E"/>
+          <w:sz w:val="14"/>
+        </w:rPr>
+        <w:t>https://opportunitiesforyouth.org/2026/06/15/u-s-department-of-state-launches-up-to-60-million-funding-opportunity-to-strengthen-ugandas-health-system-through-the-health-foreign-assistance-mou-implementation-plan/</w:t>
       </w:r>
     </w:p>
     <w:p>
@@ -1515,9 +2418,9 @@
           <w:b w:val="0"/>
           <w:i w:val="0"/>
           <w:color w:val="0D6E6E"/>
-          <w:sz w:val="16"/>
+          <w:sz w:val="14"/>
         </w:rPr>
-        <w:t>https://opportunitiesforyouth.org/2026/06/15/u-s-department-of-state-launches-up-to-60-million-funding-opportunity-to-strengthen-ugandas-health-system-through-the-health-foreign-assistance-mou-implementation-plan/</w:t>
+        <w:t>https://simpler.grants.gov/opportunity/44a573b8-d46a-4cec-8c84-f319cd1cc1b6</w:t>
       </w:r>
     </w:p>
     <w:p>
@@ -1538,7 +2441,7 @@
     </w:p>
     <w:sectPr>
       <w:pgSz w:w="12240" w:h="15840"/>
-      <w:pgMar w:top="1080" w:right="1224" w:bottom="1080" w:left="1224" w:header="720" w:footer="720" w:gutter="0"/>
+      <w:pgMar w:top="1008" w:right="1152" w:bottom="1008" w:left="1152" w:header="720" w:footer="720" w:gutter="0"/>
       <w:cols w:space="720"/>
       <w:docGrid w:linePitch="360"/>
     </w:sectPr>

</xml_diff>

<commit_message>
Revise build_dos-uganda_docs.py and associated documents to reflect updates in the Statement of Interest for the Uganda Health System MOU (DFOP0017890). Change "Step 1" to "Phase 1" in titles and subtitles, enhance project details including the proposed project title and organization name, and update narrative content to align with new objectives focused on interoperability and government ownership. Ensure consistency across Word, PDF, and PowerPoint formats while maintaining compliance with project guidelines.
</commit_message>
<xml_diff>
--- a/applications/dos-uganda/documents/dos-uganda_word.docx
+++ b/applications/dos-uganda/documents/dos-uganda_word.docx
@@ -4,15 +4,14 @@
   <w:body>
     <w:p>
       <w:pPr>
-        <w:spacing w:after="60"/>
+        <w:spacing w:before="0" w:after="80" w:line="240" w:lineRule="auto"/>
         <w:jc w:val="center"/>
       </w:pPr>
       <w:r>
         <w:rPr>
-          <w:rFonts w:ascii="Calibri" w:hAnsi="Calibri" w:eastAsia="Calibri"/>
+          <w:rFonts w:ascii="Times New Roman" w:hAnsi="Times New Roman" w:eastAsia="Times New Roman"/>
           <w:b/>
           <w:i w:val="0"/>
-          <w:color w:val="0D6E6E"/>
           <w:sz w:val="22"/>
         </w:rPr>
         <w:t>U.S. Department of State / GHSD — Advancing Global Health (DFOP0017890)</w:t>
@@ -20,31 +19,29 @@
     </w:p>
     <w:p>
       <w:pPr>
-        <w:spacing w:after="60"/>
+        <w:spacing w:before="0" w:after="80" w:line="240" w:lineRule="auto"/>
         <w:jc w:val="center"/>
       </w:pPr>
       <w:r>
         <w:rPr>
-          <w:rFonts w:ascii="Calibri" w:hAnsi="Calibri" w:eastAsia="Calibri"/>
+          <w:rFonts w:ascii="Times New Roman" w:hAnsi="Times New Roman" w:eastAsia="Times New Roman"/>
           <w:b/>
           <w:i w:val="0"/>
-          <w:color w:val="0A1F2E"/>
-          <w:sz w:val="40"/>
+          <w:sz w:val="28"/>
         </w:rPr>
-        <w:t>Statement of Interest — Step 1</w:t>
+        <w:t>Statement of Interest — Phase 1</w:t>
       </w:r>
     </w:p>
     <w:p>
       <w:pPr>
-        <w:spacing w:after="60"/>
+        <w:spacing w:before="0" w:after="80" w:line="240" w:lineRule="auto"/>
         <w:jc w:val="center"/>
       </w:pPr>
       <w:r>
         <w:rPr>
-          <w:rFonts w:ascii="Calibri" w:hAnsi="Calibri" w:eastAsia="Calibri"/>
+          <w:rFonts w:ascii="Times New Roman" w:hAnsi="Times New Roman" w:eastAsia="Times New Roman"/>
           <w:b/>
           <w:i/>
-          <w:color w:val="C45C26"/>
           <w:sz w:val="24"/>
         </w:rPr>
         <w:t>FairBanks Medical Centre  ·  FairBanks Community Reach  ·  FCHIP</w:t>
@@ -52,31 +49,29 @@
     </w:p>
     <w:p>
       <w:pPr>
-        <w:spacing w:after="80"/>
+        <w:spacing w:before="0" w:after="80" w:line="240" w:lineRule="auto"/>
         <w:jc w:val="center"/>
       </w:pPr>
       <w:r>
         <w:rPr>
-          <w:rFonts w:ascii="Calibri" w:hAnsi="Calibri" w:eastAsia="Calibri"/>
+          <w:rFonts w:ascii="Times New Roman" w:hAnsi="Times New Roman" w:eastAsia="Times New Roman"/>
           <w:b w:val="0"/>
           <w:i/>
-          <w:color w:val="3A4A54"/>
-          <w:sz w:val="20"/>
+          <w:sz w:val="22"/>
         </w:rPr>
-        <w:t>Addendum E: Health Foreign Assistance MOU Implementation in Uganda  |  Objective 4: Strengthen and Scale Digital Health Systems</w:t>
+        <w:t>Track 2, Objective 4: Strengthen and Scale Interoperable, Fit-for-Purpose Digital Health Systems</w:t>
       </w:r>
     </w:p>
     <w:p>
       <w:pPr>
-        <w:spacing w:after="160"/>
+        <w:spacing w:before="0" w:after="200" w:line="240" w:lineRule="auto"/>
         <w:jc w:val="center"/>
       </w:pPr>
       <w:r>
         <w:rPr>
-          <w:rFonts w:ascii="Calibri" w:hAnsi="Calibri" w:eastAsia="Calibri"/>
+          <w:rFonts w:ascii="Times New Roman" w:hAnsi="Times New Roman" w:eastAsia="Times New Roman"/>
           <w:b/>
           <w:i/>
-          <w:color w:val="C45C26"/>
           <w:sz w:val="24"/>
         </w:rPr>
         <w:t>Your health, our mission.</w:t>
@@ -84,73 +79,429 @@
     </w:p>
     <w:p>
       <w:pPr>
-        <w:jc w:val="center"/>
+        <w:spacing w:before="240" w:after="120" w:line="240" w:lineRule="auto"/>
       </w:pPr>
       <w:r>
-        <w:drawing>
-          <wp:inline xmlns:a="http://schemas.openxmlformats.org/drawingml/2006/main" xmlns:pic="http://schemas.openxmlformats.org/drawingml/2006/picture">
-            <wp:extent cx="4937760" cy="2775727"/>
-            <wp:docPr id="1" name="Picture 1"/>
-            <wp:cNvGraphicFramePr>
-              <a:graphicFrameLocks noChangeAspect="1"/>
-            </wp:cNvGraphicFramePr>
-            <a:graphic>
-              <a:graphicData uri="http://schemas.openxmlformats.org/drawingml/2006/picture">
-                <pic:pic>
-                  <pic:nvPicPr>
-                    <pic:cNvPr id="0" name="cover_hero_cinematic_opt.jpg"/>
-                    <pic:cNvPicPr/>
-                  </pic:nvPicPr>
-                  <pic:blipFill>
-                    <a:blip r:embed="rId9"/>
-                    <a:stretch>
-                      <a:fillRect/>
-                    </a:stretch>
-                  </pic:blipFill>
-                  <pic:spPr>
-                    <a:xfrm>
-                      <a:off x="0" y="0"/>
-                      <a:ext cx="4937760" cy="2775727"/>
-                    </a:xfrm>
-                    <a:prstGeom prst="rect"/>
-                  </pic:spPr>
-                </pic:pic>
-              </a:graphicData>
-            </a:graphic>
-          </wp:inline>
-        </w:drawing>
+        <w:rPr>
+          <w:rFonts w:ascii="Times New Roman" w:hAnsi="Times New Roman" w:eastAsia="Times New Roman"/>
+          <w:b/>
+          <w:i w:val="0"/>
+          <w:sz w:val="24"/>
+        </w:rPr>
+        <w:t>Table Listing of Critical Details</w:t>
       </w:r>
     </w:p>
+    <w:tbl>
+      <w:tblPr>
+        <w:tblW w:type="auto" w:w="0"/>
+        <w:jc w:val="center"/>
+        <w:tblLook w:firstColumn="1" w:firstRow="1" w:lastColumn="0" w:lastRow="0" w:noHBand="0" w:noVBand="1" w:val="04A0"/>
+      </w:tblPr>
+      <w:tblGrid>
+        <w:gridCol w:w="4680"/>
+        <w:gridCol w:w="4680"/>
+      </w:tblGrid>
+      <w:tr>
+        <w:tc>
+          <w:tcPr>
+            <w:tcW w:type="dxa" w:w="3456"/>
+            <w:shd w:fill="E8EEEE"/>
+            <w:tcBorders>
+              <w:top w:val="single" w:sz="4" w:color="888888"/>
+              <w:left w:val="single" w:sz="4" w:color="888888"/>
+              <w:bottom w:val="single" w:sz="4" w:color="888888"/>
+              <w:right w:val="single" w:sz="4" w:color="888888"/>
+            </w:tcBorders>
+          </w:tcPr>
+          <w:p>
+            <w:r/>
+            <w:r>
+              <w:rPr>
+                <w:rFonts w:ascii="Times New Roman" w:hAnsi="Times New Roman" w:eastAsia="Times New Roman"/>
+                <w:b/>
+                <w:i w:val="0"/>
+                <w:sz w:val="20"/>
+              </w:rPr>
+              <w:t>Item</w:t>
+            </w:r>
+          </w:p>
+        </w:tc>
+        <w:tc>
+          <w:tcPr>
+            <w:tcW w:type="dxa" w:w="5904"/>
+            <w:shd w:fill="E8EEEE"/>
+            <w:tcBorders>
+              <w:top w:val="single" w:sz="4" w:color="888888"/>
+              <w:left w:val="single" w:sz="4" w:color="888888"/>
+              <w:bottom w:val="single" w:sz="4" w:color="888888"/>
+              <w:right w:val="single" w:sz="4" w:color="888888"/>
+            </w:tcBorders>
+          </w:tcPr>
+          <w:p>
+            <w:r/>
+            <w:r>
+              <w:rPr>
+                <w:rFonts w:ascii="Times New Roman" w:hAnsi="Times New Roman" w:eastAsia="Times New Roman"/>
+                <w:b/>
+                <w:i w:val="0"/>
+                <w:sz w:val="20"/>
+              </w:rPr>
+              <w:t>Detail</w:t>
+            </w:r>
+          </w:p>
+        </w:tc>
+      </w:tr>
+      <w:tr>
+        <w:tc>
+          <w:tcPr>
+            <w:tcW w:type="dxa" w:w="3456"/>
+            <w:tcBorders>
+              <w:top w:val="single" w:sz="4" w:color="888888"/>
+              <w:left w:val="single" w:sz="4" w:color="888888"/>
+              <w:bottom w:val="single" w:sz="4" w:color="888888"/>
+              <w:right w:val="single" w:sz="4" w:color="888888"/>
+            </w:tcBorders>
+          </w:tcPr>
+          <w:p>
+            <w:r/>
+            <w:r>
+              <w:rPr>
+                <w:rFonts w:ascii="Times New Roman" w:hAnsi="Times New Roman" w:eastAsia="Times New Roman"/>
+                <w:b w:val="0"/>
+                <w:i w:val="0"/>
+                <w:sz w:val="20"/>
+              </w:rPr>
+              <w:t>Proposed Project Title</w:t>
+            </w:r>
+          </w:p>
+        </w:tc>
+        <w:tc>
+          <w:tcPr>
+            <w:tcW w:type="dxa" w:w="5904"/>
+            <w:tcBorders>
+              <w:top w:val="single" w:sz="4" w:color="888888"/>
+              <w:left w:val="single" w:sz="4" w:color="888888"/>
+              <w:bottom w:val="single" w:sz="4" w:color="888888"/>
+              <w:right w:val="single" w:sz="4" w:color="888888"/>
+            </w:tcBorders>
+          </w:tcPr>
+          <w:p>
+            <w:r/>
+            <w:r>
+              <w:rPr>
+                <w:rFonts w:ascii="Times New Roman" w:hAnsi="Times New Roman" w:eastAsia="Times New Roman"/>
+                <w:b w:val="0"/>
+                <w:i w:val="0"/>
+                <w:sz w:val="20"/>
+              </w:rPr>
+              <w:t>FCHIP Last-Mile Bridge: Interoperable Community Health Data into Uganda's National Digital Health Architecture</w:t>
+            </w:r>
+          </w:p>
+        </w:tc>
+      </w:tr>
+      <w:tr>
+        <w:tc>
+          <w:tcPr>
+            <w:tcW w:type="dxa" w:w="3456"/>
+            <w:tcBorders>
+              <w:top w:val="single" w:sz="4" w:color="888888"/>
+              <w:left w:val="single" w:sz="4" w:color="888888"/>
+              <w:bottom w:val="single" w:sz="4" w:color="888888"/>
+              <w:right w:val="single" w:sz="4" w:color="888888"/>
+            </w:tcBorders>
+          </w:tcPr>
+          <w:p>
+            <w:r/>
+            <w:r>
+              <w:rPr>
+                <w:rFonts w:ascii="Times New Roman" w:hAnsi="Times New Roman" w:eastAsia="Times New Roman"/>
+                <w:b w:val="0"/>
+                <w:i w:val="0"/>
+                <w:sz w:val="20"/>
+              </w:rPr>
+              <w:t>Name of the Organization</w:t>
+            </w:r>
+          </w:p>
+        </w:tc>
+        <w:tc>
+          <w:tcPr>
+            <w:tcW w:type="dxa" w:w="5904"/>
+            <w:tcBorders>
+              <w:top w:val="single" w:sz="4" w:color="888888"/>
+              <w:left w:val="single" w:sz="4" w:color="888888"/>
+              <w:bottom w:val="single" w:sz="4" w:color="888888"/>
+              <w:right w:val="single" w:sz="4" w:color="888888"/>
+            </w:tcBorders>
+          </w:tcPr>
+          <w:p>
+            <w:r/>
+            <w:r>
+              <w:rPr>
+                <w:rFonts w:ascii="Times New Roman" w:hAnsi="Times New Roman" w:eastAsia="Times New Roman"/>
+                <w:b w:val="0"/>
+                <w:i w:val="0"/>
+                <w:sz w:val="20"/>
+              </w:rPr>
+              <w:t>FairBanks Medical Centre</w:t>
+            </w:r>
+          </w:p>
+        </w:tc>
+      </w:tr>
+      <w:tr>
+        <w:tc>
+          <w:tcPr>
+            <w:tcW w:type="dxa" w:w="3456"/>
+            <w:tcBorders>
+              <w:top w:val="single" w:sz="4" w:color="888888"/>
+              <w:left w:val="single" w:sz="4" w:color="888888"/>
+              <w:bottom w:val="single" w:sz="4" w:color="888888"/>
+              <w:right w:val="single" w:sz="4" w:color="888888"/>
+            </w:tcBorders>
+          </w:tcPr>
+          <w:p>
+            <w:r/>
+            <w:r>
+              <w:rPr>
+                <w:rFonts w:ascii="Times New Roman" w:hAnsi="Times New Roman" w:eastAsia="Times New Roman"/>
+                <w:b w:val="0"/>
+                <w:i w:val="0"/>
+                <w:sz w:val="20"/>
+              </w:rPr>
+              <w:t>Addendum to which the SOI is responding</w:t>
+            </w:r>
+          </w:p>
+        </w:tc>
+        <w:tc>
+          <w:tcPr>
+            <w:tcW w:type="dxa" w:w="5904"/>
+            <w:tcBorders>
+              <w:top w:val="single" w:sz="4" w:color="888888"/>
+              <w:left w:val="single" w:sz="4" w:color="888888"/>
+              <w:bottom w:val="single" w:sz="4" w:color="888888"/>
+              <w:right w:val="single" w:sz="4" w:color="888888"/>
+            </w:tcBorders>
+          </w:tcPr>
+          <w:p>
+            <w:r/>
+            <w:r>
+              <w:rPr>
+                <w:rFonts w:ascii="Times New Roman" w:hAnsi="Times New Roman" w:eastAsia="Times New Roman"/>
+                <w:b w:val="0"/>
+                <w:i w:val="0"/>
+                <w:sz w:val="20"/>
+              </w:rPr>
+              <w:t>Addendum E: Health Foreign Assistance Memorandum of Understanding (MOU) Implementation in Uganda</w:t>
+            </w:r>
+          </w:p>
+        </w:tc>
+      </w:tr>
+      <w:tr>
+        <w:tc>
+          <w:tcPr>
+            <w:tcW w:type="dxa" w:w="3456"/>
+            <w:tcBorders>
+              <w:top w:val="single" w:sz="4" w:color="888888"/>
+              <w:left w:val="single" w:sz="4" w:color="888888"/>
+              <w:bottom w:val="single" w:sz="4" w:color="888888"/>
+              <w:right w:val="single" w:sz="4" w:color="888888"/>
+            </w:tcBorders>
+          </w:tcPr>
+          <w:p>
+            <w:r/>
+            <w:r>
+              <w:rPr>
+                <w:rFonts w:ascii="Times New Roman" w:hAnsi="Times New Roman" w:eastAsia="Times New Roman"/>
+                <w:b w:val="0"/>
+                <w:i w:val="0"/>
+                <w:sz w:val="20"/>
+              </w:rPr>
+              <w:t>Target Benefiting Country</w:t>
+            </w:r>
+          </w:p>
+        </w:tc>
+        <w:tc>
+          <w:tcPr>
+            <w:tcW w:type="dxa" w:w="5904"/>
+            <w:tcBorders>
+              <w:top w:val="single" w:sz="4" w:color="888888"/>
+              <w:left w:val="single" w:sz="4" w:color="888888"/>
+              <w:bottom w:val="single" w:sz="4" w:color="888888"/>
+              <w:right w:val="single" w:sz="4" w:color="888888"/>
+            </w:tcBorders>
+          </w:tcPr>
+          <w:p>
+            <w:r/>
+            <w:r>
+              <w:rPr>
+                <w:rFonts w:ascii="Times New Roman" w:hAnsi="Times New Roman" w:eastAsia="Times New Roman"/>
+                <w:b w:val="0"/>
+                <w:i w:val="0"/>
+                <w:sz w:val="20"/>
+              </w:rPr>
+              <w:t>Uganda</w:t>
+            </w:r>
+          </w:p>
+        </w:tc>
+      </w:tr>
+      <w:tr>
+        <w:tc>
+          <w:tcPr>
+            <w:tcW w:type="dxa" w:w="3456"/>
+            <w:tcBorders>
+              <w:top w:val="single" w:sz="4" w:color="888888"/>
+              <w:left w:val="single" w:sz="4" w:color="888888"/>
+              <w:bottom w:val="single" w:sz="4" w:color="888888"/>
+              <w:right w:val="single" w:sz="4" w:color="888888"/>
+            </w:tcBorders>
+          </w:tcPr>
+          <w:p>
+            <w:r/>
+            <w:r>
+              <w:rPr>
+                <w:rFonts w:ascii="Times New Roman" w:hAnsi="Times New Roman" w:eastAsia="Times New Roman"/>
+                <w:b w:val="0"/>
+                <w:i w:val="0"/>
+                <w:sz w:val="20"/>
+              </w:rPr>
+              <w:t>Total Federal Share Requested</w:t>
+            </w:r>
+          </w:p>
+        </w:tc>
+        <w:tc>
+          <w:tcPr>
+            <w:tcW w:type="dxa" w:w="5904"/>
+            <w:tcBorders>
+              <w:top w:val="single" w:sz="4" w:color="888888"/>
+              <w:left w:val="single" w:sz="4" w:color="888888"/>
+              <w:bottom w:val="single" w:sz="4" w:color="888888"/>
+              <w:right w:val="single" w:sz="4" w:color="888888"/>
+            </w:tcBorders>
+          </w:tcPr>
+          <w:p>
+            <w:r/>
+            <w:r>
+              <w:rPr>
+                <w:rFonts w:ascii="Times New Roman" w:hAnsi="Times New Roman" w:eastAsia="Times New Roman"/>
+                <w:b w:val="0"/>
+                <w:i w:val="0"/>
+                <w:sz w:val="20"/>
+              </w:rPr>
+              <w:t>$1,850,000</w:t>
+            </w:r>
+          </w:p>
+        </w:tc>
+      </w:tr>
+      <w:tr>
+        <w:tc>
+          <w:tcPr>
+            <w:tcW w:type="dxa" w:w="3456"/>
+            <w:tcBorders>
+              <w:top w:val="single" w:sz="4" w:color="888888"/>
+              <w:left w:val="single" w:sz="4" w:color="888888"/>
+              <w:bottom w:val="single" w:sz="4" w:color="888888"/>
+              <w:right w:val="single" w:sz="4" w:color="888888"/>
+            </w:tcBorders>
+          </w:tcPr>
+          <w:p>
+            <w:r/>
+            <w:r>
+              <w:rPr>
+                <w:rFonts w:ascii="Times New Roman" w:hAnsi="Times New Roman" w:eastAsia="Times New Roman"/>
+                <w:b w:val="0"/>
+                <w:i w:val="0"/>
+                <w:sz w:val="20"/>
+              </w:rPr>
+              <w:t>Total Cost Share (as applicable)</w:t>
+            </w:r>
+          </w:p>
+        </w:tc>
+        <w:tc>
+          <w:tcPr>
+            <w:tcW w:type="dxa" w:w="5904"/>
+            <w:tcBorders>
+              <w:top w:val="single" w:sz="4" w:color="888888"/>
+              <w:left w:val="single" w:sz="4" w:color="888888"/>
+              <w:bottom w:val="single" w:sz="4" w:color="888888"/>
+              <w:right w:val="single" w:sz="4" w:color="888888"/>
+            </w:tcBorders>
+          </w:tcPr>
+          <w:p>
+            <w:r/>
+            <w:r>
+              <w:rPr>
+                <w:rFonts w:ascii="Times New Roman" w:hAnsi="Times New Roman" w:eastAsia="Times New Roman"/>
+                <w:b w:val="0"/>
+                <w:i w:val="0"/>
+                <w:sz w:val="20"/>
+              </w:rPr>
+              <w:t>$0 (none proposed at SOI stage)</w:t>
+            </w:r>
+          </w:p>
+        </w:tc>
+      </w:tr>
+      <w:tr>
+        <w:tc>
+          <w:tcPr>
+            <w:tcW w:type="dxa" w:w="3456"/>
+            <w:tcBorders>
+              <w:top w:val="single" w:sz="4" w:color="888888"/>
+              <w:left w:val="single" w:sz="4" w:color="888888"/>
+              <w:bottom w:val="single" w:sz="4" w:color="888888"/>
+              <w:right w:val="single" w:sz="4" w:color="888888"/>
+            </w:tcBorders>
+          </w:tcPr>
+          <w:p>
+            <w:r/>
+            <w:r>
+              <w:rPr>
+                <w:rFonts w:ascii="Times New Roman" w:hAnsi="Times New Roman" w:eastAsia="Times New Roman"/>
+                <w:b w:val="0"/>
+                <w:i w:val="0"/>
+                <w:sz w:val="20"/>
+              </w:rPr>
+              <w:t>Project Length</w:t>
+            </w:r>
+          </w:p>
+        </w:tc>
+        <w:tc>
+          <w:tcPr>
+            <w:tcW w:type="dxa" w:w="5904"/>
+            <w:tcBorders>
+              <w:top w:val="single" w:sz="4" w:color="888888"/>
+              <w:left w:val="single" w:sz="4" w:color="888888"/>
+              <w:bottom w:val="single" w:sz="4" w:color="888888"/>
+              <w:right w:val="single" w:sz="4" w:color="888888"/>
+            </w:tcBorders>
+          </w:tcPr>
+          <w:p>
+            <w:r/>
+            <w:r>
+              <w:rPr>
+                <w:rFonts w:ascii="Times New Roman" w:hAnsi="Times New Roman" w:eastAsia="Times New Roman"/>
+                <w:b w:val="0"/>
+                <w:i w:val="0"/>
+                <w:sz w:val="20"/>
+              </w:rPr>
+              <w:t>36 months</w:t>
+            </w:r>
+          </w:p>
+        </w:tc>
+      </w:tr>
+    </w:tbl>
+    <w:p/>
     <w:p>
       <w:pPr>
-        <w:spacing w:after="160"/>
+        <w:spacing w:before="0" w:after="120" w:line="240" w:lineRule="auto"/>
         <w:jc w:val="center"/>
       </w:pPr>
       <w:r>
         <w:rPr>
-          <w:rFonts w:ascii="Calibri" w:hAnsi="Calibri" w:eastAsia="Calibri"/>
+          <w:rFonts w:ascii="Times New Roman" w:hAnsi="Times New Roman" w:eastAsia="Times New Roman"/>
           <w:b w:val="0"/>
           <w:i/>
-          <w:color w:val="3A4A54"/>
-          <w:sz w:val="16"/>
+          <w:sz w:val="20"/>
         </w:rPr>
-        <w:t>FairBanks — community health ecosystem rooted in Uganda</w:t>
-      </w:r>
-    </w:p>
-    <w:p>
-      <w:pPr>
-        <w:spacing w:after="80"/>
-        <w:jc w:val="center"/>
-      </w:pPr>
-      <w:r>
-        <w:rPr>
-          <w:rFonts w:ascii="Calibri" w:hAnsi="Calibri" w:eastAsia="Calibri"/>
-          <w:b w:val="0"/>
-          <w:i w:val="0"/>
-          <w:color w:val="3A4A54"/>
-          <w:sz w:val="18"/>
-        </w:rPr>
-        <w:t>SOI deadline: 31 July 2026, 5:00 PM EDT  |  Opportunity: DFOP0017890  |  Addendum E — Uganda Health MOU</w:t>
+        <w:t>Opportunity: DFOP0017890  |  Window 2a SOI due 31 July 2026, 5:00 PM EDT  |  This cover table does not count toward the 5-page narrative limit.</w:t>
       </w:r>
     </w:p>
     <w:p>
@@ -160,127 +511,135 @@
     </w:p>
     <w:p>
       <w:pPr>
-        <w:spacing w:before="240" w:after="100"/>
+        <w:spacing w:before="240" w:after="120" w:line="240" w:lineRule="auto"/>
       </w:pPr>
       <w:r>
         <w:rPr>
-          <w:rFonts w:ascii="Calibri" w:hAnsi="Calibri" w:eastAsia="Calibri"/>
+          <w:rFonts w:ascii="Times New Roman" w:hAnsi="Times New Roman" w:eastAsia="Times New Roman"/>
           <w:b/>
           <w:i w:val="0"/>
-          <w:color w:val="0A1F2E"/>
-          <w:sz w:val="32"/>
+          <w:sz w:val="24"/>
         </w:rPr>
-        <w:t>I. The Problem We Address</w:t>
+        <w:t>1. Issue / Challenge / Opportunity</w:t>
       </w:r>
     </w:p>
     <w:p>
       <w:pPr>
-        <w:spacing w:after="120"/>
+        <w:spacing w:before="0" w:after="120" w:line="240" w:lineRule="auto"/>
         <w:jc w:val="left"/>
       </w:pPr>
       <w:r>
         <w:rPr>
-          <w:rFonts w:ascii="Calibri" w:hAnsi="Calibri" w:eastAsia="Calibri"/>
+          <w:rFonts w:ascii="Times New Roman" w:hAnsi="Times New Roman" w:eastAsia="Times New Roman"/>
           <w:b w:val="0"/>
           <w:i w:val="0"/>
-          <w:color w:val="1E2F38"/>
-          <w:sz w:val="20"/>
+          <w:sz w:val="24"/>
         </w:rPr>
         <w:t>Uganda's five-year health transition (April 2026-December 2030) asks facilities, districts, and communities to keep HIV, TB, malaria, maternal and child health, immunisation, and outbreak services strong while shifting toward government-led, performance-based programming. That shift only works if decision-makers see what is happening at the last mile - not weeks later in paper registers.</w:t>
       </w:r>
     </w:p>
     <w:p>
       <w:pPr>
-        <w:spacing w:after="120"/>
+        <w:spacing w:before="0" w:after="120" w:line="240" w:lineRule="auto"/>
         <w:jc w:val="left"/>
       </w:pPr>
       <w:r>
         <w:rPr>
-          <w:rFonts w:ascii="Calibri" w:hAnsi="Calibri" w:eastAsia="Calibri"/>
+          <w:rFonts w:ascii="Times New Roman" w:hAnsi="Times New Roman" w:eastAsia="Times New Roman"/>
           <w:b w:val="0"/>
           <w:i w:val="0"/>
-          <w:color w:val="1E2F38"/>
-          <w:sz w:val="20"/>
+          <w:sz w:val="24"/>
         </w:rPr>
-        <w:t>Community Health Workers and Village Health Teams already walk households and refer patients. Too often their work never reaches eCHIS, DHIS2, facility EMRs, or district dashboards in a usable form. National digital systems then miss early fever clusters, missed antenatal visits, immunisation gaps, and stock pressure. The result is reactive care, weak accountability, and higher risk that transition gains reverse.</w:t>
+        <w:t>Community Health Workers and Village Health Teams already walk households and refer patients. Too often their work never reaches eCHIS, facility EMRs, DHIS2/eIDSR, or the National Data Warehouse in a usable form. National digital systems then miss early fever clusters, missed antenatal visits, immunisation gaps, and stock pressure. The result is reactive care, weak accountability, and higher risk that transition gains reverse.</w:t>
       </w:r>
     </w:p>
     <w:p>
       <w:pPr>
-        <w:spacing w:before="240" w:after="100"/>
+        <w:spacing w:before="0" w:after="120" w:line="240" w:lineRule="auto"/>
+        <w:jc w:val="left"/>
       </w:pPr>
       <w:r>
         <w:rPr>
-          <w:rFonts w:ascii="Calibri" w:hAnsi="Calibri" w:eastAsia="Calibri"/>
-          <w:b/>
+          <w:rFonts w:ascii="Times New Roman" w:hAnsi="Times New Roman" w:eastAsia="Times New Roman"/>
+          <w:b w:val="0"/>
           <w:i w:val="0"/>
-          <w:color w:val="0A1F2E"/>
-          <w:sz w:val="32"/>
+          <w:sz w:val="24"/>
         </w:rPr>
-        <w:t>II. Statement of Interest</w:t>
+        <w:t>The opportunity is clear: bridge last-mile community data into Uganda's approved National Digital Health Architecture (NDHA) so Ministry of Health (MoH) systems become more complete, more actionable, and progressively owned by Government of Uganda (GOU) institutions - without building a parallel silo.</w:t>
       </w:r>
     </w:p>
     <w:p>
       <w:pPr>
-        <w:spacing w:after="120"/>
+        <w:spacing w:before="240" w:after="120" w:line="240" w:lineRule="auto"/>
+      </w:pPr>
+      <w:r>
+        <w:rPr>
+          <w:rFonts w:ascii="Times New Roman" w:hAnsi="Times New Roman" w:eastAsia="Times New Roman"/>
+          <w:b/>
+          <w:i w:val="0"/>
+          <w:sz w:val="24"/>
+        </w:rPr>
+        <w:t>2. Proposed Solution / Activities</w:t>
+      </w:r>
+    </w:p>
+    <w:p>
+      <w:pPr>
+        <w:spacing w:before="0" w:after="120" w:line="240" w:lineRule="auto"/>
         <w:jc w:val="left"/>
       </w:pPr>
       <w:r>
         <w:rPr>
-          <w:rFonts w:ascii="Calibri" w:hAnsi="Calibri" w:eastAsia="Calibri"/>
+          <w:rFonts w:ascii="Times New Roman" w:hAnsi="Times New Roman" w:eastAsia="Times New Roman"/>
           <w:b w:val="0"/>
           <w:i w:val="0"/>
-          <w:color w:val="1E2F38"/>
-          <w:sz w:val="20"/>
+          <w:sz w:val="24"/>
         </w:rPr>
-        <w:t>FairBanks Medical Centre and FairBanks Community Reach respectfully submit this Statement of Interest under Track 2, Objective 4 of the Uganda MOU Implementation Addendum: strengthen and scale digital health systems with full interoperability, government ownership, and sustainable operations.</w:t>
+        <w:t>FairBanks Medical Centre and FairBanks Community Reach respectfully submit this Statement of Interest under Track 2, Objective 4 of Addendum E: strengthen and scale interoperable, fit-for-purpose digital health systems with progressive GOU responsibility and sustainable operations.</w:t>
       </w:r>
     </w:p>
     <w:p>
       <w:pPr>
-        <w:spacing w:after="120"/>
+        <w:spacing w:before="0" w:after="120" w:line="240" w:lineRule="auto"/>
         <w:jc w:val="left"/>
       </w:pPr>
       <w:r>
         <w:rPr>
-          <w:rFonts w:ascii="Calibri" w:hAnsi="Calibri" w:eastAsia="Calibri"/>
+          <w:rFonts w:ascii="Times New Roman" w:hAnsi="Times New Roman" w:eastAsia="Times New Roman"/>
           <w:b w:val="0"/>
           <w:i w:val="0"/>
-          <w:color w:val="1E2F38"/>
-          <w:sz w:val="20"/>
+          <w:sz w:val="24"/>
         </w:rPr>
-        <w:t>We propose to pilot and then transfer a community-to-facility intelligence layer - the FairBanks Community Health Intelligence Platform (FCHIP) - that captures CHW/VHT household and visit data offline, syncs securely, maps indicators to national reporting elements, and feeds facility and district action. FCHIP is not a parallel silo. It is a bridge that makes Uganda's existing digital stack (eCHIS, DHIS2, facility EMRs, and related national platforms) more complete at community level and more useful for prevention.</w:t>
+        <w:t>We propose to pilot and then transfer a community-to-facility intelligence layer - the FairBanks Community Health Intelligence Platform (FCHIP) - that captures CHW/VHT household and visit data offline, syncs securely, maps indicators to national reporting elements, and feeds facility and district action. FCHIP is not a parallel national system. It is a bridge that makes Uganda's existing digital stack more complete at community level and more useful for prevention.</w:t>
       </w:r>
     </w:p>
     <w:p>
       <w:pPr>
-        <w:spacing w:before="240" w:after="100"/>
+        <w:spacing w:before="0" w:after="120" w:line="240" w:lineRule="auto"/>
+        <w:jc w:val="left"/>
       </w:pPr>
       <w:r>
         <w:rPr>
-          <w:rFonts w:ascii="Calibri" w:hAnsi="Calibri" w:eastAsia="Calibri"/>
-          <w:b/>
+          <w:rFonts w:ascii="Times New Roman" w:hAnsi="Times New Roman" w:eastAsia="Times New Roman"/>
+          <w:b w:val="0"/>
           <w:i w:val="0"/>
-          <w:color w:val="0A1F2E"/>
-          <w:sz w:val="32"/>
+          <w:sz w:val="24"/>
         </w:rPr>
-        <w:t>III. Win-Win Value Proposition</w:t>
+        <w:t>Primary subsystem focus (permitted under Objective 4): eCHIS-aligned household/visit capture; facility EMR encounter and referral handoff (eAfya/ClinicMaster pathways as available in the catchment); DHIS2 aggregate reporting and eIDSR surveillance signals; readiness feeds toward the National Data Warehouse; and iHRIS-aware CHW/VHT workforce directories where schemas allow. Design aligns with NDHA and OpenHIE-consistent interoperability (API-first, standards-aware exports), under MoH digital health authority.</w:t>
       </w:r>
     </w:p>
     <w:p>
       <w:pPr>
-        <w:spacing w:after="120"/>
+        <w:spacing w:before="0" w:after="120" w:line="240" w:lineRule="auto"/>
         <w:jc w:val="left"/>
       </w:pPr>
       <w:r>
         <w:rPr>
-          <w:rFonts w:ascii="Calibri" w:hAnsi="Calibri" w:eastAsia="Calibri"/>
+          <w:rFonts w:ascii="Times New Roman" w:hAnsi="Times New Roman" w:eastAsia="Times New Roman"/>
           <w:b w:val="0"/>
           <w:i/>
-          <w:color w:val="1E2F38"/>
-          <w:sz w:val="20"/>
+          <w:sz w:val="24"/>
         </w:rPr>
-        <w:t>This partnership is designed so each party gains something durable - not a one-sided software purchase.</w:t>
+        <w:t>This partnership is designed as a durable win-win: each party gains something lasting, and no party depends forever on a private tool outside GOU systems.</w:t>
       </w:r>
     </w:p>
     <w:tbl>
@@ -290,30 +649,29 @@
         <w:tblLook w:firstColumn="1" w:firstRow="1" w:lastColumn="0" w:lastRow="0" w:noHBand="0" w:noVBand="1" w:val="04A0"/>
       </w:tblPr>
       <w:tblGrid>
-        <w:gridCol w:w="4968"/>
-        <w:gridCol w:w="4968"/>
+        <w:gridCol w:w="4680"/>
+        <w:gridCol w:w="4680"/>
       </w:tblGrid>
       <w:tr>
         <w:tc>
           <w:tcPr>
-            <w:tcW w:type="dxa" w:w="3024"/>
-            <w:shd w:fill="0D6E6E"/>
+            <w:tcW w:type="dxa" w:w="2880"/>
+            <w:shd w:fill="E8EEEE"/>
             <w:tcBorders>
-              <w:top w:val="single" w:sz="8" w:color="0D6E6E"/>
-              <w:left w:val="single" w:sz="8" w:color="0D6E6E"/>
-              <w:bottom w:val="single" w:sz="8" w:color="0D6E6E"/>
-              <w:right w:val="single" w:sz="8" w:color="0D6E6E"/>
+              <w:top w:val="single" w:sz="4" w:color="888888"/>
+              <w:left w:val="single" w:sz="4" w:color="888888"/>
+              <w:bottom w:val="single" w:sz="4" w:color="888888"/>
+              <w:right w:val="single" w:sz="4" w:color="888888"/>
             </w:tcBorders>
           </w:tcPr>
           <w:p>
             <w:r/>
             <w:r>
               <w:rPr>
-                <w:rFonts w:ascii="Calibri" w:hAnsi="Calibri" w:eastAsia="Calibri"/>
+                <w:rFonts w:ascii="Times New Roman" w:hAnsi="Times New Roman" w:eastAsia="Times New Roman"/>
                 <w:b/>
                 <w:i w:val="0"/>
-                <w:color w:val="FFFFFF"/>
-                <w:sz w:val="18"/>
+                <w:sz w:val="20"/>
               </w:rPr>
               <w:t>Who gains</w:t>
             </w:r>
@@ -322,23 +680,22 @@
         <w:tc>
           <w:tcPr>
             <w:tcW w:type="dxa" w:w="6480"/>
-            <w:shd w:fill="0D6E6E"/>
+            <w:shd w:fill="E8EEEE"/>
             <w:tcBorders>
-              <w:top w:val="single" w:sz="8" w:color="0D6E6E"/>
-              <w:left w:val="single" w:sz="8" w:color="0D6E6E"/>
-              <w:bottom w:val="single" w:sz="8" w:color="0D6E6E"/>
-              <w:right w:val="single" w:sz="8" w:color="0D6E6E"/>
+              <w:top w:val="single" w:sz="4" w:color="888888"/>
+              <w:left w:val="single" w:sz="4" w:color="888888"/>
+              <w:bottom w:val="single" w:sz="4" w:color="888888"/>
+              <w:right w:val="single" w:sz="4" w:color="888888"/>
             </w:tcBorders>
           </w:tcPr>
           <w:p>
             <w:r/>
             <w:r>
               <w:rPr>
-                <w:rFonts w:ascii="Calibri" w:hAnsi="Calibri" w:eastAsia="Calibri"/>
+                <w:rFonts w:ascii="Times New Roman" w:hAnsi="Times New Roman" w:eastAsia="Times New Roman"/>
                 <w:b/>
                 <w:i w:val="0"/>
-                <w:color w:val="FFFFFF"/>
-                <w:sz w:val="18"/>
+                <w:sz w:val="20"/>
               </w:rPr>
               <w:t>What they gain</w:t>
             </w:r>
@@ -348,23 +705,22 @@
       <w:tr>
         <w:tc>
           <w:tcPr>
-            <w:tcW w:type="dxa" w:w="3024"/>
+            <w:tcW w:type="dxa" w:w="2880"/>
             <w:tcBorders>
-              <w:top w:val="single" w:sz="8" w:color="D0DCDC"/>
-              <w:left w:val="single" w:sz="8" w:color="D0DCDC"/>
-              <w:bottom w:val="single" w:sz="8" w:color="D0DCDC"/>
-              <w:right w:val="single" w:sz="8" w:color="D0DCDC"/>
+              <w:top w:val="single" w:sz="4" w:color="888888"/>
+              <w:left w:val="single" w:sz="4" w:color="888888"/>
+              <w:bottom w:val="single" w:sz="4" w:color="888888"/>
+              <w:right w:val="single" w:sz="4" w:color="888888"/>
             </w:tcBorders>
           </w:tcPr>
           <w:p>
             <w:r/>
             <w:r>
               <w:rPr>
-                <w:rFonts w:ascii="Calibri" w:hAnsi="Calibri" w:eastAsia="Calibri"/>
+                <w:rFonts w:ascii="Times New Roman" w:hAnsi="Times New Roman" w:eastAsia="Times New Roman"/>
                 <w:b w:val="0"/>
                 <w:i w:val="0"/>
-                <w:color w:val="1E2F38"/>
-                <w:sz w:val="18"/>
+                <w:sz w:val="20"/>
               </w:rPr>
               <w:t>Uganda / Ministry of Health</w:t>
             </w:r>
@@ -374,23 +730,22 @@
           <w:tcPr>
             <w:tcW w:type="dxa" w:w="6480"/>
             <w:tcBorders>
-              <w:top w:val="single" w:sz="8" w:color="D0DCDC"/>
-              <w:left w:val="single" w:sz="8" w:color="D0DCDC"/>
-              <w:bottom w:val="single" w:sz="8" w:color="D0DCDC"/>
-              <w:right w:val="single" w:sz="8" w:color="D0DCDC"/>
+              <w:top w:val="single" w:sz="4" w:color="888888"/>
+              <w:left w:val="single" w:sz="4" w:color="888888"/>
+              <w:bottom w:val="single" w:sz="4" w:color="888888"/>
+              <w:right w:val="single" w:sz="4" w:color="888888"/>
             </w:tcBorders>
           </w:tcPr>
           <w:p>
             <w:r/>
             <w:r>
               <w:rPr>
-                <w:rFonts w:ascii="Calibri" w:hAnsi="Calibri" w:eastAsia="Calibri"/>
+                <w:rFonts w:ascii="Times New Roman" w:hAnsi="Times New Roman" w:eastAsia="Times New Roman"/>
                 <w:b w:val="0"/>
                 <w:i w:val="0"/>
-                <w:color w:val="1E2F38"/>
-                <w:sz w:val="18"/>
+                <w:sz w:val="20"/>
               </w:rPr>
-              <w:t>Richer last-mile data into eCHIS and DHIS2; clearer referral closure; documented handoff pathways toward government ownership and reduced dependence on parallel partner tools.</w:t>
+              <w:t>Richer last-mile data into eCHIS, DHIS2/eIDSR, and related national platforms; clearer referral closure; documented handoff of staffing and recurrent costs toward GOU ownership by project close.</w:t>
             </w:r>
           </w:p>
         </w:tc>
@@ -398,24 +753,22 @@
       <w:tr>
         <w:tc>
           <w:tcPr>
-            <w:tcW w:type="dxa" w:w="3024"/>
-            <w:shd w:fill="F7F5F0"/>
+            <w:tcW w:type="dxa" w:w="2880"/>
             <w:tcBorders>
-              <w:top w:val="single" w:sz="8" w:color="D0DCDC"/>
-              <w:left w:val="single" w:sz="8" w:color="D0DCDC"/>
-              <w:bottom w:val="single" w:sz="8" w:color="D0DCDC"/>
-              <w:right w:val="single" w:sz="8" w:color="D0DCDC"/>
+              <w:top w:val="single" w:sz="4" w:color="888888"/>
+              <w:left w:val="single" w:sz="4" w:color="888888"/>
+              <w:bottom w:val="single" w:sz="4" w:color="888888"/>
+              <w:right w:val="single" w:sz="4" w:color="888888"/>
             </w:tcBorders>
           </w:tcPr>
           <w:p>
             <w:r/>
             <w:r>
               <w:rPr>
-                <w:rFonts w:ascii="Calibri" w:hAnsi="Calibri" w:eastAsia="Calibri"/>
+                <w:rFonts w:ascii="Times New Roman" w:hAnsi="Times New Roman" w:eastAsia="Times New Roman"/>
                 <w:b w:val="0"/>
                 <w:i w:val="0"/>
-                <w:color w:val="1E2F38"/>
-                <w:sz w:val="18"/>
+                <w:sz w:val="20"/>
               </w:rPr>
               <w:t>U.S. Department of State / GHSD</w:t>
             </w:r>
@@ -424,25 +777,23 @@
         <w:tc>
           <w:tcPr>
             <w:tcW w:type="dxa" w:w="6480"/>
-            <w:shd w:fill="F7F5F0"/>
             <w:tcBorders>
-              <w:top w:val="single" w:sz="8" w:color="D0DCDC"/>
-              <w:left w:val="single" w:sz="8" w:color="D0DCDC"/>
-              <w:bottom w:val="single" w:sz="8" w:color="D0DCDC"/>
-              <w:right w:val="single" w:sz="8" w:color="D0DCDC"/>
+              <w:top w:val="single" w:sz="4" w:color="888888"/>
+              <w:left w:val="single" w:sz="4" w:color="888888"/>
+              <w:bottom w:val="single" w:sz="4" w:color="888888"/>
+              <w:right w:val="single" w:sz="4" w:color="888888"/>
             </w:tcBorders>
           </w:tcPr>
           <w:p>
             <w:r/>
             <w:r>
               <w:rPr>
-                <w:rFonts w:ascii="Calibri" w:hAnsi="Calibri" w:eastAsia="Calibri"/>
+                <w:rFonts w:ascii="Times New Roman" w:hAnsi="Times New Roman" w:eastAsia="Times New Roman"/>
                 <w:b w:val="0"/>
                 <w:i w:val="0"/>
-                <w:color w:val="1E2F38"/>
-                <w:sz w:val="18"/>
+                <w:sz w:val="20"/>
               </w:rPr>
-              <w:t>A Ugandan implementer with a live clinic and community network that protects essential services while proving interoperable digital scale-up under the MOU - accountable, measurable, and transferable.</w:t>
+              <w:t>A Ugandan implementer with a live clinic and community network that protects essential services while proving interoperable digital scale-up under the MOU - accountable, measurable, and transferable - advancing U.S. interests in health security and country self-reliance.</w:t>
             </w:r>
           </w:p>
         </w:tc>
@@ -450,23 +801,22 @@
       <w:tr>
         <w:tc>
           <w:tcPr>
-            <w:tcW w:type="dxa" w:w="3024"/>
+            <w:tcW w:type="dxa" w:w="2880"/>
             <w:tcBorders>
-              <w:top w:val="single" w:sz="8" w:color="D0DCDC"/>
-              <w:left w:val="single" w:sz="8" w:color="D0DCDC"/>
-              <w:bottom w:val="single" w:sz="8" w:color="D0DCDC"/>
-              <w:right w:val="single" w:sz="8" w:color="D0DCDC"/>
+              <w:top w:val="single" w:sz="4" w:color="888888"/>
+              <w:left w:val="single" w:sz="4" w:color="888888"/>
+              <w:bottom w:val="single" w:sz="4" w:color="888888"/>
+              <w:right w:val="single" w:sz="4" w:color="888888"/>
             </w:tcBorders>
           </w:tcPr>
           <w:p>
             <w:r/>
             <w:r>
               <w:rPr>
-                <w:rFonts w:ascii="Calibri" w:hAnsi="Calibri" w:eastAsia="Calibri"/>
+                <w:rFonts w:ascii="Times New Roman" w:hAnsi="Times New Roman" w:eastAsia="Times New Roman"/>
                 <w:b w:val="0"/>
                 <w:i w:val="0"/>
-                <w:color w:val="1E2F38"/>
-                <w:sz w:val="18"/>
+                <w:sz w:val="20"/>
               </w:rPr>
               <w:t>Districts &amp; facilities</w:t>
             </w:r>
@@ -476,23 +826,22 @@
           <w:tcPr>
             <w:tcW w:type="dxa" w:w="6480"/>
             <w:tcBorders>
-              <w:top w:val="single" w:sz="8" w:color="D0DCDC"/>
-              <w:left w:val="single" w:sz="8" w:color="D0DCDC"/>
-              <w:bottom w:val="single" w:sz="8" w:color="D0DCDC"/>
-              <w:right w:val="single" w:sz="8" w:color="D0DCDC"/>
+              <w:top w:val="single" w:sz="4" w:color="888888"/>
+              <w:left w:val="single" w:sz="4" w:color="888888"/>
+              <w:bottom w:val="single" w:sz="4" w:color="888888"/>
+              <w:right w:val="single" w:sz="4" w:color="888888"/>
             </w:tcBorders>
           </w:tcPr>
           <w:p>
             <w:r/>
             <w:r>
               <w:rPr>
-                <w:rFonts w:ascii="Calibri" w:hAnsi="Calibri" w:eastAsia="Calibri"/>
+                <w:rFonts w:ascii="Times New Roman" w:hAnsi="Times New Roman" w:eastAsia="Times New Roman"/>
                 <w:b w:val="0"/>
                 <w:i w:val="0"/>
-                <w:color w:val="1E2F38"/>
-                <w:sz w:val="18"/>
+                <w:sz w:val="20"/>
               </w:rPr>
-              <w:t>Dashboards for outreach targeting, referral follow-up, and programme monitoring; GIS hotspot views that support planning without waiting for outbreaks to arrive at the ward.</w:t>
+              <w:t>Dashboards for outreach targeting, referral follow-up, and programme monitoring; GIS hotspot views that support planning before outbreaks arrive at the ward.</w:t>
             </w:r>
           </w:p>
         </w:tc>
@@ -500,24 +849,22 @@
       <w:tr>
         <w:tc>
           <w:tcPr>
-            <w:tcW w:type="dxa" w:w="3024"/>
-            <w:shd w:fill="F7F5F0"/>
+            <w:tcW w:type="dxa" w:w="2880"/>
             <w:tcBorders>
-              <w:top w:val="single" w:sz="8" w:color="D0DCDC"/>
-              <w:left w:val="single" w:sz="8" w:color="D0DCDC"/>
-              <w:bottom w:val="single" w:sz="8" w:color="D0DCDC"/>
-              <w:right w:val="single" w:sz="8" w:color="D0DCDC"/>
+              <w:top w:val="single" w:sz="4" w:color="888888"/>
+              <w:left w:val="single" w:sz="4" w:color="888888"/>
+              <w:bottom w:val="single" w:sz="4" w:color="888888"/>
+              <w:right w:val="single" w:sz="4" w:color="888888"/>
             </w:tcBorders>
           </w:tcPr>
           <w:p>
             <w:r/>
             <w:r>
               <w:rPr>
-                <w:rFonts w:ascii="Calibri" w:hAnsi="Calibri" w:eastAsia="Calibri"/>
+                <w:rFonts w:ascii="Times New Roman" w:hAnsi="Times New Roman" w:eastAsia="Times New Roman"/>
                 <w:b w:val="0"/>
                 <w:i w:val="0"/>
-                <w:color w:val="1E2F38"/>
-                <w:sz w:val="18"/>
+                <w:sz w:val="20"/>
               </w:rPr>
               <w:t>Communities &amp; CHWs/VHTs</w:t>
             </w:r>
@@ -526,23 +873,21 @@
         <w:tc>
           <w:tcPr>
             <w:tcW w:type="dxa" w:w="6480"/>
-            <w:shd w:fill="F7F5F0"/>
             <w:tcBorders>
-              <w:top w:val="single" w:sz="8" w:color="D0DCDC"/>
-              <w:left w:val="single" w:sz="8" w:color="D0DCDC"/>
-              <w:bottom w:val="single" w:sz="8" w:color="D0DCDC"/>
-              <w:right w:val="single" w:sz="8" w:color="D0DCDC"/>
+              <w:top w:val="single" w:sz="4" w:color="888888"/>
+              <w:left w:val="single" w:sz="4" w:color="888888"/>
+              <w:bottom w:val="single" w:sz="4" w:color="888888"/>
+              <w:right w:val="single" w:sz="4" w:color="888888"/>
             </w:tcBorders>
           </w:tcPr>
           <w:p>
             <w:r/>
             <w:r>
               <w:rPr>
-                <w:rFonts w:ascii="Calibri" w:hAnsi="Calibri" w:eastAsia="Calibri"/>
+                <w:rFonts w:ascii="Times New Roman" w:hAnsi="Times New Roman" w:eastAsia="Times New Roman"/>
                 <w:b w:val="0"/>
                 <w:i w:val="0"/>
-                <w:color w:val="1E2F38"/>
-                <w:sz w:val="18"/>
+                <w:sz w:val="20"/>
               </w:rPr>
               <w:t>Simple offline tools, faster support from the medical centre, and care that reaches mothers, children, older persons, and people with chronic conditions before crises.</w:t>
             </w:r>
@@ -552,23 +897,22 @@
       <w:tr>
         <w:tc>
           <w:tcPr>
-            <w:tcW w:type="dxa" w:w="3024"/>
+            <w:tcW w:type="dxa" w:w="2880"/>
             <w:tcBorders>
-              <w:top w:val="single" w:sz="8" w:color="D0DCDC"/>
-              <w:left w:val="single" w:sz="8" w:color="D0DCDC"/>
-              <w:bottom w:val="single" w:sz="8" w:color="D0DCDC"/>
-              <w:right w:val="single" w:sz="8" w:color="D0DCDC"/>
+              <w:top w:val="single" w:sz="4" w:color="888888"/>
+              <w:left w:val="single" w:sz="4" w:color="888888"/>
+              <w:bottom w:val="single" w:sz="4" w:color="888888"/>
+              <w:right w:val="single" w:sz="4" w:color="888888"/>
             </w:tcBorders>
           </w:tcPr>
           <w:p>
             <w:r/>
             <w:r>
               <w:rPr>
-                <w:rFonts w:ascii="Calibri" w:hAnsi="Calibri" w:eastAsia="Calibri"/>
+                <w:rFonts w:ascii="Times New Roman" w:hAnsi="Times New Roman" w:eastAsia="Times New Roman"/>
                 <w:b w:val="0"/>
                 <w:i w:val="0"/>
-                <w:color w:val="1E2F38"/>
-                <w:sz w:val="18"/>
+                <w:sz w:val="20"/>
               </w:rPr>
               <w:t>FairBanks / FCHIP</w:t>
             </w:r>
@@ -578,21 +922,20 @@
           <w:tcPr>
             <w:tcW w:type="dxa" w:w="6480"/>
             <w:tcBorders>
-              <w:top w:val="single" w:sz="8" w:color="D0DCDC"/>
-              <w:left w:val="single" w:sz="8" w:color="D0DCDC"/>
-              <w:bottom w:val="single" w:sz="8" w:color="D0DCDC"/>
-              <w:right w:val="single" w:sz="8" w:color="D0DCDC"/>
+              <w:top w:val="single" w:sz="4" w:color="888888"/>
+              <w:left w:val="single" w:sz="4" w:color="888888"/>
+              <w:bottom w:val="single" w:sz="4" w:color="888888"/>
+              <w:right w:val="single" w:sz="4" w:color="888888"/>
             </w:tcBorders>
           </w:tcPr>
           <w:p>
             <w:r/>
             <w:r>
               <w:rPr>
-                <w:rFonts w:ascii="Calibri" w:hAnsi="Calibri" w:eastAsia="Calibri"/>
+                <w:rFonts w:ascii="Times New Roman" w:hAnsi="Times New Roman" w:eastAsia="Times New Roman"/>
                 <w:b w:val="0"/>
                 <w:i w:val="0"/>
-                <w:color w:val="1E2F38"/>
-                <w:sz w:val="18"/>
+                <w:sz w:val="20"/>
               </w:rPr>
               <w:t>Room to refine and document a production-grade interoperability model inside a real catchment - then share specifications, training packages, and transfer plans with MoH-aligned partners.</w:t>
             </w:r>
@@ -603,194 +946,920 @@
     <w:p/>
     <w:p>
       <w:pPr>
-        <w:spacing w:before="240" w:after="100"/>
+        <w:spacing w:before="0" w:after="80" w:line="240" w:lineRule="auto"/>
+        <w:jc w:val="left"/>
       </w:pPr>
       <w:r>
         <w:rPr>
-          <w:rFonts w:ascii="Calibri" w:hAnsi="Calibri" w:eastAsia="Calibri"/>
+          <w:rFonts w:ascii="Times New Roman" w:hAnsi="Times New Roman" w:eastAsia="Times New Roman"/>
           <w:b/>
           <w:i w:val="0"/>
-          <w:color w:val="0A1F2E"/>
-          <w:sz w:val="32"/>
+          <w:sz w:val="24"/>
         </w:rPr>
-        <w:t>IV. Proposed Objectives (Objective 4)</w:t>
+        <w:t>Core activities:</w:t>
       </w:r>
     </w:p>
     <w:p>
       <w:pPr>
         <w:pStyle w:val="ListBullet"/>
-        <w:spacing w:after="40"/>
+        <w:spacing w:after="60" w:line="240" w:lineRule="auto"/>
       </w:pPr>
       <w:r>
         <w:rPr>
-          <w:rFonts w:ascii="Calibri" w:hAnsi="Calibri" w:eastAsia="Calibri"/>
+          <w:rFonts w:ascii="Times New Roman" w:hAnsi="Times New Roman" w:eastAsia="Times New Roman"/>
           <w:b w:val="0"/>
           <w:i w:val="0"/>
-          <w:color w:val="1E2F38"/>
-          <w:sz w:val="20"/>
+          <w:sz w:val="24"/>
         </w:rPr>
-        <w:t>O1. Deploy offline-capable CHW/VHT capture aligned with eCHIS household and visit concepts across FairBanks Community Reach catchments.</w:t>
+        <w:t>A1. Deploy offline-capable CHW/VHT capture aligned with eCHIS household and visit concepts across FairBanks Community Reach catchments.</w:t>
       </w:r>
     </w:p>
     <w:p>
       <w:pPr>
         <w:pStyle w:val="ListBullet"/>
-        <w:spacing w:after="40"/>
+        <w:spacing w:after="60" w:line="240" w:lineRule="auto"/>
       </w:pPr>
       <w:r>
         <w:rPr>
-          <w:rFonts w:ascii="Calibri" w:hAnsi="Calibri" w:eastAsia="Calibri"/>
+          <w:rFonts w:ascii="Times New Roman" w:hAnsi="Times New Roman" w:eastAsia="Times New Roman"/>
           <w:b w:val="0"/>
           <w:i w:val="0"/>
-          <w:color w:val="1E2F38"/>
-          <w:sz w:val="20"/>
+          <w:sz w:val="24"/>
         </w:rPr>
-        <w:t>O2. Establish a secure sync and role-based access pipeline linking community records to FairBanks Medical Centre workflows and authorised district viewers.</w:t>
+        <w:t>A2. Establish a secure sync and role-based access pipeline linking community records to FairBanks Medical Centre workflows and authorised district viewers, consistent with Uganda data-protection and cybersecurity expectations.</w:t>
       </w:r>
     </w:p>
     <w:p>
       <w:pPr>
         <w:pStyle w:val="ListBullet"/>
-        <w:spacing w:after="40"/>
+        <w:spacing w:after="60" w:line="240" w:lineRule="auto"/>
       </w:pPr>
       <w:r>
         <w:rPr>
-          <w:rFonts w:ascii="Calibri" w:hAnsi="Calibri" w:eastAsia="Calibri"/>
+          <w:rFonts w:ascii="Times New Roman" w:hAnsi="Times New Roman" w:eastAsia="Times New Roman"/>
           <w:b w:val="0"/>
           <w:i w:val="0"/>
-          <w:color w:val="1E2F38"/>
-          <w:sz w:val="20"/>
+          <w:sz w:val="24"/>
         </w:rPr>
-        <w:t>O3. Map community indicators to DHIS2 reporting elements and demonstrate aggregate submission pathways for MNCH, immunisation, NCD screening, and disease surveillance signals.</w:t>
+        <w:t>A3. Map community indicators to DHIS2 reporting elements and demonstrate aggregate submission pathways for MNCH, immunisation, NCD screening, and disease surveillance signals (including eIDSR-relevant alerts).</w:t>
       </w:r>
     </w:p>
     <w:p>
       <w:pPr>
         <w:pStyle w:val="ListBullet"/>
-        <w:spacing w:after="40"/>
+        <w:spacing w:after="60" w:line="240" w:lineRule="auto"/>
       </w:pPr>
       <w:r>
         <w:rPr>
-          <w:rFonts w:ascii="Calibri" w:hAnsi="Calibri" w:eastAsia="Calibri"/>
+          <w:rFonts w:ascii="Times New Roman" w:hAnsi="Times New Roman" w:eastAsia="Times New Roman"/>
           <w:b w:val="0"/>
           <w:i w:val="0"/>
-          <w:color w:val="1E2F38"/>
-          <w:sz w:val="20"/>
+          <w:sz w:val="24"/>
         </w:rPr>
-        <w:t>O4. Deliver facility and programme dashboards plus GIS hotspot views that trigger outreach, referrals, and supply planning actions.</w:t>
+        <w:t>A4. Deliver facility and programme dashboards plus GIS hotspot views that trigger outreach, referrals, and supply planning actions.</w:t>
       </w:r>
     </w:p>
     <w:p>
       <w:pPr>
         <w:pStyle w:val="ListBullet"/>
-        <w:spacing w:after="40"/>
+        <w:spacing w:after="60" w:line="240" w:lineRule="auto"/>
       </w:pPr>
       <w:r>
         <w:rPr>
-          <w:rFonts w:ascii="Calibri" w:hAnsi="Calibri" w:eastAsia="Calibri"/>
+          <w:rFonts w:ascii="Times New Roman" w:hAnsi="Times New Roman" w:eastAsia="Times New Roman"/>
           <w:b w:val="0"/>
           <w:i w:val="0"/>
-          <w:color w:val="1E2F38"/>
-          <w:sz w:val="20"/>
+          <w:sz w:val="24"/>
         </w:rPr>
-        <w:t>O5. Produce interoperability specifications, data-governance protocols, training curricula, and a staged government-ownership transition plan suitable for full-proposal detailed design.</w:t>
+        <w:t>A5. Produce interoperability specifications, data-governance protocols, training curricula, and a staged GOU-ownership transition plan (staffing and recurrent operating costs) suitable for full-proposal detailed design.</w:t>
       </w:r>
     </w:p>
     <w:p>
       <w:pPr>
-        <w:spacing w:before="240" w:after="100"/>
+        <w:spacing w:before="120" w:after="80" w:line="240" w:lineRule="auto"/>
+        <w:jc w:val="left"/>
       </w:pPr>
       <w:r>
         <w:rPr>
-          <w:rFonts w:ascii="Calibri" w:hAnsi="Calibri" w:eastAsia="Calibri"/>
+          <w:rFonts w:ascii="Times New Roman" w:hAnsi="Times New Roman" w:eastAsia="Times New Roman"/>
           <w:b/>
           <w:i w:val="0"/>
-          <w:color w:val="0A1F2E"/>
-          <w:sz w:val="32"/>
+          <w:sz w:val="24"/>
         </w:rPr>
-        <w:t>V. Project Approach</w:t>
+        <w:t>Project approach:</w:t>
       </w:r>
     </w:p>
     <w:p>
       <w:pPr>
-        <w:spacing w:after="100"/>
+        <w:spacing w:before="0" w:after="100" w:line="240" w:lineRule="auto"/>
         <w:jc w:val="left"/>
       </w:pPr>
       <w:r>
         <w:rPr>
-          <w:rFonts w:ascii="Calibri" w:hAnsi="Calibri" w:eastAsia="Calibri"/>
+          <w:rFonts w:ascii="Times New Roman" w:hAnsi="Times New Roman" w:eastAsia="Times New Roman"/>
           <w:b w:val="0"/>
           <w:i w:val="0"/>
-          <w:color w:val="1E2F38"/>
-          <w:sz w:val="20"/>
+          <w:sz w:val="24"/>
         </w:rPr>
         <w:t>Anchor in a live cascade: community members identify needs; CHWs/VHTs collect and educate; FairBanks Community Reach runs outreach and home visits; FairBanks Medical Centre provides clinical care, diagnostics, pharmacy, and referrals; FCHIP is the intelligence layer that closes the data-and-feedback loop.</w:t>
       </w:r>
     </w:p>
     <w:p>
       <w:pPr>
-        <w:spacing w:after="100"/>
+        <w:spacing w:before="0" w:after="100" w:line="240" w:lineRule="auto"/>
         <w:jc w:val="left"/>
       </w:pPr>
       <w:r>
         <w:rPr>
-          <w:rFonts w:ascii="Calibri" w:hAnsi="Calibri" w:eastAsia="Calibri"/>
+          <w:rFonts w:ascii="Times New Roman" w:hAnsi="Times New Roman" w:eastAsia="Times New Roman"/>
           <w:b w:val="0"/>
           <w:i w:val="0"/>
-          <w:color w:val="1E2F38"/>
-          <w:sz w:val="20"/>
+          <w:sz w:val="24"/>
         </w:rPr>
-        <w:t>Build API-first, standards-aware exports - not a closed proprietary vault. Prioritise interoperability with eCHIS (household/visit concepts), DHIS2 (aggregate indicators), facility EMR encounter/referral handoff, and readiness for national warehouse feeds when schemas are confirmed.</w:t>
+        <w:t>Build API-first, standards-aware exports - not a closed proprietary vault. Prioritise interoperability with eCHIS, DHIS2/eIDSR, facility EMR pathways (eAfya/ClinicMaster as applicable), and National Data Warehouse readiness when schemas are confirmed.</w:t>
       </w:r>
     </w:p>
     <w:p>
       <w:pPr>
-        <w:spacing w:after="100"/>
+        <w:spacing w:before="0" w:after="100" w:line="240" w:lineRule="auto"/>
         <w:jc w:val="left"/>
       </w:pPr>
       <w:r>
         <w:rPr>
-          <w:rFonts w:ascii="Calibri" w:hAnsi="Calibri" w:eastAsia="Calibri"/>
+          <w:rFonts w:ascii="Times New Roman" w:hAnsi="Times New Roman" w:eastAsia="Times New Roman"/>
           <w:b w:val="0"/>
           <w:i w:val="0"/>
-          <w:color w:val="1E2F38"/>
-          <w:sz w:val="20"/>
+          <w:sz w:val="24"/>
         </w:rPr>
         <w:t>Protect essential services during transition: structure community data around HIV/TB/malaria flags where relevant, maternal and child pathways, immunisation follow-up, and outbreak early warning so digital work reinforces - not distracts from - service continuity.</w:t>
       </w:r>
     </w:p>
     <w:p>
       <w:pPr>
-        <w:spacing w:after="100"/>
+        <w:spacing w:before="0" w:after="100" w:line="240" w:lineRule="auto"/>
         <w:jc w:val="left"/>
       </w:pPr>
       <w:r>
         <w:rPr>
-          <w:rFonts w:ascii="Calibri" w:hAnsi="Calibri" w:eastAsia="Calibri"/>
+          <w:rFonts w:ascii="Times New Roman" w:hAnsi="Times New Roman" w:eastAsia="Times New Roman"/>
           <w:b w:val="0"/>
           <w:i w:val="0"/>
-          <w:color w:val="1E2F38"/>
-          <w:sz w:val="20"/>
+          <w:sz w:val="24"/>
         </w:rPr>
         <w:t>Co-design forms and alerts with CHWs, facility staff, and local leaders; train Ugandan data stewards and developers; document every interface for MoH review.</w:t>
       </w:r>
     </w:p>
     <w:p>
       <w:pPr>
-        <w:spacing w:after="100"/>
+        <w:spacing w:before="0" w:after="100" w:line="240" w:lineRule="auto"/>
         <w:jc w:val="left"/>
       </w:pPr>
       <w:r>
         <w:rPr>
-          <w:rFonts w:ascii="Calibri" w:hAnsi="Calibri" w:eastAsia="Calibri"/>
+          <w:rFonts w:ascii="Times New Roman" w:hAnsi="Times New Roman" w:eastAsia="Times New Roman"/>
           <w:b w:val="0"/>
           <w:i w:val="0"/>
-          <w:color w:val="1E2F38"/>
-          <w:sz w:val="20"/>
+          <w:sz w:val="24"/>
         </w:rPr>
         <w:t>Start where FairBanks already operates (Bukoto, Kyebando, Kisaasi, Kamwokya, Kikaaya and surrounding communities), then design for district replication using Uganda's existing CHW/VHT architecture.</w:t>
       </w:r>
     </w:p>
+    <w:p>
+      <w:pPr>
+        <w:spacing w:before="240" w:after="120" w:line="240" w:lineRule="auto"/>
+      </w:pPr>
+      <w:r>
+        <w:rPr>
+          <w:rFonts w:ascii="Times New Roman" w:hAnsi="Times New Roman" w:eastAsia="Times New Roman"/>
+          <w:b/>
+          <w:i w:val="0"/>
+          <w:sz w:val="24"/>
+        </w:rPr>
+        <w:t>3. Anticipated Outcomes and Results</w:t>
+      </w:r>
+    </w:p>
+    <w:p>
+      <w:pPr>
+        <w:spacing w:before="0" w:after="120" w:line="240" w:lineRule="auto"/>
+        <w:jc w:val="left"/>
+      </w:pPr>
+      <w:r>
+        <w:rPr>
+          <w:rFonts w:ascii="Times New Roman" w:hAnsi="Times New Roman" w:eastAsia="Times New Roman"/>
+          <w:b w:val="0"/>
+          <w:i w:val="0"/>
+          <w:sz w:val="24"/>
+        </w:rPr>
+        <w:t>Success means lives protected, systems strengthened, efficiency improved, self-reliance advanced, and U.S. investments secured through GOU-owned digital continuity:</w:t>
+      </w:r>
+    </w:p>
+    <w:tbl>
+      <w:tblPr>
+        <w:tblW w:type="auto" w:w="0"/>
+        <w:jc w:val="center"/>
+        <w:tblLook w:firstColumn="1" w:firstRow="1" w:lastColumn="0" w:lastRow="0" w:noHBand="0" w:noVBand="1" w:val="04A0"/>
+      </w:tblPr>
+      <w:tblGrid>
+        <w:gridCol w:w="4680"/>
+        <w:gridCol w:w="4680"/>
+      </w:tblGrid>
+      <w:tr>
+        <w:tc>
+          <w:tcPr>
+            <w:tcW w:type="dxa" w:w="2304"/>
+            <w:shd w:fill="E8EEEE"/>
+            <w:tcBorders>
+              <w:top w:val="single" w:sz="4" w:color="888888"/>
+              <w:left w:val="single" w:sz="4" w:color="888888"/>
+              <w:bottom w:val="single" w:sz="4" w:color="888888"/>
+              <w:right w:val="single" w:sz="4" w:color="888888"/>
+            </w:tcBorders>
+          </w:tcPr>
+          <w:p>
+            <w:r/>
+            <w:r>
+              <w:rPr>
+                <w:rFonts w:ascii="Times New Roman" w:hAnsi="Times New Roman" w:eastAsia="Times New Roman"/>
+                <w:b/>
+                <w:i w:val="0"/>
+                <w:sz w:val="20"/>
+              </w:rPr>
+              <w:t>Outcome lens</w:t>
+            </w:r>
+          </w:p>
+        </w:tc>
+        <w:tc>
+          <w:tcPr>
+            <w:tcW w:type="dxa" w:w="7056"/>
+            <w:shd w:fill="E8EEEE"/>
+            <w:tcBorders>
+              <w:top w:val="single" w:sz="4" w:color="888888"/>
+              <w:left w:val="single" w:sz="4" w:color="888888"/>
+              <w:bottom w:val="single" w:sz="4" w:color="888888"/>
+              <w:right w:val="single" w:sz="4" w:color="888888"/>
+            </w:tcBorders>
+          </w:tcPr>
+          <w:p>
+            <w:r/>
+            <w:r>
+              <w:rPr>
+                <w:rFonts w:ascii="Times New Roman" w:hAnsi="Times New Roman" w:eastAsia="Times New Roman"/>
+                <w:b/>
+                <w:i w:val="0"/>
+                <w:sz w:val="20"/>
+              </w:rPr>
+              <w:t>What success looks like</w:t>
+            </w:r>
+          </w:p>
+        </w:tc>
+      </w:tr>
+      <w:tr>
+        <w:tc>
+          <w:tcPr>
+            <w:tcW w:type="dxa" w:w="2304"/>
+            <w:tcBorders>
+              <w:top w:val="single" w:sz="4" w:color="888888"/>
+              <w:left w:val="single" w:sz="4" w:color="888888"/>
+              <w:bottom w:val="single" w:sz="4" w:color="888888"/>
+              <w:right w:val="single" w:sz="4" w:color="888888"/>
+            </w:tcBorders>
+          </w:tcPr>
+          <w:p>
+            <w:r/>
+            <w:r>
+              <w:rPr>
+                <w:rFonts w:ascii="Times New Roman" w:hAnsi="Times New Roman" w:eastAsia="Times New Roman"/>
+                <w:b w:val="0"/>
+                <w:i w:val="0"/>
+                <w:sz w:val="20"/>
+              </w:rPr>
+              <w:t>Save lives</w:t>
+            </w:r>
+          </w:p>
+        </w:tc>
+        <w:tc>
+          <w:tcPr>
+            <w:tcW w:type="dxa" w:w="7056"/>
+            <w:tcBorders>
+              <w:top w:val="single" w:sz="4" w:color="888888"/>
+              <w:left w:val="single" w:sz="4" w:color="888888"/>
+              <w:bottom w:val="single" w:sz="4" w:color="888888"/>
+              <w:right w:val="single" w:sz="4" w:color="888888"/>
+            </w:tcBorders>
+          </w:tcPr>
+          <w:p>
+            <w:r/>
+            <w:r>
+              <w:rPr>
+                <w:rFonts w:ascii="Times New Roman" w:hAnsi="Times New Roman" w:eastAsia="Times New Roman"/>
+                <w:b w:val="0"/>
+                <w:i w:val="0"/>
+                <w:sz w:val="20"/>
+              </w:rPr>
+              <w:t>Earlier alerts for missed ANC, immunisation gaps, fever clusters, and referral drop-offs - linked to CHW follow-up and clinic action.</w:t>
+            </w:r>
+          </w:p>
+        </w:tc>
+      </w:tr>
+      <w:tr>
+        <w:tc>
+          <w:tcPr>
+            <w:tcW w:type="dxa" w:w="2304"/>
+            <w:tcBorders>
+              <w:top w:val="single" w:sz="4" w:color="888888"/>
+              <w:left w:val="single" w:sz="4" w:color="888888"/>
+              <w:bottom w:val="single" w:sz="4" w:color="888888"/>
+              <w:right w:val="single" w:sz="4" w:color="888888"/>
+            </w:tcBorders>
+          </w:tcPr>
+          <w:p>
+            <w:r/>
+            <w:r>
+              <w:rPr>
+                <w:rFonts w:ascii="Times New Roman" w:hAnsi="Times New Roman" w:eastAsia="Times New Roman"/>
+                <w:b w:val="0"/>
+                <w:i w:val="0"/>
+                <w:sz w:val="20"/>
+              </w:rPr>
+              <w:t>Strengthen systems</w:t>
+            </w:r>
+          </w:p>
+        </w:tc>
+        <w:tc>
+          <w:tcPr>
+            <w:tcW w:type="dxa" w:w="7056"/>
+            <w:tcBorders>
+              <w:top w:val="single" w:sz="4" w:color="888888"/>
+              <w:left w:val="single" w:sz="4" w:color="888888"/>
+              <w:bottom w:val="single" w:sz="4" w:color="888888"/>
+              <w:right w:val="single" w:sz="4" w:color="888888"/>
+            </w:tcBorders>
+          </w:tcPr>
+          <w:p>
+            <w:r/>
+            <w:r>
+              <w:rPr>
+                <w:rFonts w:ascii="Times New Roman" w:hAnsi="Times New Roman" w:eastAsia="Times New Roman"/>
+                <w:b w:val="0"/>
+                <w:i w:val="0"/>
+                <w:sz w:val="20"/>
+              </w:rPr>
+              <w:t>Working mappings and demo exports for eCHIS-aligned records and DHIS2/eIDSR aggregates, with open documentation for MoH and partners.</w:t>
+            </w:r>
+          </w:p>
+        </w:tc>
+      </w:tr>
+      <w:tr>
+        <w:tc>
+          <w:tcPr>
+            <w:tcW w:type="dxa" w:w="2304"/>
+            <w:tcBorders>
+              <w:top w:val="single" w:sz="4" w:color="888888"/>
+              <w:left w:val="single" w:sz="4" w:color="888888"/>
+              <w:bottom w:val="single" w:sz="4" w:color="888888"/>
+              <w:right w:val="single" w:sz="4" w:color="888888"/>
+            </w:tcBorders>
+          </w:tcPr>
+          <w:p>
+            <w:r/>
+            <w:r>
+              <w:rPr>
+                <w:rFonts w:ascii="Times New Roman" w:hAnsi="Times New Roman" w:eastAsia="Times New Roman"/>
+                <w:b w:val="0"/>
+                <w:i w:val="0"/>
+                <w:sz w:val="20"/>
+              </w:rPr>
+              <w:t>Enhance efficiency</w:t>
+            </w:r>
+          </w:p>
+        </w:tc>
+        <w:tc>
+          <w:tcPr>
+            <w:tcW w:type="dxa" w:w="7056"/>
+            <w:tcBorders>
+              <w:top w:val="single" w:sz="4" w:color="888888"/>
+              <w:left w:val="single" w:sz="4" w:color="888888"/>
+              <w:bottom w:val="single" w:sz="4" w:color="888888"/>
+              <w:right w:val="single" w:sz="4" w:color="888888"/>
+            </w:tcBorders>
+          </w:tcPr>
+          <w:p>
+            <w:r/>
+            <w:r>
+              <w:rPr>
+                <w:rFonts w:ascii="Times New Roman" w:hAnsi="Times New Roman" w:eastAsia="Times New Roman"/>
+                <w:b w:val="0"/>
+                <w:i w:val="0"/>
+                <w:sz w:val="20"/>
+              </w:rPr>
+              <w:t>Less double entry and paper lag; role-based dashboards that shorten the path from community signal to facility or district response.</w:t>
+            </w:r>
+          </w:p>
+        </w:tc>
+      </w:tr>
+      <w:tr>
+        <w:tc>
+          <w:tcPr>
+            <w:tcW w:type="dxa" w:w="2304"/>
+            <w:tcBorders>
+              <w:top w:val="single" w:sz="4" w:color="888888"/>
+              <w:left w:val="single" w:sz="4" w:color="888888"/>
+              <w:bottom w:val="single" w:sz="4" w:color="888888"/>
+              <w:right w:val="single" w:sz="4" w:color="888888"/>
+            </w:tcBorders>
+          </w:tcPr>
+          <w:p>
+            <w:r/>
+            <w:r>
+              <w:rPr>
+                <w:rFonts w:ascii="Times New Roman" w:hAnsi="Times New Roman" w:eastAsia="Times New Roman"/>
+                <w:b w:val="0"/>
+                <w:i w:val="0"/>
+                <w:sz w:val="20"/>
+              </w:rPr>
+              <w:t>Foster self-reliance</w:t>
+            </w:r>
+          </w:p>
+        </w:tc>
+        <w:tc>
+          <w:tcPr>
+            <w:tcW w:type="dxa" w:w="7056"/>
+            <w:tcBorders>
+              <w:top w:val="single" w:sz="4" w:color="888888"/>
+              <w:left w:val="single" w:sz="4" w:color="888888"/>
+              <w:bottom w:val="single" w:sz="4" w:color="888888"/>
+              <w:right w:val="single" w:sz="4" w:color="888888"/>
+            </w:tcBorders>
+          </w:tcPr>
+          <w:p>
+            <w:r/>
+            <w:r>
+              <w:rPr>
+                <w:rFonts w:ascii="Times New Roman" w:hAnsi="Times New Roman" w:eastAsia="Times New Roman"/>
+                <w:b w:val="0"/>
+                <w:i w:val="0"/>
+                <w:sz w:val="20"/>
+              </w:rPr>
+              <w:t>Handoff package: source documentation, SOPs, training, hosting options, and a costed path to transfer recurrent operations toward domestic systems by project close.</w:t>
+            </w:r>
+          </w:p>
+        </w:tc>
+      </w:tr>
+      <w:tr>
+        <w:tc>
+          <w:tcPr>
+            <w:tcW w:type="dxa" w:w="2304"/>
+            <w:tcBorders>
+              <w:top w:val="single" w:sz="4" w:color="888888"/>
+              <w:left w:val="single" w:sz="4" w:color="888888"/>
+              <w:bottom w:val="single" w:sz="4" w:color="888888"/>
+              <w:right w:val="single" w:sz="4" w:color="888888"/>
+            </w:tcBorders>
+          </w:tcPr>
+          <w:p>
+            <w:r/>
+            <w:r>
+              <w:rPr>
+                <w:rFonts w:ascii="Times New Roman" w:hAnsi="Times New Roman" w:eastAsia="Times New Roman"/>
+                <w:b w:val="0"/>
+                <w:i w:val="0"/>
+                <w:sz w:val="20"/>
+              </w:rPr>
+              <w:t>Advance U.S. interest</w:t>
+            </w:r>
+          </w:p>
+        </w:tc>
+        <w:tc>
+          <w:tcPr>
+            <w:tcW w:type="dxa" w:w="7056"/>
+            <w:tcBorders>
+              <w:top w:val="single" w:sz="4" w:color="888888"/>
+              <w:left w:val="single" w:sz="4" w:color="888888"/>
+              <w:bottom w:val="single" w:sz="4" w:color="888888"/>
+              <w:right w:val="single" w:sz="4" w:color="888888"/>
+            </w:tcBorders>
+          </w:tcPr>
+          <w:p>
+            <w:r/>
+            <w:r>
+              <w:rPr>
+                <w:rFonts w:ascii="Times New Roman" w:hAnsi="Times New Roman" w:eastAsia="Times New Roman"/>
+                <w:b w:val="0"/>
+                <w:i w:val="0"/>
+                <w:sz w:val="20"/>
+              </w:rPr>
+              <w:t>Measurable contribution to MOU digital transition: interoperable last-mile data under GOU authority, protecting prior U.S. health investments and strengthening epidemic early warning.</w:t>
+            </w:r>
+          </w:p>
+        </w:tc>
+      </w:tr>
+    </w:tbl>
+    <w:p/>
+    <w:p>
+      <w:pPr>
+        <w:spacing w:before="240" w:after="120" w:line="240" w:lineRule="auto"/>
+      </w:pPr>
+      <w:r>
+        <w:rPr>
+          <w:rFonts w:ascii="Times New Roman" w:hAnsi="Times New Roman" w:eastAsia="Times New Roman"/>
+          <w:b/>
+          <w:i w:val="0"/>
+          <w:sz w:val="24"/>
+        </w:rPr>
+        <w:t>4. Organizational Capacity</w:t>
+      </w:r>
+    </w:p>
+    <w:p>
+      <w:pPr>
+        <w:pStyle w:val="ListBullet"/>
+        <w:spacing w:after="60" w:line="240" w:lineRule="auto"/>
+      </w:pPr>
+      <w:r>
+        <w:rPr>
+          <w:rFonts w:ascii="Times New Roman" w:hAnsi="Times New Roman" w:eastAsia="Times New Roman"/>
+          <w:b w:val="0"/>
+          <w:i w:val="0"/>
+          <w:sz w:val="24"/>
+        </w:rPr>
+        <w:t>Ugandan social enterprise with a functioning medical centre - clinical care, diagnostics, pharmacy, and referral pathways already in daily use.</w:t>
+      </w:r>
+    </w:p>
+    <w:p>
+      <w:pPr>
+        <w:pStyle w:val="ListBullet"/>
+        <w:spacing w:after="60" w:line="240" w:lineRule="auto"/>
+      </w:pPr>
+      <w:r>
+        <w:rPr>
+          <w:rFonts w:ascii="Times New Roman" w:hAnsi="Times New Roman" w:eastAsia="Times New Roman"/>
+          <w:b w:val="0"/>
+          <w:i w:val="0"/>
+          <w:sz w:val="24"/>
+        </w:rPr>
+        <w:t>Active FairBanks Community Reach programmes: maternal and child health, Gericare, chronic disease screening, school and corporate health outreach.</w:t>
+      </w:r>
+    </w:p>
+    <w:p>
+      <w:pPr>
+        <w:pStyle w:val="ListBullet"/>
+        <w:spacing w:after="60" w:line="240" w:lineRule="auto"/>
+      </w:pPr>
+      <w:r>
+        <w:rPr>
+          <w:rFonts w:ascii="Times New Roman" w:hAnsi="Times New Roman" w:eastAsia="Times New Roman"/>
+          <w:b w:val="0"/>
+          <w:i w:val="0"/>
+          <w:sz w:val="24"/>
+        </w:rPr>
+        <w:t>Established CHW/VHT relationships in Kampala-area communities named above - real users, not a greenfield pilot.</w:t>
+      </w:r>
+    </w:p>
+    <w:p>
+      <w:pPr>
+        <w:pStyle w:val="ListBullet"/>
+        <w:spacing w:after="60" w:line="240" w:lineRule="auto"/>
+      </w:pPr>
+      <w:r>
+        <w:rPr>
+          <w:rFonts w:ascii="Times New Roman" w:hAnsi="Times New Roman" w:eastAsia="Times New Roman"/>
+          <w:b w:val="0"/>
+          <w:i w:val="0"/>
+          <w:sz w:val="24"/>
+        </w:rPr>
+        <w:t>Digital health records foundation and pharmacy dispensing data already supporting facility operations.</w:t>
+      </w:r>
+    </w:p>
+    <w:p>
+      <w:pPr>
+        <w:pStyle w:val="ListBullet"/>
+        <w:spacing w:after="60" w:line="240" w:lineRule="auto"/>
+      </w:pPr>
+      <w:r>
+        <w:rPr>
+          <w:rFonts w:ascii="Times New Roman" w:hAnsi="Times New Roman" w:eastAsia="Times New Roman"/>
+          <w:b w:val="0"/>
+          <w:i w:val="0"/>
+          <w:sz w:val="24"/>
+        </w:rPr>
+        <w:t>Research orientation and partnership practice - evidence, ethics, and skills development sit inside the FairBanks community health model.</w:t>
+      </w:r>
+    </w:p>
+    <w:p>
+      <w:pPr>
+        <w:spacing w:before="240" w:after="120" w:line="240" w:lineRule="auto"/>
+      </w:pPr>
+      <w:r>
+        <w:rPr>
+          <w:rFonts w:ascii="Times New Roman" w:hAnsi="Times New Roman" w:eastAsia="Times New Roman"/>
+          <w:b/>
+          <w:i w:val="0"/>
+          <w:sz w:val="24"/>
+        </w:rPr>
+        <w:t>5. Interoperability Pathway (chart)</w:t>
+      </w:r>
+    </w:p>
+    <w:tbl>
+      <w:tblPr>
+        <w:tblW w:type="auto" w:w="0"/>
+        <w:jc w:val="center"/>
+        <w:tblLook w:firstColumn="1" w:firstRow="1" w:lastColumn="0" w:lastRow="0" w:noHBand="0" w:noVBand="1" w:val="04A0"/>
+      </w:tblPr>
+      <w:tblGrid>
+        <w:gridCol w:w="4680"/>
+        <w:gridCol w:w="4680"/>
+      </w:tblGrid>
+      <w:tr>
+        <w:tc>
+          <w:tcPr>
+            <w:tcW w:type="dxa" w:w="3168"/>
+            <w:shd w:fill="E8EEEE"/>
+            <w:tcBorders>
+              <w:top w:val="single" w:sz="4" w:color="888888"/>
+              <w:left w:val="single" w:sz="4" w:color="888888"/>
+              <w:bottom w:val="single" w:sz="4" w:color="888888"/>
+              <w:right w:val="single" w:sz="4" w:color="888888"/>
+            </w:tcBorders>
+          </w:tcPr>
+          <w:p>
+            <w:r/>
+            <w:r>
+              <w:rPr>
+                <w:rFonts w:ascii="Times New Roman" w:hAnsi="Times New Roman" w:eastAsia="Times New Roman"/>
+                <w:b/>
+                <w:i w:val="0"/>
+                <w:sz w:val="20"/>
+              </w:rPr>
+              <w:t>Platform</w:t>
+            </w:r>
+          </w:p>
+        </w:tc>
+        <w:tc>
+          <w:tcPr>
+            <w:tcW w:type="dxa" w:w="6192"/>
+            <w:shd w:fill="E8EEEE"/>
+            <w:tcBorders>
+              <w:top w:val="single" w:sz="4" w:color="888888"/>
+              <w:left w:val="single" w:sz="4" w:color="888888"/>
+              <w:bottom w:val="single" w:sz="4" w:color="888888"/>
+              <w:right w:val="single" w:sz="4" w:color="888888"/>
+            </w:tcBorders>
+          </w:tcPr>
+          <w:p>
+            <w:r/>
+            <w:r>
+              <w:rPr>
+                <w:rFonts w:ascii="Times New Roman" w:hAnsi="Times New Roman" w:eastAsia="Times New Roman"/>
+                <w:b/>
+                <w:i w:val="0"/>
+                <w:sz w:val="20"/>
+              </w:rPr>
+              <w:t>Integration pathway</w:t>
+            </w:r>
+          </w:p>
+        </w:tc>
+      </w:tr>
+      <w:tr>
+        <w:tc>
+          <w:tcPr>
+            <w:tcW w:type="dxa" w:w="3168"/>
+            <w:tcBorders>
+              <w:top w:val="single" w:sz="4" w:color="888888"/>
+              <w:left w:val="single" w:sz="4" w:color="888888"/>
+              <w:bottom w:val="single" w:sz="4" w:color="888888"/>
+              <w:right w:val="single" w:sz="4" w:color="888888"/>
+            </w:tcBorders>
+          </w:tcPr>
+          <w:p>
+            <w:r/>
+            <w:r>
+              <w:rPr>
+                <w:rFonts w:ascii="Times New Roman" w:hAnsi="Times New Roman" w:eastAsia="Times New Roman"/>
+                <w:b w:val="0"/>
+                <w:i w:val="0"/>
+                <w:sz w:val="20"/>
+              </w:rPr>
+              <w:t>eCHIS</w:t>
+            </w:r>
+          </w:p>
+        </w:tc>
+        <w:tc>
+          <w:tcPr>
+            <w:tcW w:type="dxa" w:w="6192"/>
+            <w:tcBorders>
+              <w:top w:val="single" w:sz="4" w:color="888888"/>
+              <w:left w:val="single" w:sz="4" w:color="888888"/>
+              <w:bottom w:val="single" w:sz="4" w:color="888888"/>
+              <w:right w:val="single" w:sz="4" w:color="888888"/>
+            </w:tcBorders>
+          </w:tcPr>
+          <w:p>
+            <w:r/>
+            <w:r>
+              <w:rPr>
+                <w:rFonts w:ascii="Times New Roman" w:hAnsi="Times New Roman" w:eastAsia="Times New Roman"/>
+                <w:b w:val="0"/>
+                <w:i w:val="0"/>
+                <w:sz w:val="20"/>
+              </w:rPr>
+              <w:t>Household registration, visit logs, referral flags via structured mobile capture</w:t>
+            </w:r>
+          </w:p>
+        </w:tc>
+      </w:tr>
+      <w:tr>
+        <w:tc>
+          <w:tcPr>
+            <w:tcW w:type="dxa" w:w="3168"/>
+            <w:tcBorders>
+              <w:top w:val="single" w:sz="4" w:color="888888"/>
+              <w:left w:val="single" w:sz="4" w:color="888888"/>
+              <w:bottom w:val="single" w:sz="4" w:color="888888"/>
+              <w:right w:val="single" w:sz="4" w:color="888888"/>
+            </w:tcBorders>
+          </w:tcPr>
+          <w:p>
+            <w:r/>
+            <w:r>
+              <w:rPr>
+                <w:rFonts w:ascii="Times New Roman" w:hAnsi="Times New Roman" w:eastAsia="Times New Roman"/>
+                <w:b w:val="0"/>
+                <w:i w:val="0"/>
+                <w:sz w:val="20"/>
+              </w:rPr>
+              <w:t>Facility EMR (eAfya / ClinicMaster)</w:t>
+            </w:r>
+          </w:p>
+        </w:tc>
+        <w:tc>
+          <w:tcPr>
+            <w:tcW w:type="dxa" w:w="6192"/>
+            <w:tcBorders>
+              <w:top w:val="single" w:sz="4" w:color="888888"/>
+              <w:left w:val="single" w:sz="4" w:color="888888"/>
+              <w:bottom w:val="single" w:sz="4" w:color="888888"/>
+              <w:right w:val="single" w:sz="4" w:color="888888"/>
+            </w:tcBorders>
+          </w:tcPr>
+          <w:p>
+            <w:r/>
+            <w:r>
+              <w:rPr>
+                <w:rFonts w:ascii="Times New Roman" w:hAnsi="Times New Roman" w:eastAsia="Times New Roman"/>
+                <w:b w:val="0"/>
+                <w:i w:val="0"/>
+                <w:sz w:val="20"/>
+              </w:rPr>
+              <w:t>Referral handoff and encounter linkage at FairBanks Medical Centre</w:t>
+            </w:r>
+          </w:p>
+        </w:tc>
+      </w:tr>
+      <w:tr>
+        <w:tc>
+          <w:tcPr>
+            <w:tcW w:type="dxa" w:w="3168"/>
+            <w:tcBorders>
+              <w:top w:val="single" w:sz="4" w:color="888888"/>
+              <w:left w:val="single" w:sz="4" w:color="888888"/>
+              <w:bottom w:val="single" w:sz="4" w:color="888888"/>
+              <w:right w:val="single" w:sz="4" w:color="888888"/>
+            </w:tcBorders>
+          </w:tcPr>
+          <w:p>
+            <w:r/>
+            <w:r>
+              <w:rPr>
+                <w:rFonts w:ascii="Times New Roman" w:hAnsi="Times New Roman" w:eastAsia="Times New Roman"/>
+                <w:b w:val="0"/>
+                <w:i w:val="0"/>
+                <w:sz w:val="20"/>
+              </w:rPr>
+              <w:t>DHIS2 / eIDSR</w:t>
+            </w:r>
+          </w:p>
+        </w:tc>
+        <w:tc>
+          <w:tcPr>
+            <w:tcW w:type="dxa" w:w="6192"/>
+            <w:tcBorders>
+              <w:top w:val="single" w:sz="4" w:color="888888"/>
+              <w:left w:val="single" w:sz="4" w:color="888888"/>
+              <w:bottom w:val="single" w:sz="4" w:color="888888"/>
+              <w:right w:val="single" w:sz="4" w:color="888888"/>
+            </w:tcBorders>
+          </w:tcPr>
+          <w:p>
+            <w:r/>
+            <w:r>
+              <w:rPr>
+                <w:rFonts w:ascii="Times New Roman" w:hAnsi="Times New Roman" w:eastAsia="Times New Roman"/>
+                <w:b w:val="0"/>
+                <w:i w:val="0"/>
+                <w:sz w:val="20"/>
+              </w:rPr>
+              <w:t>Aggregate exports and surveillance signals for MNCH, immunisation, outbreaks</w:t>
+            </w:r>
+          </w:p>
+        </w:tc>
+      </w:tr>
+      <w:tr>
+        <w:tc>
+          <w:tcPr>
+            <w:tcW w:type="dxa" w:w="3168"/>
+            <w:tcBorders>
+              <w:top w:val="single" w:sz="4" w:color="888888"/>
+              <w:left w:val="single" w:sz="4" w:color="888888"/>
+              <w:bottom w:val="single" w:sz="4" w:color="888888"/>
+              <w:right w:val="single" w:sz="4" w:color="888888"/>
+            </w:tcBorders>
+          </w:tcPr>
+          <w:p>
+            <w:r/>
+            <w:r>
+              <w:rPr>
+                <w:rFonts w:ascii="Times New Roman" w:hAnsi="Times New Roman" w:eastAsia="Times New Roman"/>
+                <w:b w:val="0"/>
+                <w:i w:val="0"/>
+                <w:sz w:val="20"/>
+              </w:rPr>
+              <w:t>National Data Warehouse</w:t>
+            </w:r>
+          </w:p>
+        </w:tc>
+        <w:tc>
+          <w:tcPr>
+            <w:tcW w:type="dxa" w:w="6192"/>
+            <w:tcBorders>
+              <w:top w:val="single" w:sz="4" w:color="888888"/>
+              <w:left w:val="single" w:sz="4" w:color="888888"/>
+              <w:bottom w:val="single" w:sz="4" w:color="888888"/>
+              <w:right w:val="single" w:sz="4" w:color="888888"/>
+            </w:tcBorders>
+          </w:tcPr>
+          <w:p>
+            <w:r/>
+            <w:r>
+              <w:rPr>
+                <w:rFonts w:ascii="Times New Roman" w:hAnsi="Times New Roman" w:eastAsia="Times New Roman"/>
+                <w:b w:val="0"/>
+                <w:i w:val="0"/>
+                <w:sz w:val="20"/>
+              </w:rPr>
+              <w:t>Standardised JSON/API feeds when national schema is confirmed</w:t>
+            </w:r>
+          </w:p>
+        </w:tc>
+      </w:tr>
+      <w:tr>
+        <w:tc>
+          <w:tcPr>
+            <w:tcW w:type="dxa" w:w="3168"/>
+            <w:tcBorders>
+              <w:top w:val="single" w:sz="4" w:color="888888"/>
+              <w:left w:val="single" w:sz="4" w:color="888888"/>
+              <w:bottom w:val="single" w:sz="4" w:color="888888"/>
+              <w:right w:val="single" w:sz="4" w:color="888888"/>
+            </w:tcBorders>
+          </w:tcPr>
+          <w:p>
+            <w:r/>
+            <w:r>
+              <w:rPr>
+                <w:rFonts w:ascii="Times New Roman" w:hAnsi="Times New Roman" w:eastAsia="Times New Roman"/>
+                <w:b w:val="0"/>
+                <w:i w:val="0"/>
+                <w:sz w:val="20"/>
+              </w:rPr>
+              <w:t>iHRIS</w:t>
+            </w:r>
+          </w:p>
+        </w:tc>
+        <w:tc>
+          <w:tcPr>
+            <w:tcW w:type="dxa" w:w="6192"/>
+            <w:tcBorders>
+              <w:top w:val="single" w:sz="4" w:color="888888"/>
+              <w:left w:val="single" w:sz="4" w:color="888888"/>
+              <w:bottom w:val="single" w:sz="4" w:color="888888"/>
+              <w:right w:val="single" w:sz="4" w:color="888888"/>
+            </w:tcBorders>
+          </w:tcPr>
+          <w:p>
+            <w:r/>
+            <w:r>
+              <w:rPr>
+                <w:rFonts w:ascii="Times New Roman" w:hAnsi="Times New Roman" w:eastAsia="Times New Roman"/>
+                <w:b w:val="0"/>
+                <w:i w:val="0"/>
+                <w:sz w:val="20"/>
+              </w:rPr>
+              <w:t>CHW/VHT workforce directory alignment where schemas allow</w:t>
+            </w:r>
+          </w:p>
+        </w:tc>
+      </w:tr>
+    </w:tbl>
+    <w:p/>
     <w:p>
       <w:pPr>
         <w:jc w:val="center"/>
@@ -798,8 +1867,8 @@
       <w:r>
         <w:drawing>
           <wp:inline xmlns:a="http://schemas.openxmlformats.org/drawingml/2006/main" xmlns:pic="http://schemas.openxmlformats.org/drawingml/2006/picture">
-            <wp:extent cx="4390688" cy="2926080"/>
-            <wp:docPr id="2" name="Picture 2"/>
+            <wp:extent cx="4665106" cy="3108960"/>
+            <wp:docPr id="1" name="Picture 1"/>
             <wp:cNvGraphicFramePr>
               <a:graphicFrameLocks noChangeAspect="1"/>
             </wp:cNvGraphicFramePr>
@@ -819,7 +1888,7 @@
                   <pic:spPr>
                     <a:xfrm>
                       <a:off x="0" y="0"/>
-                      <a:ext cx="4390688" cy="2926080"/>
+                      <a:ext cx="4665106" cy="3108960"/>
                     </a:xfrm>
                     <a:prstGeom prst="rect"/>
                   </pic:spPr>
@@ -832,33 +1901,31 @@
     </w:p>
     <w:p>
       <w:pPr>
-        <w:spacing w:after="160"/>
+        <w:spacing w:before="0" w:after="160" w:line="240" w:lineRule="auto"/>
         <w:jc w:val="center"/>
       </w:pPr>
       <w:r>
         <w:rPr>
-          <w:rFonts w:ascii="Calibri" w:hAnsi="Calibri" w:eastAsia="Calibri"/>
+          <w:rFonts w:ascii="Times New Roman" w:hAnsi="Times New Roman" w:eastAsia="Times New Roman"/>
           <w:b w:val="0"/>
           <w:i/>
-          <w:color w:val="3A4A54"/>
-          <w:sz w:val="16"/>
+          <w:sz w:val="20"/>
         </w:rPr>
-        <w:t>Community cascade → FCHIP → national digital health systems</w:t>
+        <w:t>Figure 1. Community cascade to FCHIP to national digital health systems (chart; excluded from page limit).</w:t>
       </w:r>
     </w:p>
     <w:p>
       <w:pPr>
-        <w:spacing w:before="240" w:after="100"/>
+        <w:spacing w:before="240" w:after="120" w:line="240" w:lineRule="auto"/>
       </w:pPr>
       <w:r>
         <w:rPr>
-          <w:rFonts w:ascii="Calibri" w:hAnsi="Calibri" w:eastAsia="Calibri"/>
+          <w:rFonts w:ascii="Times New Roman" w:hAnsi="Times New Roman" w:eastAsia="Times New Roman"/>
           <w:b/>
           <w:i w:val="0"/>
-          <w:color w:val="0A1F2E"/>
-          <w:sz w:val="32"/>
+          <w:sz w:val="24"/>
         </w:rPr>
-        <w:t>VI. Expected Outcomes</w:t>
+        <w:t>6. Alignment with Addendum E Guiding Principles (chart)</w:t>
       </w:r>
     </w:p>
     <w:tbl>
@@ -868,851 +1935,29 @@
         <w:tblLook w:firstColumn="1" w:firstRow="1" w:lastColumn="0" w:lastRow="0" w:noHBand="0" w:noVBand="1" w:val="04A0"/>
       </w:tblPr>
       <w:tblGrid>
-        <w:gridCol w:w="4968"/>
-        <w:gridCol w:w="4968"/>
+        <w:gridCol w:w="4680"/>
+        <w:gridCol w:w="4680"/>
       </w:tblGrid>
       <w:tr>
         <w:tc>
           <w:tcPr>
-            <w:tcW w:type="dxa" w:w="2448"/>
-            <w:shd w:fill="0D6E6E"/>
+            <w:tcW w:type="dxa" w:w="3168"/>
+            <w:shd w:fill="E8EEEE"/>
             <w:tcBorders>
-              <w:top w:val="single" w:sz="8" w:color="0D6E6E"/>
-              <w:left w:val="single" w:sz="8" w:color="0D6E6E"/>
-              <w:bottom w:val="single" w:sz="8" w:color="0D6E6E"/>
-              <w:right w:val="single" w:sz="8" w:color="0D6E6E"/>
+              <w:top w:val="single" w:sz="4" w:color="888888"/>
+              <w:left w:val="single" w:sz="4" w:color="888888"/>
+              <w:bottom w:val="single" w:sz="4" w:color="888888"/>
+              <w:right w:val="single" w:sz="4" w:color="888888"/>
             </w:tcBorders>
           </w:tcPr>
           <w:p>
             <w:r/>
             <w:r>
               <w:rPr>
-                <w:rFonts w:ascii="Calibri" w:hAnsi="Calibri" w:eastAsia="Calibri"/>
+                <w:rFonts w:ascii="Times New Roman" w:hAnsi="Times New Roman" w:eastAsia="Times New Roman"/>
                 <w:b/>
                 <w:i w:val="0"/>
-                <w:color w:val="FFFFFF"/>
-                <w:sz w:val="18"/>
-              </w:rPr>
-              <w:t>Outcome</w:t>
-            </w:r>
-          </w:p>
-        </w:tc>
-        <w:tc>
-          <w:tcPr>
-            <w:tcW w:type="dxa" w:w="7056"/>
-            <w:shd w:fill="0D6E6E"/>
-            <w:tcBorders>
-              <w:top w:val="single" w:sz="8" w:color="0D6E6E"/>
-              <w:left w:val="single" w:sz="8" w:color="0D6E6E"/>
-              <w:bottom w:val="single" w:sz="8" w:color="0D6E6E"/>
-              <w:right w:val="single" w:sz="8" w:color="0D6E6E"/>
-            </w:tcBorders>
-          </w:tcPr>
-          <w:p>
-            <w:r/>
-            <w:r>
-              <w:rPr>
-                <w:rFonts w:ascii="Calibri" w:hAnsi="Calibri" w:eastAsia="Calibri"/>
-                <w:b/>
-                <w:i w:val="0"/>
-                <w:color w:val="FFFFFF"/>
-                <w:sz w:val="18"/>
-              </w:rPr>
-              <w:t>What success looks like</w:t>
-            </w:r>
-          </w:p>
-        </w:tc>
-      </w:tr>
-      <w:tr>
-        <w:tc>
-          <w:tcPr>
-            <w:tcW w:type="dxa" w:w="2448"/>
-            <w:tcBorders>
-              <w:top w:val="single" w:sz="8" w:color="D0DCDC"/>
-              <w:left w:val="single" w:sz="8" w:color="D0DCDC"/>
-              <w:bottom w:val="single" w:sz="8" w:color="D0DCDC"/>
-              <w:right w:val="single" w:sz="8" w:color="D0DCDC"/>
-            </w:tcBorders>
-          </w:tcPr>
-          <w:p>
-            <w:r/>
-            <w:r>
-              <w:rPr>
-                <w:rFonts w:ascii="Calibri" w:hAnsi="Calibri" w:eastAsia="Calibri"/>
-                <w:b w:val="0"/>
-                <w:i w:val="0"/>
-                <w:color w:val="1E2F38"/>
-                <w:sz w:val="18"/>
-              </w:rPr>
-              <w:t>Digital completeness</w:t>
-            </w:r>
-          </w:p>
-        </w:tc>
-        <w:tc>
-          <w:tcPr>
-            <w:tcW w:type="dxa" w:w="7056"/>
-            <w:tcBorders>
-              <w:top w:val="single" w:sz="8" w:color="D0DCDC"/>
-              <w:left w:val="single" w:sz="8" w:color="D0DCDC"/>
-              <w:bottom w:val="single" w:sz="8" w:color="D0DCDC"/>
-              <w:right w:val="single" w:sz="8" w:color="D0DCDC"/>
-            </w:tcBorders>
-          </w:tcPr>
-          <w:p>
-            <w:r/>
-            <w:r>
-              <w:rPr>
-                <w:rFonts w:ascii="Calibri" w:hAnsi="Calibri" w:eastAsia="Calibri"/>
-                <w:b w:val="0"/>
-                <w:i w:val="0"/>
-                <w:color w:val="1E2F38"/>
-                <w:sz w:val="18"/>
-              </w:rPr>
-              <w:t>Increase structured community visit capture flowing into facility and aggregate reporting pathways within the pilot catchment.</w:t>
-            </w:r>
-          </w:p>
-        </w:tc>
-      </w:tr>
-      <w:tr>
-        <w:tc>
-          <w:tcPr>
-            <w:tcW w:type="dxa" w:w="2448"/>
-            <w:shd w:fill="F7F5F0"/>
-            <w:tcBorders>
-              <w:top w:val="single" w:sz="8" w:color="D0DCDC"/>
-              <w:left w:val="single" w:sz="8" w:color="D0DCDC"/>
-              <w:bottom w:val="single" w:sz="8" w:color="D0DCDC"/>
-              <w:right w:val="single" w:sz="8" w:color="D0DCDC"/>
-            </w:tcBorders>
-          </w:tcPr>
-          <w:p>
-            <w:r/>
-            <w:r>
-              <w:rPr>
-                <w:rFonts w:ascii="Calibri" w:hAnsi="Calibri" w:eastAsia="Calibri"/>
-                <w:b w:val="0"/>
-                <w:i w:val="0"/>
-                <w:color w:val="1E2F38"/>
-                <w:sz w:val="18"/>
-              </w:rPr>
-              <w:t>Interoperability proof</w:t>
-            </w:r>
-          </w:p>
-        </w:tc>
-        <w:tc>
-          <w:tcPr>
-            <w:tcW w:type="dxa" w:w="7056"/>
-            <w:shd w:fill="F7F5F0"/>
-            <w:tcBorders>
-              <w:top w:val="single" w:sz="8" w:color="D0DCDC"/>
-              <w:left w:val="single" w:sz="8" w:color="D0DCDC"/>
-              <w:bottom w:val="single" w:sz="8" w:color="D0DCDC"/>
-              <w:right w:val="single" w:sz="8" w:color="D0DCDC"/>
-            </w:tcBorders>
-          </w:tcPr>
-          <w:p>
-            <w:r/>
-            <w:r>
-              <w:rPr>
-                <w:rFonts w:ascii="Calibri" w:hAnsi="Calibri" w:eastAsia="Calibri"/>
-                <w:b w:val="0"/>
-                <w:i w:val="0"/>
-                <w:color w:val="1E2F38"/>
-                <w:sz w:val="18"/>
-              </w:rPr>
-              <w:t>Working mappings and demo exports for eCHIS-aligned records and DHIS2 aggregates, with open documentation for MoH and partners.</w:t>
-            </w:r>
-          </w:p>
-        </w:tc>
-      </w:tr>
-      <w:tr>
-        <w:tc>
-          <w:tcPr>
-            <w:tcW w:type="dxa" w:w="2448"/>
-            <w:tcBorders>
-              <w:top w:val="single" w:sz="8" w:color="D0DCDC"/>
-              <w:left w:val="single" w:sz="8" w:color="D0DCDC"/>
-              <w:bottom w:val="single" w:sz="8" w:color="D0DCDC"/>
-              <w:right w:val="single" w:sz="8" w:color="D0DCDC"/>
-            </w:tcBorders>
-          </w:tcPr>
-          <w:p>
-            <w:r/>
-            <w:r>
-              <w:rPr>
-                <w:rFonts w:ascii="Calibri" w:hAnsi="Calibri" w:eastAsia="Calibri"/>
-                <w:b w:val="0"/>
-                <w:i w:val="0"/>
-                <w:color w:val="1E2F38"/>
-                <w:sz w:val="18"/>
-              </w:rPr>
-              <w:t>Service continuity signals</w:t>
-            </w:r>
-          </w:p>
-        </w:tc>
-        <w:tc>
-          <w:tcPr>
-            <w:tcW w:type="dxa" w:w="7056"/>
-            <w:tcBorders>
-              <w:top w:val="single" w:sz="8" w:color="D0DCDC"/>
-              <w:left w:val="single" w:sz="8" w:color="D0DCDC"/>
-              <w:bottom w:val="single" w:sz="8" w:color="D0DCDC"/>
-              <w:right w:val="single" w:sz="8" w:color="D0DCDC"/>
-            </w:tcBorders>
-          </w:tcPr>
-          <w:p>
-            <w:r/>
-            <w:r>
-              <w:rPr>
-                <w:rFonts w:ascii="Calibri" w:hAnsi="Calibri" w:eastAsia="Calibri"/>
-                <w:b w:val="0"/>
-                <w:i w:val="0"/>
-                <w:color w:val="1E2F38"/>
-                <w:sz w:val="18"/>
-              </w:rPr>
-              <w:t>Earlier alerts for missed ANC, immunisation gaps, fever clusters, and referral drop-offs - linked to CHW follow-up and clinic action.</w:t>
-            </w:r>
-          </w:p>
-        </w:tc>
-      </w:tr>
-      <w:tr>
-        <w:tc>
-          <w:tcPr>
-            <w:tcW w:type="dxa" w:w="2448"/>
-            <w:shd w:fill="F7F5F0"/>
-            <w:tcBorders>
-              <w:top w:val="single" w:sz="8" w:color="D0DCDC"/>
-              <w:left w:val="single" w:sz="8" w:color="D0DCDC"/>
-              <w:bottom w:val="single" w:sz="8" w:color="D0DCDC"/>
-              <w:right w:val="single" w:sz="8" w:color="D0DCDC"/>
-            </w:tcBorders>
-          </w:tcPr>
-          <w:p>
-            <w:r/>
-            <w:r>
-              <w:rPr>
-                <w:rFonts w:ascii="Calibri" w:hAnsi="Calibri" w:eastAsia="Calibri"/>
-                <w:b w:val="0"/>
-                <w:i w:val="0"/>
-                <w:color w:val="1E2F38"/>
-                <w:sz w:val="18"/>
-              </w:rPr>
-              <w:t>Accountability</w:t>
-            </w:r>
-          </w:p>
-        </w:tc>
-        <w:tc>
-          <w:tcPr>
-            <w:tcW w:type="dxa" w:w="7056"/>
-            <w:shd w:fill="F7F5F0"/>
-            <w:tcBorders>
-              <w:top w:val="single" w:sz="8" w:color="D0DCDC"/>
-              <w:left w:val="single" w:sz="8" w:color="D0DCDC"/>
-              <w:bottom w:val="single" w:sz="8" w:color="D0DCDC"/>
-              <w:right w:val="single" w:sz="8" w:color="D0DCDC"/>
-            </w:tcBorders>
-          </w:tcPr>
-          <w:p>
-            <w:r/>
-            <w:r>
-              <w:rPr>
-                <w:rFonts w:ascii="Calibri" w:hAnsi="Calibri" w:eastAsia="Calibri"/>
-                <w:b w:val="0"/>
-                <w:i w:val="0"/>
-                <w:color w:val="1E2F38"/>
-                <w:sz w:val="18"/>
-              </w:rPr>
-              <w:t>Role-based audit trails, data-quality checks, and programme dashboards usable for performance-oriented district conversations.</w:t>
-            </w:r>
-          </w:p>
-        </w:tc>
-      </w:tr>
-      <w:tr>
-        <w:tc>
-          <w:tcPr>
-            <w:tcW w:type="dxa" w:w="2448"/>
-            <w:tcBorders>
-              <w:top w:val="single" w:sz="8" w:color="D0DCDC"/>
-              <w:left w:val="single" w:sz="8" w:color="D0DCDC"/>
-              <w:bottom w:val="single" w:sz="8" w:color="D0DCDC"/>
-              <w:right w:val="single" w:sz="8" w:color="D0DCDC"/>
-            </w:tcBorders>
-          </w:tcPr>
-          <w:p>
-            <w:r/>
-            <w:r>
-              <w:rPr>
-                <w:rFonts w:ascii="Calibri" w:hAnsi="Calibri" w:eastAsia="Calibri"/>
-                <w:b w:val="0"/>
-                <w:i w:val="0"/>
-                <w:color w:val="1E2F38"/>
-                <w:sz w:val="18"/>
-              </w:rPr>
-              <w:t>Ownership readiness</w:t>
-            </w:r>
-          </w:p>
-        </w:tc>
-        <w:tc>
-          <w:tcPr>
-            <w:tcW w:type="dxa" w:w="7056"/>
-            <w:tcBorders>
-              <w:top w:val="single" w:sz="8" w:color="D0DCDC"/>
-              <w:left w:val="single" w:sz="8" w:color="D0DCDC"/>
-              <w:bottom w:val="single" w:sz="8" w:color="D0DCDC"/>
-              <w:right w:val="single" w:sz="8" w:color="D0DCDC"/>
-            </w:tcBorders>
-          </w:tcPr>
-          <w:p>
-            <w:r/>
-            <w:r>
-              <w:rPr>
-                <w:rFonts w:ascii="Calibri" w:hAnsi="Calibri" w:eastAsia="Calibri"/>
-                <w:b w:val="0"/>
-                <w:i w:val="0"/>
-                <w:color w:val="1E2F38"/>
-                <w:sz w:val="18"/>
-              </w:rPr>
-              <w:t>Handoff package: source documentation, SOPs, training, hosting options, and a costed path to transfer recurrent operations toward domestic systems.</w:t>
-            </w:r>
-          </w:p>
-        </w:tc>
-      </w:tr>
-    </w:tbl>
-    <w:p/>
-    <w:p>
-      <w:pPr>
-        <w:spacing w:before="240" w:after="100"/>
-      </w:pPr>
-      <w:r>
-        <w:rPr>
-          <w:rFonts w:ascii="Calibri" w:hAnsi="Calibri" w:eastAsia="Calibri"/>
-          <w:b/>
-          <w:i w:val="0"/>
-          <w:color w:val="0A1F2E"/>
-          <w:sz w:val="32"/>
-        </w:rPr>
-        <w:t>VII. Organizational Capacity</w:t>
-      </w:r>
-    </w:p>
-    <w:p>
-      <w:pPr>
-        <w:jc w:val="center"/>
-      </w:pPr>
-      <w:r>
-        <w:drawing>
-          <wp:inline xmlns:a="http://schemas.openxmlformats.org/drawingml/2006/main" xmlns:pic="http://schemas.openxmlformats.org/drawingml/2006/picture">
-            <wp:extent cx="4389120" cy="2926080"/>
-            <wp:docPr id="3" name="Picture 3"/>
-            <wp:cNvGraphicFramePr>
-              <a:graphicFrameLocks noChangeAspect="1"/>
-            </wp:cNvGraphicFramePr>
-            <a:graphic>
-              <a:graphicData uri="http://schemas.openxmlformats.org/drawingml/2006/picture">
-                <pic:pic>
-                  <pic:nvPicPr>
-                    <pic:cNvPr id="0" name="facility_exterior_sign_opt.jpg"/>
-                    <pic:cNvPicPr/>
-                  </pic:nvPicPr>
-                  <pic:blipFill>
-                    <a:blip r:embed="rId11"/>
-                    <a:stretch>
-                      <a:fillRect/>
-                    </a:stretch>
-                  </pic:blipFill>
-                  <pic:spPr>
-                    <a:xfrm>
-                      <a:off x="0" y="0"/>
-                      <a:ext cx="4389120" cy="2926080"/>
-                    </a:xfrm>
-                    <a:prstGeom prst="rect"/>
-                  </pic:spPr>
-                </pic:pic>
-              </a:graphicData>
-            </a:graphic>
-          </wp:inline>
-        </w:drawing>
-      </w:r>
-    </w:p>
-    <w:p>
-      <w:pPr>
-        <w:spacing w:after="160"/>
-        <w:jc w:val="center"/>
-      </w:pPr>
-      <w:r>
-        <w:rPr>
-          <w:rFonts w:ascii="Calibri" w:hAnsi="Calibri" w:eastAsia="Calibri"/>
-          <w:b w:val="0"/>
-          <w:i/>
-          <w:color w:val="3A4A54"/>
-          <w:sz w:val="16"/>
-        </w:rPr>
-        <w:t>FairBanks Medical Centre — clinical anchor for community data</w:t>
-      </w:r>
-    </w:p>
-    <w:p>
-      <w:pPr>
-        <w:pStyle w:val="ListBullet"/>
-        <w:spacing w:after="40"/>
-      </w:pPr>
-      <w:r>
-        <w:rPr>
-          <w:rFonts w:ascii="Calibri" w:hAnsi="Calibri" w:eastAsia="Calibri"/>
-          <w:b w:val="0"/>
-          <w:i w:val="0"/>
-          <w:color w:val="1E2F38"/>
-          <w:sz w:val="20"/>
-        </w:rPr>
-        <w:t>Ugandan social enterprise with a functioning medical centre - clinical care, diagnostics, pharmacy, and referral pathways already in daily use.</w:t>
-      </w:r>
-    </w:p>
-    <w:p>
-      <w:pPr>
-        <w:pStyle w:val="ListBullet"/>
-        <w:spacing w:after="40"/>
-      </w:pPr>
-      <w:r>
-        <w:rPr>
-          <w:rFonts w:ascii="Calibri" w:hAnsi="Calibri" w:eastAsia="Calibri"/>
-          <w:b w:val="0"/>
-          <w:i w:val="0"/>
-          <w:color w:val="1E2F38"/>
-          <w:sz w:val="20"/>
-        </w:rPr>
-        <w:t>Active FairBanks Community Reach programmes: maternal and child health, Gericare, chronic disease screening, school and corporate health outreach.</w:t>
-      </w:r>
-    </w:p>
-    <w:p>
-      <w:pPr>
-        <w:pStyle w:val="ListBullet"/>
-        <w:spacing w:after="40"/>
-      </w:pPr>
-      <w:r>
-        <w:rPr>
-          <w:rFonts w:ascii="Calibri" w:hAnsi="Calibri" w:eastAsia="Calibri"/>
-          <w:b w:val="0"/>
-          <w:i w:val="0"/>
-          <w:color w:val="1E2F38"/>
-          <w:sz w:val="20"/>
-        </w:rPr>
-        <w:t>Established CHW/VHT relationships in Kampala-area communities named above - real users, not a greenfield pilot.</w:t>
-      </w:r>
-    </w:p>
-    <w:p>
-      <w:pPr>
-        <w:pStyle w:val="ListBullet"/>
-        <w:spacing w:after="40"/>
-      </w:pPr>
-      <w:r>
-        <w:rPr>
-          <w:rFonts w:ascii="Calibri" w:hAnsi="Calibri" w:eastAsia="Calibri"/>
-          <w:b w:val="0"/>
-          <w:i w:val="0"/>
-          <w:color w:val="1E2F38"/>
-          <w:sz w:val="20"/>
-        </w:rPr>
-        <w:t>Digital health records foundation and pharmacy dispensing data already supporting facility operations.</w:t>
-      </w:r>
-    </w:p>
-    <w:p>
-      <w:pPr>
-        <w:pStyle w:val="ListBullet"/>
-        <w:spacing w:after="40"/>
-      </w:pPr>
-      <w:r>
-        <w:rPr>
-          <w:rFonts w:ascii="Calibri" w:hAnsi="Calibri" w:eastAsia="Calibri"/>
-          <w:b w:val="0"/>
-          <w:i w:val="0"/>
-          <w:color w:val="1E2F38"/>
-          <w:sz w:val="20"/>
-        </w:rPr>
-        <w:t>Research orientation and partnership practice - evidence, ethics, and skills development sit inside the FairBanks community health model.</w:t>
-      </w:r>
-    </w:p>
-    <w:p>
-      <w:pPr>
-        <w:spacing w:before="240" w:after="100"/>
-      </w:pPr>
-      <w:r>
-        <w:rPr>
-          <w:rFonts w:ascii="Calibri" w:hAnsi="Calibri" w:eastAsia="Calibri"/>
-          <w:b/>
-          <w:i w:val="0"/>
-          <w:color w:val="0A1F2E"/>
-          <w:sz w:val="32"/>
-        </w:rPr>
-        <w:t>VIII. Interoperability Approach</w:t>
-      </w:r>
-    </w:p>
-    <w:tbl>
-      <w:tblPr>
-        <w:tblW w:type="auto" w:w="0"/>
-        <w:jc w:val="center"/>
-        <w:tblLook w:firstColumn="1" w:firstRow="1" w:lastColumn="0" w:lastRow="0" w:noHBand="0" w:noVBand="1" w:val="04A0"/>
-      </w:tblPr>
-      <w:tblGrid>
-        <w:gridCol w:w="4968"/>
-        <w:gridCol w:w="4968"/>
-      </w:tblGrid>
-      <w:tr>
-        <w:tc>
-          <w:tcPr>
-            <w:tcW w:type="dxa" w:w="2880"/>
-            <w:shd w:fill="0D6E6E"/>
-            <w:tcBorders>
-              <w:top w:val="single" w:sz="8" w:color="0D6E6E"/>
-              <w:left w:val="single" w:sz="8" w:color="0D6E6E"/>
-              <w:bottom w:val="single" w:sz="8" w:color="0D6E6E"/>
-              <w:right w:val="single" w:sz="8" w:color="0D6E6E"/>
-            </w:tcBorders>
-          </w:tcPr>
-          <w:p>
-            <w:r/>
-            <w:r>
-              <w:rPr>
-                <w:rFonts w:ascii="Calibri" w:hAnsi="Calibri" w:eastAsia="Calibri"/>
-                <w:b/>
-                <w:i w:val="0"/>
-                <w:color w:val="FFFFFF"/>
-                <w:sz w:val="18"/>
-              </w:rPr>
-              <w:t>Platform</w:t>
-            </w:r>
-          </w:p>
-        </w:tc>
-        <w:tc>
-          <w:tcPr>
-            <w:tcW w:type="dxa" w:w="6624"/>
-            <w:shd w:fill="0D6E6E"/>
-            <w:tcBorders>
-              <w:top w:val="single" w:sz="8" w:color="0D6E6E"/>
-              <w:left w:val="single" w:sz="8" w:color="0D6E6E"/>
-              <w:bottom w:val="single" w:sz="8" w:color="0D6E6E"/>
-              <w:right w:val="single" w:sz="8" w:color="0D6E6E"/>
-            </w:tcBorders>
-          </w:tcPr>
-          <w:p>
-            <w:r/>
-            <w:r>
-              <w:rPr>
-                <w:rFonts w:ascii="Calibri" w:hAnsi="Calibri" w:eastAsia="Calibri"/>
-                <w:b/>
-                <w:i w:val="0"/>
-                <w:color w:val="FFFFFF"/>
-                <w:sz w:val="18"/>
-              </w:rPr>
-              <w:t>Integration pathway</w:t>
-            </w:r>
-          </w:p>
-        </w:tc>
-      </w:tr>
-      <w:tr>
-        <w:tc>
-          <w:tcPr>
-            <w:tcW w:type="dxa" w:w="2880"/>
-            <w:tcBorders>
-              <w:top w:val="single" w:sz="8" w:color="D0DCDC"/>
-              <w:left w:val="single" w:sz="8" w:color="D0DCDC"/>
-              <w:bottom w:val="single" w:sz="8" w:color="D0DCDC"/>
-              <w:right w:val="single" w:sz="8" w:color="D0DCDC"/>
-            </w:tcBorders>
-          </w:tcPr>
-          <w:p>
-            <w:r/>
-            <w:r>
-              <w:rPr>
-                <w:rFonts w:ascii="Calibri" w:hAnsi="Calibri" w:eastAsia="Calibri"/>
-                <w:b w:val="0"/>
-                <w:i w:val="0"/>
-                <w:color w:val="1E2F38"/>
-                <w:sz w:val="18"/>
-              </w:rPr>
-              <w:t>eCHIS</w:t>
-            </w:r>
-          </w:p>
-        </w:tc>
-        <w:tc>
-          <w:tcPr>
-            <w:tcW w:type="dxa" w:w="6624"/>
-            <w:tcBorders>
-              <w:top w:val="single" w:sz="8" w:color="D0DCDC"/>
-              <w:left w:val="single" w:sz="8" w:color="D0DCDC"/>
-              <w:bottom w:val="single" w:sz="8" w:color="D0DCDC"/>
-              <w:right w:val="single" w:sz="8" w:color="D0DCDC"/>
-            </w:tcBorders>
-          </w:tcPr>
-          <w:p>
-            <w:r/>
-            <w:r>
-              <w:rPr>
-                <w:rFonts w:ascii="Calibri" w:hAnsi="Calibri" w:eastAsia="Calibri"/>
-                <w:b w:val="0"/>
-                <w:i w:val="0"/>
-                <w:color w:val="1E2F38"/>
-                <w:sz w:val="18"/>
-              </w:rPr>
-              <w:t>Household registration, visit logs, referral flags via structured mobile capture</w:t>
-            </w:r>
-          </w:p>
-        </w:tc>
-      </w:tr>
-      <w:tr>
-        <w:tc>
-          <w:tcPr>
-            <w:tcW w:type="dxa" w:w="2880"/>
-            <w:shd w:fill="F7F5F0"/>
-            <w:tcBorders>
-              <w:top w:val="single" w:sz="8" w:color="D0DCDC"/>
-              <w:left w:val="single" w:sz="8" w:color="D0DCDC"/>
-              <w:bottom w:val="single" w:sz="8" w:color="D0DCDC"/>
-              <w:right w:val="single" w:sz="8" w:color="D0DCDC"/>
-            </w:tcBorders>
-          </w:tcPr>
-          <w:p>
-            <w:r/>
-            <w:r>
-              <w:rPr>
-                <w:rFonts w:ascii="Calibri" w:hAnsi="Calibri" w:eastAsia="Calibri"/>
-                <w:b w:val="0"/>
-                <w:i w:val="0"/>
-                <w:color w:val="1E2F38"/>
-                <w:sz w:val="18"/>
-              </w:rPr>
-              <w:t>DHIS2</w:t>
-            </w:r>
-          </w:p>
-        </w:tc>
-        <w:tc>
-          <w:tcPr>
-            <w:tcW w:type="dxa" w:w="6624"/>
-            <w:shd w:fill="F7F5F0"/>
-            <w:tcBorders>
-              <w:top w:val="single" w:sz="8" w:color="D0DCDC"/>
-              <w:left w:val="single" w:sz="8" w:color="D0DCDC"/>
-              <w:bottom w:val="single" w:sz="8" w:color="D0DCDC"/>
-              <w:right w:val="single" w:sz="8" w:color="D0DCDC"/>
-            </w:tcBorders>
-          </w:tcPr>
-          <w:p>
-            <w:r/>
-            <w:r>
-              <w:rPr>
-                <w:rFonts w:ascii="Calibri" w:hAnsi="Calibri" w:eastAsia="Calibri"/>
-                <w:b w:val="0"/>
-                <w:i w:val="0"/>
-                <w:color w:val="1E2F38"/>
-                <w:sz w:val="18"/>
-              </w:rPr>
-              <w:t>Aggregate exports for immunisation, ANC, NCD screening, disease surveillance</w:t>
-            </w:r>
-          </w:p>
-        </w:tc>
-      </w:tr>
-      <w:tr>
-        <w:tc>
-          <w:tcPr>
-            <w:tcW w:type="dxa" w:w="2880"/>
-            <w:tcBorders>
-              <w:top w:val="single" w:sz="8" w:color="D0DCDC"/>
-              <w:left w:val="single" w:sz="8" w:color="D0DCDC"/>
-              <w:bottom w:val="single" w:sz="8" w:color="D0DCDC"/>
-              <w:right w:val="single" w:sz="8" w:color="D0DCDC"/>
-            </w:tcBorders>
-          </w:tcPr>
-          <w:p>
-            <w:r/>
-            <w:r>
-              <w:rPr>
-                <w:rFonts w:ascii="Calibri" w:hAnsi="Calibri" w:eastAsia="Calibri"/>
-                <w:b w:val="0"/>
-                <w:i w:val="0"/>
-                <w:color w:val="1E2F38"/>
-                <w:sz w:val="18"/>
-              </w:rPr>
-              <w:t>Facility EMR</w:t>
-            </w:r>
-          </w:p>
-        </w:tc>
-        <w:tc>
-          <w:tcPr>
-            <w:tcW w:type="dxa" w:w="6624"/>
-            <w:tcBorders>
-              <w:top w:val="single" w:sz="8" w:color="D0DCDC"/>
-              <w:left w:val="single" w:sz="8" w:color="D0DCDC"/>
-              <w:bottom w:val="single" w:sz="8" w:color="D0DCDC"/>
-              <w:right w:val="single" w:sz="8" w:color="D0DCDC"/>
-            </w:tcBorders>
-          </w:tcPr>
-          <w:p>
-            <w:r/>
-            <w:r>
-              <w:rPr>
-                <w:rFonts w:ascii="Calibri" w:hAnsi="Calibri" w:eastAsia="Calibri"/>
-                <w:b w:val="0"/>
-                <w:i w:val="0"/>
-                <w:color w:val="1E2F38"/>
-                <w:sz w:val="18"/>
-              </w:rPr>
-              <w:t>Referral handoff and encounter linkage at FairBanks Medical Centre</w:t>
-            </w:r>
-          </w:p>
-        </w:tc>
-      </w:tr>
-      <w:tr>
-        <w:tc>
-          <w:tcPr>
-            <w:tcW w:type="dxa" w:w="2880"/>
-            <w:shd w:fill="F7F5F0"/>
-            <w:tcBorders>
-              <w:top w:val="single" w:sz="8" w:color="D0DCDC"/>
-              <w:left w:val="single" w:sz="8" w:color="D0DCDC"/>
-              <w:bottom w:val="single" w:sz="8" w:color="D0DCDC"/>
-              <w:right w:val="single" w:sz="8" w:color="D0DCDC"/>
-            </w:tcBorders>
-          </w:tcPr>
-          <w:p>
-            <w:r/>
-            <w:r>
-              <w:rPr>
-                <w:rFonts w:ascii="Calibri" w:hAnsi="Calibri" w:eastAsia="Calibri"/>
-                <w:b w:val="0"/>
-                <w:i w:val="0"/>
-                <w:color w:val="1E2F38"/>
-                <w:sz w:val="18"/>
-              </w:rPr>
-              <w:t>National warehouse / related systems</w:t>
-            </w:r>
-          </w:p>
-        </w:tc>
-        <w:tc>
-          <w:tcPr>
-            <w:tcW w:type="dxa" w:w="6624"/>
-            <w:shd w:fill="F7F5F0"/>
-            <w:tcBorders>
-              <w:top w:val="single" w:sz="8" w:color="D0DCDC"/>
-              <w:left w:val="single" w:sz="8" w:color="D0DCDC"/>
-              <w:bottom w:val="single" w:sz="8" w:color="D0DCDC"/>
-              <w:right w:val="single" w:sz="8" w:color="D0DCDC"/>
-            </w:tcBorders>
-          </w:tcPr>
-          <w:p>
-            <w:r/>
-            <w:r>
-              <w:rPr>
-                <w:rFonts w:ascii="Calibri" w:hAnsi="Calibri" w:eastAsia="Calibri"/>
-                <w:b w:val="0"/>
-                <w:i w:val="0"/>
-                <w:color w:val="1E2F38"/>
-                <w:sz w:val="18"/>
-              </w:rPr>
-              <w:t>Standardised JSON/API feeds when national schema is confirmed</w:t>
-            </w:r>
-          </w:p>
-        </w:tc>
-      </w:tr>
-    </w:tbl>
-    <w:p/>
-    <w:p>
-      <w:pPr>
-        <w:jc w:val="center"/>
-      </w:pPr>
-      <w:r>
-        <w:drawing>
-          <wp:inline xmlns:a="http://schemas.openxmlformats.org/drawingml/2006/main" xmlns:pic="http://schemas.openxmlformats.org/drawingml/2006/picture">
-            <wp:extent cx="4389120" cy="2926080"/>
-            <wp:docPr id="4" name="Picture 4"/>
-            <wp:cNvGraphicFramePr>
-              <a:graphicFrameLocks noChangeAspect="1"/>
-            </wp:cNvGraphicFramePr>
-            <a:graphic>
-              <a:graphicData uri="http://schemas.openxmlformats.org/drawingml/2006/picture">
-                <pic:pic>
-                  <pic:nvPicPr>
-                    <pic:cNvPr id="0" name="dashboard_demo_opt.jpg"/>
-                    <pic:cNvPicPr/>
-                  </pic:nvPicPr>
-                  <pic:blipFill>
-                    <a:blip r:embed="rId12"/>
-                    <a:stretch>
-                      <a:fillRect/>
-                    </a:stretch>
-                  </pic:blipFill>
-                  <pic:spPr>
-                    <a:xfrm>
-                      <a:off x="0" y="0"/>
-                      <a:ext cx="4389120" cy="2926080"/>
-                    </a:xfrm>
-                    <a:prstGeom prst="rect"/>
-                  </pic:spPr>
-                </pic:pic>
-              </a:graphicData>
-            </a:graphic>
-          </wp:inline>
-        </w:drawing>
-      </w:r>
-    </w:p>
-    <w:p>
-      <w:pPr>
-        <w:spacing w:after="160"/>
-        <w:jc w:val="center"/>
-      </w:pPr>
-      <w:r>
-        <w:rPr>
-          <w:rFonts w:ascii="Calibri" w:hAnsi="Calibri" w:eastAsia="Calibri"/>
-          <w:b w:val="0"/>
-          <w:i/>
-          <w:color w:val="3A4A54"/>
-          <w:sz w:val="16"/>
-        </w:rPr>
-        <w:t>Facility and programme dashboards for action</w:t>
-      </w:r>
-    </w:p>
-    <w:p>
-      <w:pPr>
-        <w:spacing w:before="240" w:after="100"/>
-      </w:pPr>
-      <w:r>
-        <w:rPr>
-          <w:rFonts w:ascii="Calibri" w:hAnsi="Calibri" w:eastAsia="Calibri"/>
-          <w:b/>
-          <w:i w:val="0"/>
-          <w:color w:val="0A1F2E"/>
-          <w:sz w:val="32"/>
-        </w:rPr>
-        <w:t>IX. Alignment with MOU Guiding Principles</w:t>
-      </w:r>
-    </w:p>
-    <w:tbl>
-      <w:tblPr>
-        <w:tblW w:type="auto" w:w="0"/>
-        <w:jc w:val="center"/>
-        <w:tblLook w:firstColumn="1" w:firstRow="1" w:lastColumn="0" w:lastRow="0" w:noHBand="0" w:noVBand="1" w:val="04A0"/>
-      </w:tblPr>
-      <w:tblGrid>
-        <w:gridCol w:w="4968"/>
-        <w:gridCol w:w="4968"/>
-      </w:tblGrid>
-      <w:tr>
-        <w:tc>
-          <w:tcPr>
-            <w:tcW w:type="dxa" w:w="3168"/>
-            <w:shd w:fill="0D6E6E"/>
-            <w:tcBorders>
-              <w:top w:val="single" w:sz="8" w:color="0D6E6E"/>
-              <w:left w:val="single" w:sz="8" w:color="0D6E6E"/>
-              <w:bottom w:val="single" w:sz="8" w:color="0D6E6E"/>
-              <w:right w:val="single" w:sz="8" w:color="0D6E6E"/>
-            </w:tcBorders>
-          </w:tcPr>
-          <w:p>
-            <w:r/>
-            <w:r>
-              <w:rPr>
-                <w:rFonts w:ascii="Calibri" w:hAnsi="Calibri" w:eastAsia="Calibri"/>
-                <w:b/>
-                <w:i w:val="0"/>
-                <w:color w:val="FFFFFF"/>
-                <w:sz w:val="18"/>
+                <w:sz w:val="20"/>
               </w:rPr>
               <w:t>Principle</w:t>
             </w:r>
@@ -1720,24 +1965,23 @@
         </w:tc>
         <w:tc>
           <w:tcPr>
-            <w:tcW w:type="dxa" w:w="6336"/>
-            <w:shd w:fill="0D6E6E"/>
+            <w:tcW w:type="dxa" w:w="6192"/>
+            <w:shd w:fill="E8EEEE"/>
             <w:tcBorders>
-              <w:top w:val="single" w:sz="8" w:color="0D6E6E"/>
-              <w:left w:val="single" w:sz="8" w:color="0D6E6E"/>
-              <w:bottom w:val="single" w:sz="8" w:color="0D6E6E"/>
-              <w:right w:val="single" w:sz="8" w:color="0D6E6E"/>
+              <w:top w:val="single" w:sz="4" w:color="888888"/>
+              <w:left w:val="single" w:sz="4" w:color="888888"/>
+              <w:bottom w:val="single" w:sz="4" w:color="888888"/>
+              <w:right w:val="single" w:sz="4" w:color="888888"/>
             </w:tcBorders>
           </w:tcPr>
           <w:p>
             <w:r/>
             <w:r>
               <w:rPr>
-                <w:rFonts w:ascii="Calibri" w:hAnsi="Calibri" w:eastAsia="Calibri"/>
+                <w:rFonts w:ascii="Times New Roman" w:hAnsi="Times New Roman" w:eastAsia="Times New Roman"/>
                 <w:b/>
                 <w:i w:val="0"/>
-                <w:color w:val="FFFFFF"/>
-                <w:sz w:val="18"/>
+                <w:sz w:val="20"/>
               </w:rPr>
               <w:t>How FairBanks responds</w:t>
             </w:r>
@@ -1749,21 +1993,20 @@
           <w:tcPr>
             <w:tcW w:type="dxa" w:w="3168"/>
             <w:tcBorders>
-              <w:top w:val="single" w:sz="8" w:color="D0DCDC"/>
-              <w:left w:val="single" w:sz="8" w:color="D0DCDC"/>
-              <w:bottom w:val="single" w:sz="8" w:color="D0DCDC"/>
-              <w:right w:val="single" w:sz="8" w:color="D0DCDC"/>
+              <w:top w:val="single" w:sz="4" w:color="888888"/>
+              <w:left w:val="single" w:sz="4" w:color="888888"/>
+              <w:bottom w:val="single" w:sz="4" w:color="888888"/>
+              <w:right w:val="single" w:sz="4" w:color="888888"/>
             </w:tcBorders>
           </w:tcPr>
           <w:p>
             <w:r/>
             <w:r>
               <w:rPr>
-                <w:rFonts w:ascii="Calibri" w:hAnsi="Calibri" w:eastAsia="Calibri"/>
+                <w:rFonts w:ascii="Times New Roman" w:hAnsi="Times New Roman" w:eastAsia="Times New Roman"/>
                 <w:b w:val="0"/>
                 <w:i w:val="0"/>
-                <w:color w:val="1E2F38"/>
-                <w:sz w:val="18"/>
+                <w:sz w:val="20"/>
               </w:rPr>
               <w:t>Sustainability &amp; country ownership</w:t>
             </w:r>
@@ -1771,25 +2014,24 @@
         </w:tc>
         <w:tc>
           <w:tcPr>
-            <w:tcW w:type="dxa" w:w="6336"/>
+            <w:tcW w:type="dxa" w:w="6192"/>
             <w:tcBorders>
-              <w:top w:val="single" w:sz="8" w:color="D0DCDC"/>
-              <w:left w:val="single" w:sz="8" w:color="D0DCDC"/>
-              <w:bottom w:val="single" w:sz="8" w:color="D0DCDC"/>
-              <w:right w:val="single" w:sz="8" w:color="D0DCDC"/>
+              <w:top w:val="single" w:sz="4" w:color="888888"/>
+              <w:left w:val="single" w:sz="4" w:color="888888"/>
+              <w:bottom w:val="single" w:sz="4" w:color="888888"/>
+              <w:right w:val="single" w:sz="4" w:color="888888"/>
             </w:tcBorders>
           </w:tcPr>
           <w:p>
             <w:r/>
             <w:r>
               <w:rPr>
-                <w:rFonts w:ascii="Calibri" w:hAnsi="Calibri" w:eastAsia="Calibri"/>
+                <w:rFonts w:ascii="Times New Roman" w:hAnsi="Times New Roman" w:eastAsia="Times New Roman"/>
                 <w:b w:val="0"/>
                 <w:i w:val="0"/>
-                <w:color w:val="1E2F38"/>
-                <w:sz w:val="18"/>
+                <w:sz w:val="20"/>
               </w:rPr>
-              <w:t>Design for MoH alignment and staged transfer of operations</w:t>
+              <w:t>Design for MoH/NDHA alignment and staged transfer of operations</w:t>
             </w:r>
           </w:p>
         </w:tc>
@@ -1798,23 +2040,21 @@
         <w:tc>
           <w:tcPr>
             <w:tcW w:type="dxa" w:w="3168"/>
-            <w:shd w:fill="F7F5F0"/>
             <w:tcBorders>
-              <w:top w:val="single" w:sz="8" w:color="D0DCDC"/>
-              <w:left w:val="single" w:sz="8" w:color="D0DCDC"/>
-              <w:bottom w:val="single" w:sz="8" w:color="D0DCDC"/>
-              <w:right w:val="single" w:sz="8" w:color="D0DCDC"/>
+              <w:top w:val="single" w:sz="4" w:color="888888"/>
+              <w:left w:val="single" w:sz="4" w:color="888888"/>
+              <w:bottom w:val="single" w:sz="4" w:color="888888"/>
+              <w:right w:val="single" w:sz="4" w:color="888888"/>
             </w:tcBorders>
           </w:tcPr>
           <w:p>
             <w:r/>
             <w:r>
               <w:rPr>
-                <w:rFonts w:ascii="Calibri" w:hAnsi="Calibri" w:eastAsia="Calibri"/>
+                <w:rFonts w:ascii="Times New Roman" w:hAnsi="Times New Roman" w:eastAsia="Times New Roman"/>
                 <w:b w:val="0"/>
                 <w:i w:val="0"/>
-                <w:color w:val="1E2F38"/>
-                <w:sz w:val="18"/>
+                <w:sz w:val="20"/>
               </w:rPr>
               <w:t>Protect essential services</w:t>
             </w:r>
@@ -1822,24 +2062,22 @@
         </w:tc>
         <w:tc>
           <w:tcPr>
-            <w:tcW w:type="dxa" w:w="6336"/>
-            <w:shd w:fill="F7F5F0"/>
+            <w:tcW w:type="dxa" w:w="6192"/>
             <w:tcBorders>
-              <w:top w:val="single" w:sz="8" w:color="D0DCDC"/>
-              <w:left w:val="single" w:sz="8" w:color="D0DCDC"/>
-              <w:bottom w:val="single" w:sz="8" w:color="D0DCDC"/>
-              <w:right w:val="single" w:sz="8" w:color="D0DCDC"/>
+              <w:top w:val="single" w:sz="4" w:color="888888"/>
+              <w:left w:val="single" w:sz="4" w:color="888888"/>
+              <w:bottom w:val="single" w:sz="4" w:color="888888"/>
+              <w:right w:val="single" w:sz="4" w:color="888888"/>
             </w:tcBorders>
           </w:tcPr>
           <w:p>
             <w:r/>
             <w:r>
               <w:rPr>
-                <w:rFonts w:ascii="Calibri" w:hAnsi="Calibri" w:eastAsia="Calibri"/>
+                <w:rFonts w:ascii="Times New Roman" w:hAnsi="Times New Roman" w:eastAsia="Times New Roman"/>
                 <w:b w:val="0"/>
                 <w:i w:val="0"/>
-                <w:color w:val="1E2F38"/>
-                <w:sz w:val="18"/>
+                <w:sz w:val="20"/>
               </w:rPr>
               <w:t>Digital workflows reinforce HIV, TB, malaria, MNCH, immunisation</w:t>
             </w:r>
@@ -1851,47 +2089,45 @@
           <w:tcPr>
             <w:tcW w:type="dxa" w:w="3168"/>
             <w:tcBorders>
-              <w:top w:val="single" w:sz="8" w:color="D0DCDC"/>
-              <w:left w:val="single" w:sz="8" w:color="D0DCDC"/>
-              <w:bottom w:val="single" w:sz="8" w:color="D0DCDC"/>
-              <w:right w:val="single" w:sz="8" w:color="D0DCDC"/>
+              <w:top w:val="single" w:sz="4" w:color="888888"/>
+              <w:left w:val="single" w:sz="4" w:color="888888"/>
+              <w:bottom w:val="single" w:sz="4" w:color="888888"/>
+              <w:right w:val="single" w:sz="4" w:color="888888"/>
             </w:tcBorders>
           </w:tcPr>
           <w:p>
             <w:r/>
             <w:r>
               <w:rPr>
-                <w:rFonts w:ascii="Calibri" w:hAnsi="Calibri" w:eastAsia="Calibri"/>
+                <w:rFonts w:ascii="Times New Roman" w:hAnsi="Times New Roman" w:eastAsia="Times New Roman"/>
                 <w:b w:val="0"/>
                 <w:i w:val="0"/>
-                <w:color w:val="1E2F38"/>
-                <w:sz w:val="18"/>
+                <w:sz w:val="20"/>
               </w:rPr>
-              <w:t>Data-driven accountability</w:t>
+              <w:t>Data for action &amp; accountability</w:t>
             </w:r>
           </w:p>
         </w:tc>
         <w:tc>
           <w:tcPr>
-            <w:tcW w:type="dxa" w:w="6336"/>
+            <w:tcW w:type="dxa" w:w="6192"/>
             <w:tcBorders>
-              <w:top w:val="single" w:sz="8" w:color="D0DCDC"/>
-              <w:left w:val="single" w:sz="8" w:color="D0DCDC"/>
-              <w:bottom w:val="single" w:sz="8" w:color="D0DCDC"/>
-              <w:right w:val="single" w:sz="8" w:color="D0DCDC"/>
+              <w:top w:val="single" w:sz="4" w:color="888888"/>
+              <w:left w:val="single" w:sz="4" w:color="888888"/>
+              <w:bottom w:val="single" w:sz="4" w:color="888888"/>
+              <w:right w:val="single" w:sz="4" w:color="888888"/>
             </w:tcBorders>
           </w:tcPr>
           <w:p>
             <w:r/>
             <w:r>
               <w:rPr>
-                <w:rFonts w:ascii="Calibri" w:hAnsi="Calibri" w:eastAsia="Calibri"/>
+                <w:rFonts w:ascii="Times New Roman" w:hAnsi="Times New Roman" w:eastAsia="Times New Roman"/>
                 <w:b w:val="0"/>
                 <w:i w:val="0"/>
-                <w:color w:val="1E2F38"/>
-                <w:sz w:val="18"/>
+                <w:sz w:val="20"/>
               </w:rPr>
-              <w:t>Quality data for decisions - not parallel reporting burden</w:t>
+              <w:t>Quality data into GOU systems - used for decisions, not parallel burden</w:t>
             </w:r>
           </w:p>
         </w:tc>
@@ -1900,23 +2136,21 @@
         <w:tc>
           <w:tcPr>
             <w:tcW w:type="dxa" w:w="3168"/>
-            <w:shd w:fill="F7F5F0"/>
             <w:tcBorders>
-              <w:top w:val="single" w:sz="8" w:color="D0DCDC"/>
-              <w:left w:val="single" w:sz="8" w:color="D0DCDC"/>
-              <w:bottom w:val="single" w:sz="8" w:color="D0DCDC"/>
-              <w:right w:val="single" w:sz="8" w:color="D0DCDC"/>
+              <w:top w:val="single" w:sz="4" w:color="888888"/>
+              <w:left w:val="single" w:sz="4" w:color="888888"/>
+              <w:bottom w:val="single" w:sz="4" w:color="888888"/>
+              <w:right w:val="single" w:sz="4" w:color="888888"/>
             </w:tcBorders>
           </w:tcPr>
           <w:p>
             <w:r/>
             <w:r>
               <w:rPr>
-                <w:rFonts w:ascii="Calibri" w:hAnsi="Calibri" w:eastAsia="Calibri"/>
+                <w:rFonts w:ascii="Times New Roman" w:hAnsi="Times New Roman" w:eastAsia="Times New Roman"/>
                 <w:b w:val="0"/>
                 <w:i w:val="0"/>
-                <w:color w:val="1E2F38"/>
-                <w:sz w:val="18"/>
+                <w:sz w:val="20"/>
               </w:rPr>
               <w:t>Integrated, people-centred care</w:t>
             </w:r>
@@ -1924,24 +2158,22 @@
         </w:tc>
         <w:tc>
           <w:tcPr>
-            <w:tcW w:type="dxa" w:w="6336"/>
-            <w:shd w:fill="F7F5F0"/>
+            <w:tcW w:type="dxa" w:w="6192"/>
             <w:tcBorders>
-              <w:top w:val="single" w:sz="8" w:color="D0DCDC"/>
-              <w:left w:val="single" w:sz="8" w:color="D0DCDC"/>
-              <w:bottom w:val="single" w:sz="8" w:color="D0DCDC"/>
-              <w:right w:val="single" w:sz="8" w:color="D0DCDC"/>
+              <w:top w:val="single" w:sz="4" w:color="888888"/>
+              <w:left w:val="single" w:sz="4" w:color="888888"/>
+              <w:bottom w:val="single" w:sz="4" w:color="888888"/>
+              <w:right w:val="single" w:sz="4" w:color="888888"/>
             </w:tcBorders>
           </w:tcPr>
           <w:p>
             <w:r/>
             <w:r>
               <w:rPr>
-                <w:rFonts w:ascii="Calibri" w:hAnsi="Calibri" w:eastAsia="Calibri"/>
+                <w:rFonts w:ascii="Times New Roman" w:hAnsi="Times New Roman" w:eastAsia="Times New Roman"/>
                 <w:b w:val="0"/>
                 <w:i w:val="0"/>
-                <w:color w:val="1E2F38"/>
-                <w:sz w:val="18"/>
+                <w:sz w:val="20"/>
               </w:rPr>
               <w:t>One community-to-facility loop; less fragmentation</w:t>
             </w:r>
@@ -1953,21 +2185,20 @@
           <w:tcPr>
             <w:tcW w:type="dxa" w:w="3168"/>
             <w:tcBorders>
-              <w:top w:val="single" w:sz="8" w:color="D0DCDC"/>
-              <w:left w:val="single" w:sz="8" w:color="D0DCDC"/>
-              <w:bottom w:val="single" w:sz="8" w:color="D0DCDC"/>
-              <w:right w:val="single" w:sz="8" w:color="D0DCDC"/>
+              <w:top w:val="single" w:sz="4" w:color="888888"/>
+              <w:left w:val="single" w:sz="4" w:color="888888"/>
+              <w:bottom w:val="single" w:sz="4" w:color="888888"/>
+              <w:right w:val="single" w:sz="4" w:color="888888"/>
             </w:tcBorders>
           </w:tcPr>
           <w:p>
             <w:r/>
             <w:r>
               <w:rPr>
-                <w:rFonts w:ascii="Calibri" w:hAnsi="Calibri" w:eastAsia="Calibri"/>
+                <w:rFonts w:ascii="Times New Roman" w:hAnsi="Times New Roman" w:eastAsia="Times New Roman"/>
                 <w:b w:val="0"/>
                 <w:i w:val="0"/>
-                <w:color w:val="1E2F38"/>
-                <w:sz w:val="18"/>
+                <w:sz w:val="20"/>
               </w:rPr>
               <w:t>Local partnerships</w:t>
             </w:r>
@@ -1975,23 +2206,22 @@
         </w:tc>
         <w:tc>
           <w:tcPr>
-            <w:tcW w:type="dxa" w:w="6336"/>
+            <w:tcW w:type="dxa" w:w="6192"/>
             <w:tcBorders>
-              <w:top w:val="single" w:sz="8" w:color="D0DCDC"/>
-              <w:left w:val="single" w:sz="8" w:color="D0DCDC"/>
-              <w:bottom w:val="single" w:sz="8" w:color="D0DCDC"/>
-              <w:right w:val="single" w:sz="8" w:color="D0DCDC"/>
+              <w:top w:val="single" w:sz="4" w:color="888888"/>
+              <w:left w:val="single" w:sz="4" w:color="888888"/>
+              <w:bottom w:val="single" w:sz="4" w:color="888888"/>
+              <w:right w:val="single" w:sz="4" w:color="888888"/>
             </w:tcBorders>
           </w:tcPr>
           <w:p>
             <w:r/>
             <w:r>
               <w:rPr>
-                <w:rFonts w:ascii="Calibri" w:hAnsi="Calibri" w:eastAsia="Calibri"/>
+                <w:rFonts w:ascii="Times New Roman" w:hAnsi="Times New Roman" w:eastAsia="Times New Roman"/>
                 <w:b w:val="0"/>
                 <w:i w:val="0"/>
-                <w:color w:val="1E2F38"/>
-                <w:sz w:val="18"/>
+                <w:sz w:val="20"/>
               </w:rPr>
               <w:t>Government, CHWs/VHTs, CBOs, academic and NGO partners</w:t>
             </w:r>
@@ -2002,50 +2232,94 @@
         <w:tc>
           <w:tcPr>
             <w:tcW w:type="dxa" w:w="3168"/>
-            <w:shd w:fill="F7F5F0"/>
             <w:tcBorders>
-              <w:top w:val="single" w:sz="8" w:color="D0DCDC"/>
-              <w:left w:val="single" w:sz="8" w:color="D0DCDC"/>
-              <w:bottom w:val="single" w:sz="8" w:color="D0DCDC"/>
-              <w:right w:val="single" w:sz="8" w:color="D0DCDC"/>
+              <w:top w:val="single" w:sz="4" w:color="888888"/>
+              <w:left w:val="single" w:sz="4" w:color="888888"/>
+              <w:bottom w:val="single" w:sz="4" w:color="888888"/>
+              <w:right w:val="single" w:sz="4" w:color="888888"/>
             </w:tcBorders>
           </w:tcPr>
           <w:p>
             <w:r/>
             <w:r>
               <w:rPr>
-                <w:rFonts w:ascii="Calibri" w:hAnsi="Calibri" w:eastAsia="Calibri"/>
+                <w:rFonts w:ascii="Times New Roman" w:hAnsi="Times New Roman" w:eastAsia="Times New Roman"/>
                 <w:b w:val="0"/>
                 <w:i w:val="0"/>
-                <w:color w:val="1E2F38"/>
-                <w:sz w:val="18"/>
+                <w:sz w:val="20"/>
               </w:rPr>
-              <w:t>Evidence-based programming</w:t>
+              <w:t>Evidence-based &amp; context fit</w:t>
             </w:r>
           </w:p>
         </w:tc>
         <w:tc>
           <w:tcPr>
-            <w:tcW w:type="dxa" w:w="6336"/>
-            <w:shd w:fill="F7F5F0"/>
+            <w:tcW w:type="dxa" w:w="6192"/>
             <w:tcBorders>
-              <w:top w:val="single" w:sz="8" w:color="D0DCDC"/>
-              <w:left w:val="single" w:sz="8" w:color="D0DCDC"/>
-              <w:bottom w:val="single" w:sz="8" w:color="D0DCDC"/>
-              <w:right w:val="single" w:sz="8" w:color="D0DCDC"/>
+              <w:top w:val="single" w:sz="4" w:color="888888"/>
+              <w:left w:val="single" w:sz="4" w:color="888888"/>
+              <w:bottom w:val="single" w:sz="4" w:color="888888"/>
+              <w:right w:val="single" w:sz="4" w:color="888888"/>
             </w:tcBorders>
           </w:tcPr>
           <w:p>
             <w:r/>
             <w:r>
               <w:rPr>
-                <w:rFonts w:ascii="Calibri" w:hAnsi="Calibri" w:eastAsia="Calibri"/>
+                <w:rFonts w:ascii="Times New Roman" w:hAnsi="Times New Roman" w:eastAsia="Times New Roman"/>
                 <w:b w:val="0"/>
                 <w:i w:val="0"/>
-                <w:color w:val="1E2F38"/>
-                <w:sz w:val="18"/>
+                <w:sz w:val="20"/>
               </w:rPr>
               <w:t>Pilot in live catchments; measure; refine before scale</w:t>
+            </w:r>
+          </w:p>
+        </w:tc>
+      </w:tr>
+      <w:tr>
+        <w:tc>
+          <w:tcPr>
+            <w:tcW w:type="dxa" w:w="3168"/>
+            <w:tcBorders>
+              <w:top w:val="single" w:sz="4" w:color="888888"/>
+              <w:left w:val="single" w:sz="4" w:color="888888"/>
+              <w:bottom w:val="single" w:sz="4" w:color="888888"/>
+              <w:right w:val="single" w:sz="4" w:color="888888"/>
+            </w:tcBorders>
+          </w:tcPr>
+          <w:p>
+            <w:r/>
+            <w:r>
+              <w:rPr>
+                <w:rFonts w:ascii="Times New Roman" w:hAnsi="Times New Roman" w:eastAsia="Times New Roman"/>
+                <w:b w:val="0"/>
+                <w:i w:val="0"/>
+                <w:sz w:val="20"/>
+              </w:rPr>
+              <w:t>Oversight &amp; coordination</w:t>
+            </w:r>
+          </w:p>
+        </w:tc>
+        <w:tc>
+          <w:tcPr>
+            <w:tcW w:type="dxa" w:w="6192"/>
+            <w:tcBorders>
+              <w:top w:val="single" w:sz="4" w:color="888888"/>
+              <w:left w:val="single" w:sz="4" w:color="888888"/>
+              <w:bottom w:val="single" w:sz="4" w:color="888888"/>
+              <w:right w:val="single" w:sz="4" w:color="888888"/>
+            </w:tcBorders>
+          </w:tcPr>
+          <w:p>
+            <w:r/>
+            <w:r>
+              <w:rPr>
+                <w:rFonts w:ascii="Times New Roman" w:hAnsi="Times New Roman" w:eastAsia="Times New Roman"/>
+                <w:b w:val="0"/>
+                <w:i w:val="0"/>
+                <w:sz w:val="20"/>
+              </w:rPr>
+              <w:t>Align with MoH priorities and designated review platforms</w:t>
             </w:r>
           </w:p>
         </w:tc>
@@ -2054,399 +2328,493 @@
     <w:p/>
     <w:p>
       <w:pPr>
-        <w:spacing w:before="240" w:after="100"/>
+        <w:spacing w:before="240" w:after="120" w:line="240" w:lineRule="auto"/>
       </w:pPr>
       <w:r>
         <w:rPr>
-          <w:rFonts w:ascii="Calibri" w:hAnsi="Calibri" w:eastAsia="Calibri"/>
+          <w:rFonts w:ascii="Times New Roman" w:hAnsi="Times New Roman" w:eastAsia="Times New Roman"/>
           <w:b/>
           <w:i w:val="0"/>
-          <w:color w:val="0A1F2E"/>
-          <w:sz w:val="32"/>
+          <w:sz w:val="24"/>
         </w:rPr>
-        <w:t>X. Geographic Focus</w:t>
+        <w:t>7. List of Partner Roles and Responsibilities (preliminary)</w:t>
       </w:r>
     </w:p>
     <w:p>
       <w:pPr>
-        <w:pStyle w:val="ListBullet"/>
-        <w:spacing w:after="40"/>
+        <w:spacing w:before="0" w:after="120" w:line="240" w:lineRule="auto"/>
+        <w:jc w:val="left"/>
       </w:pPr>
       <w:r>
         <w:rPr>
-          <w:rFonts w:ascii="Calibri" w:hAnsi="Calibri" w:eastAsia="Calibri"/>
+          <w:rFonts w:ascii="Times New Roman" w:hAnsi="Times New Roman" w:eastAsia="Times New Roman"/>
           <w:b w:val="0"/>
           <w:i w:val="0"/>
-          <w:color w:val="1E2F38"/>
-          <w:sz w:val="20"/>
+          <w:sz w:val="24"/>
         </w:rPr>
-        <w:t>Primary pilot: FairBanks catchment - Kampala-area communities with live CHW operations.</w:t>
+        <w:t>Partners below are preliminary characterisations for Phase 1. Roles, contacts, and any subrecipient federal-share splits will be refined in Phase 2 / co-design if invited. At SOI stage, FairBanks Medical Centre is proposed as prime applicant.</w:t>
+      </w:r>
+    </w:p>
+    <w:tbl>
+      <w:tblPr>
+        <w:tblW w:type="auto" w:w="0"/>
+        <w:jc w:val="center"/>
+        <w:tblLook w:firstColumn="1" w:firstRow="1" w:lastColumn="0" w:lastRow="0" w:noHBand="0" w:noVBand="1" w:val="04A0"/>
+      </w:tblPr>
+      <w:tblGrid>
+        <w:gridCol w:w="4680"/>
+        <w:gridCol w:w="4680"/>
+      </w:tblGrid>
+      <w:tr>
+        <w:tc>
+          <w:tcPr>
+            <w:tcW w:type="dxa" w:w="3456"/>
+            <w:shd w:fill="E8EEEE"/>
+            <w:tcBorders>
+              <w:top w:val="single" w:sz="4" w:color="888888"/>
+              <w:left w:val="single" w:sz="4" w:color="888888"/>
+              <w:bottom w:val="single" w:sz="4" w:color="888888"/>
+              <w:right w:val="single" w:sz="4" w:color="888888"/>
+            </w:tcBorders>
+          </w:tcPr>
+          <w:p>
+            <w:r/>
+            <w:r>
+              <w:rPr>
+                <w:rFonts w:ascii="Times New Roman" w:hAnsi="Times New Roman" w:eastAsia="Times New Roman"/>
+                <w:b/>
+                <w:i w:val="0"/>
+                <w:sz w:val="20"/>
+              </w:rPr>
+              <w:t>Partner</w:t>
+            </w:r>
+          </w:p>
+        </w:tc>
+        <w:tc>
+          <w:tcPr>
+            <w:tcW w:type="dxa" w:w="5904"/>
+            <w:shd w:fill="E8EEEE"/>
+            <w:tcBorders>
+              <w:top w:val="single" w:sz="4" w:color="888888"/>
+              <w:left w:val="single" w:sz="4" w:color="888888"/>
+              <w:bottom w:val="single" w:sz="4" w:color="888888"/>
+              <w:right w:val="single" w:sz="4" w:color="888888"/>
+            </w:tcBorders>
+          </w:tcPr>
+          <w:p>
+            <w:r/>
+            <w:r>
+              <w:rPr>
+                <w:rFonts w:ascii="Times New Roman" w:hAnsi="Times New Roman" w:eastAsia="Times New Roman"/>
+                <w:b/>
+                <w:i w:val="0"/>
+                <w:sz w:val="20"/>
+              </w:rPr>
+              <w:t>Proposed role (summary)</w:t>
+            </w:r>
+          </w:p>
+        </w:tc>
+      </w:tr>
+      <w:tr>
+        <w:tc>
+          <w:tcPr>
+            <w:tcW w:type="dxa" w:w="3456"/>
+            <w:tcBorders>
+              <w:top w:val="single" w:sz="4" w:color="888888"/>
+              <w:left w:val="single" w:sz="4" w:color="888888"/>
+              <w:bottom w:val="single" w:sz="4" w:color="888888"/>
+              <w:right w:val="single" w:sz="4" w:color="888888"/>
+            </w:tcBorders>
+          </w:tcPr>
+          <w:p>
+            <w:r/>
+            <w:r>
+              <w:rPr>
+                <w:rFonts w:ascii="Times New Roman" w:hAnsi="Times New Roman" w:eastAsia="Times New Roman"/>
+                <w:b w:val="0"/>
+                <w:i w:val="0"/>
+                <w:sz w:val="20"/>
+              </w:rPr>
+              <w:t>Ministry of Health (digital health / community health)</w:t>
+            </w:r>
+          </w:p>
+        </w:tc>
+        <w:tc>
+          <w:tcPr>
+            <w:tcW w:type="dxa" w:w="5904"/>
+            <w:tcBorders>
+              <w:top w:val="single" w:sz="4" w:color="888888"/>
+              <w:left w:val="single" w:sz="4" w:color="888888"/>
+              <w:bottom w:val="single" w:sz="4" w:color="888888"/>
+              <w:right w:val="single" w:sz="4" w:color="888888"/>
+            </w:tcBorders>
+          </w:tcPr>
+          <w:p>
+            <w:r/>
+            <w:r>
+              <w:rPr>
+                <w:rFonts w:ascii="Times New Roman" w:hAnsi="Times New Roman" w:eastAsia="Times New Roman"/>
+                <w:b w:val="0"/>
+                <w:i w:val="0"/>
+                <w:sz w:val="20"/>
+              </w:rPr>
+              <w:t>Alignment with NDHA, eCHIS, and national reporting; review of interfaces and transfer plan</w:t>
+            </w:r>
+          </w:p>
+        </w:tc>
+      </w:tr>
+      <w:tr>
+        <w:tc>
+          <w:tcPr>
+            <w:tcW w:type="dxa" w:w="3456"/>
+            <w:tcBorders>
+              <w:top w:val="single" w:sz="4" w:color="888888"/>
+              <w:left w:val="single" w:sz="4" w:color="888888"/>
+              <w:bottom w:val="single" w:sz="4" w:color="888888"/>
+              <w:right w:val="single" w:sz="4" w:color="888888"/>
+            </w:tcBorders>
+          </w:tcPr>
+          <w:p>
+            <w:r/>
+            <w:r>
+              <w:rPr>
+                <w:rFonts w:ascii="Times New Roman" w:hAnsi="Times New Roman" w:eastAsia="Times New Roman"/>
+                <w:b w:val="0"/>
+                <w:i w:val="0"/>
+                <w:sz w:val="20"/>
+              </w:rPr>
+              <w:t>District health teams (pilot geography)</w:t>
+            </w:r>
+          </w:p>
+        </w:tc>
+        <w:tc>
+          <w:tcPr>
+            <w:tcW w:type="dxa" w:w="5904"/>
+            <w:tcBorders>
+              <w:top w:val="single" w:sz="4" w:color="888888"/>
+              <w:left w:val="single" w:sz="4" w:color="888888"/>
+              <w:bottom w:val="single" w:sz="4" w:color="888888"/>
+              <w:right w:val="single" w:sz="4" w:color="888888"/>
+            </w:tcBorders>
+          </w:tcPr>
+          <w:p>
+            <w:r/>
+            <w:r>
+              <w:rPr>
+                <w:rFonts w:ascii="Times New Roman" w:hAnsi="Times New Roman" w:eastAsia="Times New Roman"/>
+                <w:b w:val="0"/>
+                <w:i w:val="0"/>
+                <w:sz w:val="20"/>
+              </w:rPr>
+              <w:t>Aggregate reporting validation, dashboard use, readiness dialogue</w:t>
+            </w:r>
+          </w:p>
+        </w:tc>
+      </w:tr>
+      <w:tr>
+        <w:tc>
+          <w:tcPr>
+            <w:tcW w:type="dxa" w:w="3456"/>
+            <w:tcBorders>
+              <w:top w:val="single" w:sz="4" w:color="888888"/>
+              <w:left w:val="single" w:sz="4" w:color="888888"/>
+              <w:bottom w:val="single" w:sz="4" w:color="888888"/>
+              <w:right w:val="single" w:sz="4" w:color="888888"/>
+            </w:tcBorders>
+          </w:tcPr>
+          <w:p>
+            <w:r/>
+            <w:r>
+              <w:rPr>
+                <w:rFonts w:ascii="Times New Roman" w:hAnsi="Times New Roman" w:eastAsia="Times New Roman"/>
+                <w:b w:val="0"/>
+                <w:i w:val="0"/>
+                <w:sz w:val="20"/>
+              </w:rPr>
+              <w:t>CHWs, VHTs, and community leaders</w:t>
+            </w:r>
+          </w:p>
+        </w:tc>
+        <w:tc>
+          <w:tcPr>
+            <w:tcW w:type="dxa" w:w="5904"/>
+            <w:tcBorders>
+              <w:top w:val="single" w:sz="4" w:color="888888"/>
+              <w:left w:val="single" w:sz="4" w:color="888888"/>
+              <w:bottom w:val="single" w:sz="4" w:color="888888"/>
+              <w:right w:val="single" w:sz="4" w:color="888888"/>
+            </w:tcBorders>
+          </w:tcPr>
+          <w:p>
+            <w:r/>
+            <w:r>
+              <w:rPr>
+                <w:rFonts w:ascii="Times New Roman" w:hAnsi="Times New Roman" w:eastAsia="Times New Roman"/>
+                <w:b w:val="0"/>
+                <w:i w:val="0"/>
+                <w:sz w:val="20"/>
+              </w:rPr>
+              <w:t>Primary data partners; co-design of forms and alerts</w:t>
+            </w:r>
+          </w:p>
+        </w:tc>
+      </w:tr>
+      <w:tr>
+        <w:tc>
+          <w:tcPr>
+            <w:tcW w:type="dxa" w:w="3456"/>
+            <w:tcBorders>
+              <w:top w:val="single" w:sz="4" w:color="888888"/>
+              <w:left w:val="single" w:sz="4" w:color="888888"/>
+              <w:bottom w:val="single" w:sz="4" w:color="888888"/>
+              <w:right w:val="single" w:sz="4" w:color="888888"/>
+            </w:tcBorders>
+          </w:tcPr>
+          <w:p>
+            <w:r/>
+            <w:r>
+              <w:rPr>
+                <w:rFonts w:ascii="Times New Roman" w:hAnsi="Times New Roman" w:eastAsia="Times New Roman"/>
+                <w:b w:val="0"/>
+                <w:i w:val="0"/>
+                <w:sz w:val="20"/>
+              </w:rPr>
+              <w:t>Academic partners (to be confirmed at Phase 2)</w:t>
+            </w:r>
+          </w:p>
+        </w:tc>
+        <w:tc>
+          <w:tcPr>
+            <w:tcW w:type="dxa" w:w="5904"/>
+            <w:tcBorders>
+              <w:top w:val="single" w:sz="4" w:color="888888"/>
+              <w:left w:val="single" w:sz="4" w:color="888888"/>
+              <w:bottom w:val="single" w:sz="4" w:color="888888"/>
+              <w:right w:val="single" w:sz="4" w:color="888888"/>
+            </w:tcBorders>
+          </w:tcPr>
+          <w:p>
+            <w:r/>
+            <w:r>
+              <w:rPr>
+                <w:rFonts w:ascii="Times New Roman" w:hAnsi="Times New Roman" w:eastAsia="Times New Roman"/>
+                <w:b w:val="0"/>
+                <w:i w:val="0"/>
+                <w:sz w:val="20"/>
+              </w:rPr>
+              <w:t>Evaluation support and interoperability testing</w:t>
+            </w:r>
+          </w:p>
+        </w:tc>
+      </w:tr>
+      <w:tr>
+        <w:tc>
+          <w:tcPr>
+            <w:tcW w:type="dxa" w:w="3456"/>
+            <w:tcBorders>
+              <w:top w:val="single" w:sz="4" w:color="888888"/>
+              <w:left w:val="single" w:sz="4" w:color="888888"/>
+              <w:bottom w:val="single" w:sz="4" w:color="888888"/>
+              <w:right w:val="single" w:sz="4" w:color="888888"/>
+            </w:tcBorders>
+          </w:tcPr>
+          <w:p>
+            <w:r/>
+            <w:r>
+              <w:rPr>
+                <w:rFonts w:ascii="Times New Roman" w:hAnsi="Times New Roman" w:eastAsia="Times New Roman"/>
+                <w:b w:val="0"/>
+                <w:i w:val="0"/>
+                <w:sz w:val="20"/>
+              </w:rPr>
+              <w:t>NGOs / CBOs collaborating with FairBanks Community Reach</w:t>
+            </w:r>
+          </w:p>
+        </w:tc>
+        <w:tc>
+          <w:tcPr>
+            <w:tcW w:type="dxa" w:w="5904"/>
+            <w:tcBorders>
+              <w:top w:val="single" w:sz="4" w:color="888888"/>
+              <w:left w:val="single" w:sz="4" w:color="888888"/>
+              <w:bottom w:val="single" w:sz="4" w:color="888888"/>
+              <w:right w:val="single" w:sz="4" w:color="888888"/>
+            </w:tcBorders>
+          </w:tcPr>
+          <w:p>
+            <w:r/>
+            <w:r>
+              <w:rPr>
+                <w:rFonts w:ascii="Times New Roman" w:hAnsi="Times New Roman" w:eastAsia="Times New Roman"/>
+                <w:b w:val="0"/>
+                <w:i w:val="0"/>
+                <w:sz w:val="20"/>
+              </w:rPr>
+              <w:t>Outreach coordination and community engagement</w:t>
+            </w:r>
+          </w:p>
+        </w:tc>
+      </w:tr>
+    </w:tbl>
+    <w:p/>
+    <w:p>
+      <w:pPr>
+        <w:spacing w:before="240" w:after="120" w:line="240" w:lineRule="auto"/>
+      </w:pPr>
+      <w:r>
+        <w:rPr>
+          <w:rFonts w:ascii="Times New Roman" w:hAnsi="Times New Roman" w:eastAsia="Times New Roman"/>
+          <w:b/>
+          <w:i w:val="0"/>
+          <w:sz w:val="24"/>
+        </w:rPr>
+        <w:t>8. Resource Contributions and/or Cost Share</w:t>
       </w:r>
     </w:p>
     <w:p>
       <w:pPr>
-        <w:pStyle w:val="ListBullet"/>
-        <w:spacing w:after="40"/>
+        <w:spacing w:before="0" w:after="120" w:line="240" w:lineRule="auto"/>
+        <w:jc w:val="left"/>
       </w:pPr>
       <w:r>
         <w:rPr>
-          <w:rFonts w:ascii="Calibri" w:hAnsi="Calibri" w:eastAsia="Calibri"/>
+          <w:rFonts w:ascii="Times New Roman" w:hAnsi="Times New Roman" w:eastAsia="Times New Roman"/>
           <w:b w:val="0"/>
           <w:i w:val="0"/>
-          <w:color w:val="1E2F38"/>
-          <w:sz w:val="20"/>
+          <w:sz w:val="24"/>
         </w:rPr>
-        <w:t>Scale path: architecture designed for district replication wherever CHW/VHT systems operate.</w:t>
+        <w:t>No cost share is proposed at the SOI stage. FairBanks will continue operating its medical centre and community outreach as complementary organisational activity. Opportunities for in-kind or matching contributions can be discussed during co-design or Phase 2 if invited.</w:t>
       </w:r>
     </w:p>
     <w:p>
       <w:pPr>
-        <w:pStyle w:val="ListBullet"/>
-        <w:spacing w:after="40"/>
+        <w:spacing w:before="240" w:after="120" w:line="240" w:lineRule="auto"/>
       </w:pPr>
       <w:r>
         <w:rPr>
-          <w:rFonts w:ascii="Calibri" w:hAnsi="Calibri" w:eastAsia="Calibri"/>
-          <w:b w:val="0"/>
+          <w:rFonts w:ascii="Times New Roman" w:hAnsi="Times New Roman" w:eastAsia="Times New Roman"/>
+          <w:b/>
           <w:i w:val="0"/>
-          <w:color w:val="1E2F38"/>
-          <w:sz w:val="20"/>
+          <w:sz w:val="24"/>
         </w:rPr>
-        <w:t>MOU fit: Ugandan organisation implementing under national health priorities and digital stack.</w:t>
+        <w:t>9. Readiness for Phase 2</w:t>
       </w:r>
     </w:p>
     <w:p>
       <w:pPr>
-        <w:jc w:val="center"/>
+        <w:spacing w:before="0" w:after="120" w:line="240" w:lineRule="auto"/>
+        <w:jc w:val="left"/>
       </w:pPr>
       <w:r>
-        <w:drawing>
-          <wp:inline xmlns:a="http://schemas.openxmlformats.org/drawingml/2006/main" xmlns:pic="http://schemas.openxmlformats.org/drawingml/2006/picture">
-            <wp:extent cx="4389120" cy="2926080"/>
-            <wp:docPr id="5" name="Picture 5"/>
-            <wp:cNvGraphicFramePr>
-              <a:graphicFrameLocks noChangeAspect="1"/>
-            </wp:cNvGraphicFramePr>
-            <a:graphic>
-              <a:graphicData uri="http://schemas.openxmlformats.org/drawingml/2006/picture">
-                <pic:pic>
-                  <pic:nvPicPr>
-                    <pic:cNvPr id="0" name="outreach_outdoor_clinic_opt.jpg"/>
-                    <pic:cNvPicPr/>
-                  </pic:nvPicPr>
-                  <pic:blipFill>
-                    <a:blip r:embed="rId13"/>
-                    <a:stretch>
-                      <a:fillRect/>
-                    </a:stretch>
-                  </pic:blipFill>
-                  <pic:spPr>
-                    <a:xfrm>
-                      <a:off x="0" y="0"/>
-                      <a:ext cx="4389120" cy="2926080"/>
-                    </a:xfrm>
-                    <a:prstGeom prst="rect"/>
-                  </pic:spPr>
-                </pic:pic>
-              </a:graphicData>
-            </a:graphic>
-          </wp:inline>
-        </w:drawing>
+        <w:rPr>
+          <w:rFonts w:ascii="Times New Roman" w:hAnsi="Times New Roman" w:eastAsia="Times New Roman"/>
+          <w:b w:val="0"/>
+          <w:i w:val="0"/>
+          <w:sz w:val="24"/>
+        </w:rPr>
+        <w:t>This Statement of Interest confirms FairBanks' intent to advance Track 2, Objective 4 with a community-rooted, interoperable, government-aligned digital health proposal. We seek invitation to Phase 2 (full proposal) and/or consultative program design, where we will detail workplans, budgets, M&amp;E, partnership letters, and a clear transition of staffing and recurrent costs toward sustainable Ugandan ownership.</w:t>
       </w:r>
     </w:p>
     <w:p>
       <w:pPr>
-        <w:spacing w:after="160"/>
-        <w:jc w:val="center"/>
+        <w:spacing w:before="0" w:after="80" w:line="240" w:lineRule="auto"/>
+        <w:jc w:val="left"/>
       </w:pPr>
       <w:r>
         <w:rPr>
-          <w:rFonts w:ascii="Calibri" w:hAnsi="Calibri" w:eastAsia="Calibri"/>
+          <w:rFonts w:ascii="Times New Roman" w:hAnsi="Times New Roman" w:eastAsia="Times New Roman"/>
           <w:b w:val="0"/>
           <w:i/>
-          <w:color w:val="3A4A54"/>
-          <w:sz w:val="16"/>
+          <w:sz w:val="20"/>
         </w:rPr>
-        <w:t>Live community outreach — pilot ground truth</w:t>
+        <w:t>References: DFOP0017890 APS (Phase 1 SOI format) and Addendum E (Uganda). Suggested upload name: FairBanks - SOI - Addendum E.pdf</w:t>
       </w:r>
     </w:p>
     <w:p>
       <w:pPr>
-        <w:spacing w:before="240" w:after="100"/>
-      </w:pPr>
-      <w:r>
-        <w:rPr>
-          <w:rFonts w:ascii="Calibri" w:hAnsi="Calibri" w:eastAsia="Calibri"/>
-          <w:b/>
-          <w:i w:val="0"/>
-          <w:color w:val="0A1F2E"/>
-          <w:sz w:val="32"/>
-        </w:rPr>
-        <w:t>XI. Sustainability &amp; Local Ownership</w:t>
-      </w:r>
-    </w:p>
-    <w:p>
-      <w:pPr>
-        <w:pStyle w:val="ListBullet"/>
-        <w:spacing w:after="40"/>
-      </w:pPr>
-      <w:r>
-        <w:rPr>
-          <w:rFonts w:ascii="Calibri" w:hAnsi="Calibri" w:eastAsia="Calibri"/>
-          <w:b w:val="0"/>
-          <w:i w:val="0"/>
-          <w:color w:val="1E2F38"/>
-          <w:sz w:val="20"/>
-        </w:rPr>
-        <w:t>Core clinic and outreach continue as FairBanks operations - the grant accelerates interoperable intelligence and transfer, not basic organisational survival.</w:t>
-      </w:r>
-    </w:p>
-    <w:p>
-      <w:pPr>
-        <w:pStyle w:val="ListBullet"/>
-        <w:spacing w:after="40"/>
-      </w:pPr>
-      <w:r>
-        <w:rPr>
-          <w:rFonts w:ascii="Calibri" w:hAnsi="Calibri" w:eastAsia="Calibri"/>
-          <w:b w:val="0"/>
-          <w:i w:val="0"/>
-          <w:color w:val="1E2F38"/>
-          <w:sz w:val="20"/>
-        </w:rPr>
-        <w:t>Diversified sustainability pathways after transfer: facility use, district deployments, NGO programme monitoring, partner APIs, and training packages.</w:t>
-      </w:r>
-    </w:p>
-    <w:p>
-      <w:pPr>
-        <w:pStyle w:val="ListBullet"/>
-        <w:spacing w:after="40"/>
-      </w:pPr>
-      <w:r>
-        <w:rPr>
-          <w:rFonts w:ascii="Calibri" w:hAnsi="Calibri" w:eastAsia="Calibri"/>
-          <w:b w:val="0"/>
-          <w:i w:val="0"/>
-          <w:color w:val="1E2F38"/>
-          <w:sz w:val="20"/>
-        </w:rPr>
-        <w:t>Local capacity: train Ugandan developers, CHW supervisors, and data stewards; document systems for government handoff.</w:t>
-      </w:r>
-    </w:p>
-    <w:p>
-      <w:pPr>
-        <w:pStyle w:val="ListBullet"/>
-        <w:spacing w:after="40"/>
-      </w:pPr>
-      <w:r>
-        <w:rPr>
-          <w:rFonts w:ascii="Calibri" w:hAnsi="Calibri" w:eastAsia="Calibri"/>
-          <w:b w:val="0"/>
-          <w:i w:val="0"/>
-          <w:color w:val="1E2F38"/>
-          <w:sz w:val="20"/>
-        </w:rPr>
-        <w:t>Community ownership: CHWs and leaders co-design forms and alerts - technology serves the cascade, not the other way around.</w:t>
-      </w:r>
-    </w:p>
-    <w:p>
-      <w:pPr>
-        <w:spacing w:before="240" w:after="100"/>
-      </w:pPr>
-      <w:r>
-        <w:rPr>
-          <w:rFonts w:ascii="Calibri" w:hAnsi="Calibri" w:eastAsia="Calibri"/>
-          <w:b/>
-          <w:i w:val="0"/>
-          <w:color w:val="0A1F2E"/>
-          <w:sz w:val="32"/>
-        </w:rPr>
-        <w:t>XII. Partnership Landscape</w:t>
-      </w:r>
-    </w:p>
-    <w:p>
-      <w:pPr>
-        <w:pStyle w:val="ListBullet"/>
-        <w:spacing w:after="40"/>
-      </w:pPr>
-      <w:r>
-        <w:rPr>
-          <w:rFonts w:ascii="Calibri" w:hAnsi="Calibri" w:eastAsia="Calibri"/>
-          <w:b w:val="0"/>
-          <w:i w:val="0"/>
-          <w:color w:val="1E2F38"/>
-          <w:sz w:val="20"/>
-        </w:rPr>
-        <w:t>Ministry of Health digital health and community health strategy alignment</w:t>
-      </w:r>
-    </w:p>
-    <w:p>
-      <w:pPr>
-        <w:pStyle w:val="ListBullet"/>
-        <w:spacing w:after="40"/>
-      </w:pPr>
-      <w:r>
-        <w:rPr>
-          <w:rFonts w:ascii="Calibri" w:hAnsi="Calibri" w:eastAsia="Calibri"/>
-          <w:b w:val="0"/>
-          <w:i w:val="0"/>
-          <w:color w:val="1E2F38"/>
-          <w:sz w:val="20"/>
-        </w:rPr>
-        <w:t>District health teams for aggregate reporting validation and readiness dialogue</w:t>
-      </w:r>
-    </w:p>
-    <w:p>
-      <w:pPr>
-        <w:pStyle w:val="ListBullet"/>
-        <w:spacing w:after="40"/>
-      </w:pPr>
-      <w:r>
-        <w:rPr>
-          <w:rFonts w:ascii="Calibri" w:hAnsi="Calibri" w:eastAsia="Calibri"/>
-          <w:b w:val="0"/>
-          <w:i w:val="0"/>
-          <w:color w:val="1E2F38"/>
-          <w:sz w:val="20"/>
-        </w:rPr>
-        <w:t>CHWs, VHTs, and community leaders as primary data partners</w:t>
-      </w:r>
-    </w:p>
-    <w:p>
-      <w:pPr>
-        <w:pStyle w:val="ListBullet"/>
-        <w:spacing w:after="40"/>
-      </w:pPr>
-      <w:r>
-        <w:rPr>
-          <w:rFonts w:ascii="Calibri" w:hAnsi="Calibri" w:eastAsia="Calibri"/>
-          <w:b w:val="0"/>
-          <w:i w:val="0"/>
-          <w:color w:val="1E2F38"/>
-          <w:sz w:val="20"/>
-        </w:rPr>
-        <w:t>Academic partners for evaluation and interoperability testing</w:t>
-      </w:r>
-    </w:p>
-    <w:p>
-      <w:pPr>
-        <w:pStyle w:val="ListBullet"/>
-        <w:spacing w:after="40"/>
-      </w:pPr>
-      <w:r>
-        <w:rPr>
-          <w:rFonts w:ascii="Calibri" w:hAnsi="Calibri" w:eastAsia="Calibri"/>
-          <w:b w:val="0"/>
-          <w:i w:val="0"/>
-          <w:color w:val="1E2F38"/>
-          <w:sz w:val="20"/>
-        </w:rPr>
-        <w:t>NGOs and CBOs already collaborating with FairBanks Community Reach</w:t>
-      </w:r>
-    </w:p>
-    <w:p>
-      <w:pPr>
-        <w:spacing w:before="240" w:after="100"/>
-      </w:pPr>
-      <w:r>
-        <w:rPr>
-          <w:rFonts w:ascii="Calibri" w:hAnsi="Calibri" w:eastAsia="Calibri"/>
-          <w:b/>
-          <w:i w:val="0"/>
-          <w:color w:val="0A1F2E"/>
-          <w:sz w:val="32"/>
-        </w:rPr>
-        <w:t>XIII. Readiness for Full Proposal</w:t>
-      </w:r>
-    </w:p>
-    <w:p>
-      <w:pPr>
-        <w:spacing w:after="160"/>
+        <w:spacing w:before="0" w:after="40" w:line="240" w:lineRule="auto"/>
         <w:jc w:val="left"/>
       </w:pPr>
       <w:r>
         <w:rPr>
-          <w:rFonts w:ascii="Calibri" w:hAnsi="Calibri" w:eastAsia="Calibri"/>
+          <w:rFonts w:ascii="Times New Roman" w:hAnsi="Times New Roman" w:eastAsia="Times New Roman"/>
           <w:b w:val="0"/>
           <w:i w:val="0"/>
-          <w:color w:val="1E2F38"/>
           <w:sz w:val="20"/>
-        </w:rPr>
-        <w:t>This Statement of Interest confirms FairBanks' intent to advance Objective 4 with a community-rooted, interoperable, government-aligned digital health proposal. We seek invitation to Step 2 (full proposal), where we will detail workplans, budgets, M&amp;E, partnership letters, and a clear transition of staffing and recurrent costs toward sustainable Ugandan ownership.</w:t>
-      </w:r>
-    </w:p>
-    <w:p>
-      <w:pPr>
-        <w:spacing w:after="40"/>
-        <w:jc w:val="left"/>
-      </w:pPr>
-      <w:r>
-        <w:rPr>
-          <w:rFonts w:ascii="Calibri" w:hAnsi="Calibri" w:eastAsia="Calibri"/>
-          <w:b w:val="0"/>
-          <w:i/>
-          <w:color w:val="3A4A54"/>
-          <w:sz w:val="16"/>
-        </w:rPr>
-        <w:t>Official references: DFOP0017890 Addendum E (Uganda). Step 1 SOI. Narrative kept concise for Step 1 review.</w:t>
-      </w:r>
-    </w:p>
-    <w:p>
-      <w:pPr>
-        <w:spacing w:after="40"/>
-        <w:jc w:val="left"/>
-      </w:pPr>
-      <w:r>
-        <w:rPr>
-          <w:rFonts w:ascii="Calibri" w:hAnsi="Calibri" w:eastAsia="Calibri"/>
-          <w:b w:val="0"/>
-          <w:i w:val="0"/>
-          <w:color w:val="0D6E6E"/>
-          <w:sz w:val="14"/>
         </w:rPr>
         <w:t>https://opportunitiesforyouth.org/2026/06/15/u-s-department-of-state-launches-up-to-60-million-funding-opportunity-to-strengthen-ugandas-health-system-through-the-health-foreign-assistance-mou-implementation-plan/</w:t>
       </w:r>
     </w:p>
     <w:p>
       <w:pPr>
-        <w:spacing w:after="160"/>
+        <w:spacing w:before="0" w:after="160" w:line="240" w:lineRule="auto"/>
         <w:jc w:val="left"/>
       </w:pPr>
       <w:r>
         <w:rPr>
-          <w:rFonts w:ascii="Calibri" w:hAnsi="Calibri" w:eastAsia="Calibri"/>
+          <w:rFonts w:ascii="Times New Roman" w:hAnsi="Times New Roman" w:eastAsia="Times New Roman"/>
           <w:b w:val="0"/>
           <w:i w:val="0"/>
-          <w:color w:val="0D6E6E"/>
-          <w:sz w:val="14"/>
+          <w:sz w:val="20"/>
         </w:rPr>
         <w:t>https://simpler.grants.gov/opportunity/44a573b8-d46a-4cec-8c84-f319cd1cc1b6</w:t>
       </w:r>
     </w:p>
     <w:p>
       <w:pPr>
-        <w:spacing w:after="160"/>
+        <w:spacing w:before="0" w:after="120" w:line="240" w:lineRule="auto"/>
         <w:jc w:val="center"/>
       </w:pPr>
       <w:r>
         <w:rPr>
-          <w:rFonts w:ascii="Calibri" w:hAnsi="Calibri" w:eastAsia="Calibri"/>
+          <w:rFonts w:ascii="Times New Roman" w:hAnsi="Times New Roman" w:eastAsia="Times New Roman"/>
           <w:b/>
           <w:i/>
-          <w:color w:val="C45C26"/>
           <w:sz w:val="24"/>
         </w:rPr>
         <w:t>Your health, our mission.</w:t>
       </w:r>
     </w:p>
     <w:sectPr>
+      <w:footerReference w:type="default" r:id="rId9"/>
       <w:pgSz w:w="12240" w:h="15840"/>
-      <w:pgMar w:top="1008" w:right="1152" w:bottom="1008" w:left="1152" w:header="720" w:footer="720" w:gutter="0"/>
+      <w:pgMar w:top="1440" w:right="1440" w:bottom="1440" w:left="1440" w:header="720" w:footer="720" w:gutter="0"/>
       <w:cols w:space="720"/>
       <w:docGrid w:linePitch="360"/>
     </w:sectPr>
   </w:body>
 </w:document>
+</file>
+
+<file path=word/footer1.xml><?xml version="1.0" encoding="utf-8"?>
+<w:ftr xmlns:m="http://schemas.openxmlformats.org/officeDocument/2006/math" xmlns:mc="http://schemas.openxmlformats.org/markup-compatibility/2006" xmlns:mo="http://schemas.microsoft.com/office/mac/office/2008/main" xmlns:mv="urn:schemas-microsoft-com:mac:vml" xmlns:o="urn:schemas-microsoft-com:office:office" xmlns:r="http://schemas.openxmlformats.org/officeDocument/2006/relationships" xmlns:v="urn:schemas-microsoft-com:vml" xmlns:w10="urn:schemas-microsoft-com:office:word" xmlns:w14="http://schemas.microsoft.com/office/word/2010/wordml" xmlns:w="http://schemas.openxmlformats.org/wordprocessingml/2006/main" xmlns:wne="http://schemas.microsoft.com/office/word/2006/wordml" xmlns:wp14="http://schemas.microsoft.com/office/word/2010/wordprocessingDrawing" xmlns:wp="http://schemas.openxmlformats.org/drawingml/2006/wordprocessingDrawing" xmlns:wpc="http://schemas.microsoft.com/office/word/2010/wordprocessingCanvas" xmlns:wpg="http://schemas.microsoft.com/office/word/2010/wordprocessingGroup" xmlns:wpi="http://schemas.microsoft.com/office/word/2010/wordprocessingInk" xmlns:wps="http://schemas.microsoft.com/office/word/2010/wordprocessingShape" mc:Ignorable="w14 wp14">
+  <w:p>
+    <w:pPr>
+      <w:pStyle w:val="Footer"/>
+      <w:jc w:val="center"/>
+    </w:pPr>
+    <w:r>
+      <w:rPr>
+        <w:rFonts w:ascii="Times New Roman" w:hAnsi="Times New Roman" w:eastAsia="Times New Roman"/>
+        <w:b w:val="0"/>
+        <w:i w:val="0"/>
+        <w:sz w:val="20"/>
+      </w:rPr>
+      <w:t xml:space="preserve">Page </w:t>
+    </w:r>
+    <w:r>
+      <w:rPr>
+        <w:rFonts w:ascii="Times New Roman" w:hAnsi="Times New Roman" w:eastAsia="Times New Roman"/>
+        <w:b w:val="0"/>
+        <w:i w:val="0"/>
+        <w:sz w:val="20"/>
+      </w:rPr>
+      <w:fldChar w:fldCharType="begin"/>
+      <w:instrText xml:space="preserve"> PAGE </w:instrText>
+      <w:fldChar w:fldCharType="end"/>
+    </w:r>
+  </w:p>
+</w:ftr>
 </file>
 
 <file path=word/numbering.xml><?xml version="1.0" encoding="utf-8"?>

</xml_diff>

<commit_message>
Remove redundant opportunity details from build_dos-uganda_docs.py and associated Word document to streamline content. Ensure consistency across document formats by eliminating unnecessary information while maintaining critical project details. Update the PowerPoint file to reflect these changes.
</commit_message>
<xml_diff>
--- a/applications/dos-uganda/documents/dos-uganda_word.docx
+++ b/applications/dos-uganda/documents/dos-uganda_word.docx
@@ -489,21 +489,6 @@
       </w:tr>
     </w:tbl>
     <w:p/>
-    <w:p>
-      <w:pPr>
-        <w:spacing w:before="0" w:after="120" w:line="240" w:lineRule="auto"/>
-        <w:jc w:val="center"/>
-      </w:pPr>
-      <w:r>
-        <w:rPr>
-          <w:rFonts w:ascii="Times New Roman" w:hAnsi="Times New Roman" w:eastAsia="Times New Roman"/>
-          <w:b w:val="0"/>
-          <w:i/>
-          <w:sz w:val="20"/>
-        </w:rPr>
-        <w:t>Opportunity: DFOP0017890  |  Window 2a SOI due 31 July 2026, 5:00 PM EDT  |  This cover table does not count toward the 5-page narrative limit.</w:t>
-      </w:r>
-    </w:p>
     <w:p>
       <w:r>
         <w:br w:type="page"/>

</xml_diff>

<commit_message>
Refactor build_dos-uganda_docs.py to remove outdated opportunity references and streamline content across Word, PDF, and PowerPoint documents. Update PDF generation process to handle temporary files and ensure successful output. Maintain focus on project objectives while enhancing document consistency.
</commit_message>
<xml_diff>
--- a/applications/dos-uganda/documents/dos-uganda_word.docx
+++ b/applications/dos-uganda/documents/dos-uganda_word.docx
@@ -2702,52 +2702,7 @@
     </w:p>
     <w:p>
       <w:pPr>
-        <w:spacing w:before="0" w:after="80" w:line="240" w:lineRule="auto"/>
-        <w:jc w:val="left"/>
-      </w:pPr>
-      <w:r>
-        <w:rPr>
-          <w:rFonts w:ascii="Times New Roman" w:hAnsi="Times New Roman" w:eastAsia="Times New Roman"/>
-          <w:b w:val="0"/>
-          <w:i/>
-          <w:sz w:val="20"/>
-        </w:rPr>
-        <w:t>References: DFOP0017890 APS (Phase 1 SOI format) and Addendum E (Uganda). Suggested upload name: FairBanks - SOI - Addendum E.pdf</w:t>
-      </w:r>
-    </w:p>
-    <w:p>
-      <w:pPr>
-        <w:spacing w:before="0" w:after="40" w:line="240" w:lineRule="auto"/>
-        <w:jc w:val="left"/>
-      </w:pPr>
-      <w:r>
-        <w:rPr>
-          <w:rFonts w:ascii="Times New Roman" w:hAnsi="Times New Roman" w:eastAsia="Times New Roman"/>
-          <w:b w:val="0"/>
-          <w:i w:val="0"/>
-          <w:sz w:val="20"/>
-        </w:rPr>
-        <w:t>https://opportunitiesforyouth.org/2026/06/15/u-s-department-of-state-launches-up-to-60-million-funding-opportunity-to-strengthen-ugandas-health-system-through-the-health-foreign-assistance-mou-implementation-plan/</w:t>
-      </w:r>
-    </w:p>
-    <w:p>
-      <w:pPr>
-        <w:spacing w:before="0" w:after="160" w:line="240" w:lineRule="auto"/>
-        <w:jc w:val="left"/>
-      </w:pPr>
-      <w:r>
-        <w:rPr>
-          <w:rFonts w:ascii="Times New Roman" w:hAnsi="Times New Roman" w:eastAsia="Times New Roman"/>
-          <w:b w:val="0"/>
-          <w:i w:val="0"/>
-          <w:sz w:val="20"/>
-        </w:rPr>
-        <w:t>https://simpler.grants.gov/opportunity/44a573b8-d46a-4cec-8c84-f319cd1cc1b6</w:t>
-      </w:r>
-    </w:p>
-    <w:p>
-      <w:pPr>
-        <w:spacing w:before="0" w:after="120" w:line="240" w:lineRule="auto"/>
+        <w:spacing w:before="160" w:after="120" w:line="240" w:lineRule="auto"/>
         <w:jc w:val="center"/>
       </w:pPr>
       <w:r>

</xml_diff>

<commit_message>
Update build_dos-uganda_docs.py and associated documents to reflect revised project title and narrative content for the Uganda Health System MOU (DFOP0017890). Enhance clarity and consistency across Word, PDF, and PowerPoint formats by streamlining language and ensuring alignment with new objectives focused on interoperability and government ownership. Adjust cost share descriptions and improve overall document coherence.
</commit_message>
<xml_diff>
--- a/applications/dos-uganda/documents/dos-uganda_word.docx
+++ b/applications/dos-uganda/documents/dos-uganda_word.docx
@@ -194,7 +194,7 @@
                 <w:i w:val="0"/>
                 <w:sz w:val="20"/>
               </w:rPr>
-              <w:t>FCHIP Last-Mile Bridge: Interoperable Community Health Data into Uganda's National Digital Health Architecture</w:t>
+              <w:t>Connecting Community Health Visits to Uganda's National Digital Health Systems (FCHIP)</w:t>
             </w:r>
           </w:p>
         </w:tc>
@@ -434,7 +434,7 @@
                 <w:i w:val="0"/>
                 <w:sz w:val="20"/>
               </w:rPr>
-              <w:t>$0 (none proposed at SOI stage)</w:t>
+              <w:t>$0 (none proposed at this stage)</w:t>
             </w:r>
           </w:p>
         </w:tc>
@@ -520,7 +520,7 @@
           <w:i w:val="0"/>
           <w:sz w:val="24"/>
         </w:rPr>
-        <w:t>Uganda's five-year health transition (April 2026-December 2030) asks facilities, districts, and communities to keep HIV, TB, malaria, maternal and child health, immunisation, and outbreak services strong while shifting toward government-led, performance-based programming. That shift only works if decision-makers see what is happening at the last mile - not weeks later in paper registers.</w:t>
+        <w:t>Uganda is moving through a five-year health transition (April 2026 to December 2030). Clinics, districts, and communities must keep HIV, TB, malaria, maternal and child health, immunisation, and outbreak services running well while more work shifts to government-led programmes. That only works if leaders can see what is happening in communities in time to act - not weeks later from paper books.</w:t>
       </w:r>
     </w:p>
     <w:p>
@@ -535,7 +535,7 @@
           <w:i w:val="0"/>
           <w:sz w:val="24"/>
         </w:rPr>
-        <w:t>Community Health Workers and Village Health Teams already walk households and refer patients. Too often their work never reaches eCHIS, facility EMRs, DHIS2/eIDSR, or the National Data Warehouse in a usable form. National digital systems then miss early fever clusters, missed antenatal visits, immunisation gaps, and stock pressure. The result is reactive care, weak accountability, and higher risk that transition gains reverse.</w:t>
+        <w:t>Community Health Workers and Village Health Teams already visit homes and send people for care. Too often, what they record never reaches eCHIS, clinic records, DHIS2/eIDSR, or the National Data Warehouse in a form people can use. Then national systems miss rising fever cases, missed antenatal visits, gaps in immunisation, and medicine pressure. Care stays reactive, follow-up is weak, and hard-won gains can slip.</w:t>
       </w:r>
     </w:p>
     <w:p>
@@ -550,7 +550,7 @@
           <w:i w:val="0"/>
           <w:sz w:val="24"/>
         </w:rPr>
-        <w:t>The opportunity is clear: bridge last-mile community data into Uganda's approved National Digital Health Architecture (NDHA) so Ministry of Health (MoH) systems become more complete, more actionable, and progressively owned by Government of Uganda (GOU) institutions - without building a parallel silo.</w:t>
+        <w:t>There is a clear chance to fix this: help community visit data flow into Uganda's National Digital Health Architecture (NDHA) so Ministry of Health systems are fuller and more useful, and so government can take over step by step - without building a separate parallel system.</w:t>
       </w:r>
     </w:p>
     <w:p>
@@ -579,7 +579,7 @@
           <w:i w:val="0"/>
           <w:sz w:val="24"/>
         </w:rPr>
-        <w:t>FairBanks Medical Centre and FairBanks Community Reach respectfully submit this Statement of Interest under Track 2, Objective 4 of Addendum E: strengthen and scale interoperable, fit-for-purpose digital health systems with progressive GOU responsibility and sustainable operations.</w:t>
+        <w:t>FairBanks Medical Centre and FairBanks Community Reach submit this Statement of Interest under Track 2, Objective 4 of Addendum E: strengthen and scale digital health systems that work together, fit Uganda's needs, and move toward government ownership and steady day-to-day running.</w:t>
       </w:r>
     </w:p>
     <w:p>
@@ -594,7 +594,7 @@
           <w:i w:val="0"/>
           <w:sz w:val="24"/>
         </w:rPr>
-        <w:t>We propose to pilot and then transfer a community-to-facility intelligence layer - the FairBanks Community Health Intelligence Platform (FCHIP) - that captures CHW/VHT household and visit data offline, syncs securely, maps indicators to national reporting elements, and feeds facility and district action. FCHIP is not a parallel national system. It is a bridge that makes Uganda's existing digital stack more complete at community level and more useful for prevention.</w:t>
+        <w:t>We want to trial, then hand over, a practical tool - the FairBanks Community Health Intelligence Platform (FCHIP) - that lets CHWs and VHTs record household and visit information on phones even offline, sync it safely, match it to national reporting needs, and help the clinic and district act. FCHIP is not meant to replace Uganda's national systems. It is a bridge so community work shows up where it should and helps prevent problems earlier.</w:t>
       </w:r>
     </w:p>
     <w:p>
@@ -609,7 +609,7 @@
           <w:i w:val="0"/>
           <w:sz w:val="24"/>
         </w:rPr>
-        <w:t>Primary subsystem focus (permitted under Objective 4): eCHIS-aligned household/visit capture; facility EMR encounter and referral handoff (eAfya/ClinicMaster pathways as available in the catchment); DHIS2 aggregate reporting and eIDSR surveillance signals; readiness feeds toward the National Data Warehouse; and iHRIS-aware CHW/VHT workforce directories where schemas allow. Design aligns with NDHA and OpenHIE-consistent interoperability (API-first, standards-aware exports), under MoH digital health authority.</w:t>
+        <w:t>We will focus on the links that matter most for our catchments: household and visit data in line with eCHIS; referral and visit handoff into clinic systems (such as eAfya or ClinicMaster where used); summary reporting into DHIS2 and alerts that support eIDSR; readiness to feed the National Data Warehouse; and CHW/VHT workforce lists that can align with iHRIS where the rules allow. We will follow NDHA and OpenHIE-style sharing rules, under Ministry of Health guidance.</w:t>
       </w:r>
     </w:p>
     <w:p>
@@ -624,7 +624,7 @@
           <w:i/>
           <w:sz w:val="24"/>
         </w:rPr>
-        <w:t>This partnership is designed as a durable win-win: each party gains something lasting, and no party depends forever on a private tool outside GOU systems.</w:t>
+        <w:t>We want every partner to gain something lasting. No one should depend forever on a private tool that sits outside government systems.</w:t>
       </w:r>
     </w:p>
     <w:tbl>
@@ -730,7 +730,7 @@
                 <w:i w:val="0"/>
                 <w:sz w:val="20"/>
               </w:rPr>
-              <w:t>Richer last-mile data into eCHIS, DHIS2/eIDSR, and related national platforms; clearer referral closure; documented handoff of staffing and recurrent costs toward GOU ownership by project close.</w:t>
+              <w:t>More complete community data in eCHIS, DHIS2/eIDSR, and related national systems; clearer proof that referrals were closed; and a written plan to hand over staff roles and running costs to government by the end of the project.</w:t>
             </w:r>
           </w:p>
         </w:tc>
@@ -778,7 +778,7 @@
                 <w:i w:val="0"/>
                 <w:sz w:val="20"/>
               </w:rPr>
-              <w:t>A Ugandan implementer with a live clinic and community network that protects essential services while proving interoperable digital scale-up under the MOU - accountable, measurable, and transferable - advancing U.S. interests in health security and country self-reliance.</w:t>
+              <w:t>A Ugandan partner with a working clinic and community network that keeps essential services going while showing digital systems can connect under the MOU - in ways that can be measured and handed on, supporting U.S. goals around health security and country self-reliance.</w:t>
             </w:r>
           </w:p>
         </w:tc>
@@ -826,7 +826,7 @@
                 <w:i w:val="0"/>
                 <w:sz w:val="20"/>
               </w:rPr>
-              <w:t>Dashboards for outreach targeting, referral follow-up, and programme monitoring; GIS hotspot views that support planning before outbreaks arrive at the ward.</w:t>
+              <w:t>Simple screens to plan outreach, follow referrals, and track programmes; maps that show hotspots so teams can act before outbreaks hit the ward.</w:t>
             </w:r>
           </w:p>
         </w:tc>
@@ -874,7 +874,7 @@
                 <w:i w:val="0"/>
                 <w:sz w:val="20"/>
               </w:rPr>
-              <w:t>Simple offline tools, faster support from the medical centre, and care that reaches mothers, children, older persons, and people with chronic conditions before crises.</w:t>
+              <w:t>Easy tools that work offline, quicker support from the medical centre, and care that reaches mothers, children, older people, and people with long-term illness earlier.</w:t>
             </w:r>
           </w:p>
         </w:tc>
@@ -922,7 +922,7 @@
                 <w:i w:val="0"/>
                 <w:sz w:val="20"/>
               </w:rPr>
-              <w:t>Room to refine and document a production-grade interoperability model inside a real catchment - then share specifications, training packages, and transfer plans with MoH-aligned partners.</w:t>
+              <w:t>A real place to test and write down a working data-sharing approach, then share the guides, training, and handoff plans with Ministry-aligned partners.</w:t>
             </w:r>
           </w:p>
         </w:tc>
@@ -941,7 +941,7 @@
           <w:i w:val="0"/>
           <w:sz w:val="24"/>
         </w:rPr>
-        <w:t>Core activities:</w:t>
+        <w:t>What we will do:</w:t>
       </w:r>
     </w:p>
     <w:p>
@@ -956,7 +956,7 @@
           <w:i w:val="0"/>
           <w:sz w:val="24"/>
         </w:rPr>
-        <w:t>A1. Deploy offline-capable CHW/VHT capture aligned with eCHIS household and visit concepts across FairBanks Community Reach catchments.</w:t>
+        <w:t>A1. Put simple offline phone tools in the hands of CHWs and VHTs so household and visit records match eCHIS ideas across FairBanks Community Reach areas.</w:t>
       </w:r>
     </w:p>
     <w:p>
@@ -971,7 +971,7 @@
           <w:i w:val="0"/>
           <w:sz w:val="24"/>
         </w:rPr>
-        <w:t>A2. Establish a secure sync and role-based access pipeline linking community records to FairBanks Medical Centre workflows and authorised district viewers, consistent with Uganda data-protection and cybersecurity expectations.</w:t>
+        <w:t>A2. Set up safe syncing and clear access rules so community records reach FairBanks Medical Centre work and authorised district viewers, in line with Uganda's data protection and security expectations.</w:t>
       </w:r>
     </w:p>
     <w:p>
@@ -986,7 +986,7 @@
           <w:i w:val="0"/>
           <w:sz w:val="24"/>
         </w:rPr>
-        <w:t>A3. Map community indicators to DHIS2 reporting elements and demonstrate aggregate submission pathways for MNCH, immunisation, NCD screening, and disease surveillance signals (including eIDSR-relevant alerts).</w:t>
+        <w:t>A3. Match community indicators to DHIS2 reports and show how summary data can move for maternal and child health, immunisation, chronic disease screening, and disease watch (including eIDSR-related alerts).</w:t>
       </w:r>
     </w:p>
     <w:p>
@@ -1001,7 +1001,7 @@
           <w:i w:val="0"/>
           <w:sz w:val="24"/>
         </w:rPr>
-        <w:t>A4. Deliver facility and programme dashboards plus GIS hotspot views that trigger outreach, referrals, and supply planning actions.</w:t>
+        <w:t>A4. Give clinics and programmes clear dashboards and hotspot maps that help trigger outreach, referrals, and supply planning.</w:t>
       </w:r>
     </w:p>
     <w:p>
@@ -1016,7 +1016,7 @@
           <w:i w:val="0"/>
           <w:sz w:val="24"/>
         </w:rPr>
-        <w:t>A5. Produce interoperability specifications, data-governance protocols, training curricula, and a staged GOU-ownership transition plan (staffing and recurrent operating costs) suitable for full-proposal detailed design.</w:t>
+        <w:t>A5. Write the sharing rules, data-handling guides, training materials, and a step-by-step government handoff plan (including staff roles and running costs) ready for a full proposal if we are invited.</w:t>
       </w:r>
     </w:p>
     <w:p>
@@ -1031,7 +1031,7 @@
           <w:i w:val="0"/>
           <w:sz w:val="24"/>
         </w:rPr>
-        <w:t>Project approach:</w:t>
+        <w:t>How we will work:</w:t>
       </w:r>
     </w:p>
     <w:p>
@@ -1046,7 +1046,7 @@
           <w:i w:val="0"/>
           <w:sz w:val="24"/>
         </w:rPr>
-        <w:t>Anchor in a live cascade: community members identify needs; CHWs/VHTs collect and educate; FairBanks Community Reach runs outreach and home visits; FairBanks Medical Centre provides clinical care, diagnostics, pharmacy, and referrals; FCHIP is the intelligence layer that closes the data-and-feedback loop.</w:t>
+        <w:t>We start from how FairBanks already works: communities name needs; CHWs and VHTs visit, teach, and refer; FairBanks Community Reach runs outreach and home visits; FairBanks Medical Centre provides clinic care, tests, pharmacy, and referrals; FCHIP helps the information move back and forth so teams can act.</w:t>
       </w:r>
     </w:p>
     <w:p>
@@ -1061,7 +1061,7 @@
           <w:i w:val="0"/>
           <w:sz w:val="24"/>
         </w:rPr>
-        <w:t>Build API-first, standards-aware exports - not a closed proprietary vault. Prioritise interoperability with eCHIS, DHIS2/eIDSR, facility EMR pathways (eAfya/ClinicMaster as applicable), and National Data Warehouse readiness when schemas are confirmed.</w:t>
+        <w:t>We will build for sharing, not for locking data away. Priority links are eCHIS, DHIS2/eIDSR, clinic record systems (eAfya or ClinicMaster where used), and the National Data Warehouse when the national formats are confirmed.</w:t>
       </w:r>
     </w:p>
     <w:p>
@@ -1076,7 +1076,7 @@
           <w:i w:val="0"/>
           <w:sz w:val="24"/>
         </w:rPr>
-        <w:t>Protect essential services during transition: structure community data around HIV/TB/malaria flags where relevant, maternal and child pathways, immunisation follow-up, and outbreak early warning so digital work reinforces - not distracts from - service continuity.</w:t>
+        <w:t>Digital work must support, not distract from, life-saving care. Community forms will include HIV, TB, and malaria flags where useful, plus maternal and child pathways, immunisation follow-up, and early outbreak warning.</w:t>
       </w:r>
     </w:p>
     <w:p>
@@ -1091,7 +1091,7 @@
           <w:i w:val="0"/>
           <w:sz w:val="24"/>
         </w:rPr>
-        <w:t>Co-design forms and alerts with CHWs, facility staff, and local leaders; train Ugandan data stewards and developers; document every interface for MoH review.</w:t>
+        <w:t>We will shape forms and alerts with CHWs, clinic staff, and local leaders; train Ugandan staff who will keep the system going; and write every link clearly for Ministry of Health review.</w:t>
       </w:r>
     </w:p>
     <w:p>
@@ -1106,7 +1106,7 @@
           <w:i w:val="0"/>
           <w:sz w:val="24"/>
         </w:rPr>
-        <w:t>Start where FairBanks already operates (Bukoto, Kyebando, Kisaasi, Kamwokya, Kikaaya and surrounding communities), then design for district replication using Uganda's existing CHW/VHT architecture.</w:t>
+        <w:t>We start where FairBanks already works - Bukoto, Kyebando, Kisaasi, Kamwokya, Kikaaya and nearby communities - and design so other districts with CHW/VHT networks can copy the approach later.</w:t>
       </w:r>
     </w:p>
     <w:p>
@@ -1135,7 +1135,7 @@
           <w:i w:val="0"/>
           <w:sz w:val="24"/>
         </w:rPr>
-        <w:t>Success means lives protected, systems strengthened, efficiency improved, self-reliance advanced, and U.S. investments secured through GOU-owned digital continuity:</w:t>
+        <w:t>Success means people get help earlier, government systems get stronger, work runs with less waste, Uganda can carry more of the load, and U.S. health investments stay protected:</w:t>
       </w:r>
     </w:p>
     <w:tbl>
@@ -1169,7 +1169,7 @@
                 <w:i w:val="0"/>
                 <w:sz w:val="20"/>
               </w:rPr>
-              <w:t>Outcome lens</w:t>
+              <w:t>Outcome</w:t>
             </w:r>
           </w:p>
         </w:tc>
@@ -1241,7 +1241,7 @@
                 <w:i w:val="0"/>
                 <w:sz w:val="20"/>
               </w:rPr>
-              <w:t>Earlier alerts for missed ANC, immunisation gaps, fever clusters, and referral drop-offs - linked to CHW follow-up and clinic action.</w:t>
+              <w:t>Earlier notice of missed antenatal visits, immunisation gaps, fever clusters, and lost referrals - followed by CHW action and clinic support.</w:t>
             </w:r>
           </w:p>
         </w:tc>
@@ -1289,7 +1289,7 @@
                 <w:i w:val="0"/>
                 <w:sz w:val="20"/>
               </w:rPr>
-              <w:t>Working mappings and demo exports for eCHIS-aligned records and DHIS2/eIDSR aggregates, with open documentation for MoH and partners.</w:t>
+              <w:t>Working links and sample exports for eCHIS-style records and DHIS2/eIDSR summaries, with clear guides for the Ministry and partners.</w:t>
             </w:r>
           </w:p>
         </w:tc>
@@ -1314,7 +1314,7 @@
                 <w:i w:val="0"/>
                 <w:sz w:val="20"/>
               </w:rPr>
-              <w:t>Enhance efficiency</w:t>
+              <w:t>Work more efficiently</w:t>
             </w:r>
           </w:p>
         </w:tc>
@@ -1337,7 +1337,7 @@
                 <w:i w:val="0"/>
                 <w:sz w:val="20"/>
               </w:rPr>
-              <w:t>Less double entry and paper lag; role-based dashboards that shorten the path from community signal to facility or district response.</w:t>
+              <w:t>Less double entry and less waiting on paper; screens that help teams move from a community signal to clinic or district action faster.</w:t>
             </w:r>
           </w:p>
         </w:tc>
@@ -1362,7 +1362,7 @@
                 <w:i w:val="0"/>
                 <w:sz w:val="20"/>
               </w:rPr>
-              <w:t>Foster self-reliance</w:t>
+              <w:t>Build self-reliance</w:t>
             </w:r>
           </w:p>
         </w:tc>
@@ -1385,7 +1385,7 @@
                 <w:i w:val="0"/>
                 <w:sz w:val="20"/>
               </w:rPr>
-              <w:t>Handoff package: source documentation, SOPs, training, hosting options, and a costed path to transfer recurrent operations toward domestic systems by project close.</w:t>
+              <w:t>A handoff package with guides, standard procedures, training, hosting options, and a costed path to move running costs onto domestic systems by project close.</w:t>
             </w:r>
           </w:p>
         </w:tc>
@@ -1410,7 +1410,7 @@
                 <w:i w:val="0"/>
                 <w:sz w:val="20"/>
               </w:rPr>
-              <w:t>Advance U.S. interest</w:t>
+              <w:t>Support U.S. interest</w:t>
             </w:r>
           </w:p>
         </w:tc>
@@ -1433,7 +1433,7 @@
                 <w:i w:val="0"/>
                 <w:sz w:val="20"/>
               </w:rPr>
-              <w:t>Measurable contribution to MOU digital transition: interoperable last-mile data under GOU authority, protecting prior U.S. health investments and strengthening epidemic early warning.</w:t>
+              <w:t>A clear contribution to the MOU digital shift: community data that connects under government authority, protects past U.S. health investments, and strengthens early warning for outbreaks.</w:t>
             </w:r>
           </w:p>
         </w:tc>
@@ -1466,7 +1466,7 @@
           <w:i w:val="0"/>
           <w:sz w:val="24"/>
         </w:rPr>
-        <w:t>Ugandan social enterprise with a functioning medical centre - clinical care, diagnostics, pharmacy, and referral pathways already in daily use.</w:t>
+        <w:t>We are a Ugandan organisation with a working medical centre - clinic care, tests, pharmacy, and referrals already running every day.</w:t>
       </w:r>
     </w:p>
     <w:p>
@@ -1481,7 +1481,7 @@
           <w:i w:val="0"/>
           <w:sz w:val="24"/>
         </w:rPr>
-        <w:t>Active FairBanks Community Reach programmes: maternal and child health, Gericare, chronic disease screening, school and corporate health outreach.</w:t>
+        <w:t>FairBanks Community Reach is active in maternal and child health, Gericare, chronic disease screening, and school and workplace outreach.</w:t>
       </w:r>
     </w:p>
     <w:p>
@@ -1496,7 +1496,7 @@
           <w:i w:val="0"/>
           <w:sz w:val="24"/>
         </w:rPr>
-        <w:t>Established CHW/VHT relationships in Kampala-area communities named above - real users, not a greenfield pilot.</w:t>
+        <w:t>We already work with CHWs and VHTs in the Kampala-area communities named above. This is not starting from zero.</w:t>
       </w:r>
     </w:p>
     <w:p>
@@ -1511,7 +1511,7 @@
           <w:i w:val="0"/>
           <w:sz w:val="24"/>
         </w:rPr>
-        <w:t>Digital health records foundation and pharmacy dispensing data already supporting facility operations.</w:t>
+        <w:t>We already keep digital clinic records and pharmacy dispensing data that support day-to-day facility work.</w:t>
       </w:r>
     </w:p>
     <w:p>
@@ -1526,7 +1526,7 @@
           <w:i w:val="0"/>
           <w:sz w:val="24"/>
         </w:rPr>
-        <w:t>Research orientation and partnership practice - evidence, ethics, and skills development sit inside the FairBanks community health model.</w:t>
+        <w:t>Research, ethics, and skills training are part of how FairBanks works with communities and partners.</w:t>
       </w:r>
     </w:p>
     <w:p>
@@ -1540,7 +1540,7 @@
           <w:i w:val="0"/>
           <w:sz w:val="24"/>
         </w:rPr>
-        <w:t>5. Interoperability Pathway (chart)</w:t>
+        <w:t>5. How Systems Will Connect (chart)</w:t>
       </w:r>
     </w:p>
     <w:tbl>
@@ -1574,7 +1574,7 @@
                 <w:i w:val="0"/>
                 <w:sz w:val="20"/>
               </w:rPr>
-              <w:t>Platform</w:t>
+              <w:t>System</w:t>
             </w:r>
           </w:p>
         </w:tc>
@@ -1598,7 +1598,7 @@
                 <w:i w:val="0"/>
                 <w:sz w:val="20"/>
               </w:rPr>
-              <w:t>Integration pathway</w:t>
+              <w:t>How we connect</w:t>
             </w:r>
           </w:p>
         </w:tc>
@@ -1646,7 +1646,7 @@
                 <w:i w:val="0"/>
                 <w:sz w:val="20"/>
               </w:rPr>
-              <w:t>Household registration, visit logs, referral flags via structured mobile capture</w:t>
+              <w:t>Household lists, visit logs, and referral flags from phone tools that work offline</w:t>
             </w:r>
           </w:p>
         </w:tc>
@@ -1671,7 +1671,7 @@
                 <w:i w:val="0"/>
                 <w:sz w:val="20"/>
               </w:rPr>
-              <w:t>Facility EMR (eAfya / ClinicMaster)</w:t>
+              <w:t>Clinic records (eAfya / ClinicMaster)</w:t>
             </w:r>
           </w:p>
         </w:tc>
@@ -1694,7 +1694,7 @@
                 <w:i w:val="0"/>
                 <w:sz w:val="20"/>
               </w:rPr>
-              <w:t>Referral handoff and encounter linkage at FairBanks Medical Centre</w:t>
+              <w:t>Referral handoff and visit links at FairBanks Medical Centre</w:t>
             </w:r>
           </w:p>
         </w:tc>
@@ -1742,7 +1742,7 @@
                 <w:i w:val="0"/>
                 <w:sz w:val="20"/>
               </w:rPr>
-              <w:t>Aggregate exports and surveillance signals for MNCH, immunisation, outbreaks</w:t>
+              <w:t>Summary reports and disease alerts for maternal/child health, immunisation, outbreaks</w:t>
             </w:r>
           </w:p>
         </w:tc>
@@ -1790,7 +1790,7 @@
                 <w:i w:val="0"/>
                 <w:sz w:val="20"/>
               </w:rPr>
-              <w:t>Standardised JSON/API feeds when national schema is confirmed</w:t>
+              <w:t>Standard data feeds when the national format is confirmed</w:t>
             </w:r>
           </w:p>
         </w:tc>
@@ -1838,7 +1838,7 @@
                 <w:i w:val="0"/>
                 <w:sz w:val="20"/>
               </w:rPr>
-              <w:t>CHW/VHT workforce directory alignment where schemas allow</w:t>
+              <w:t>CHW/VHT worker lists aligned where the national rules allow</w:t>
             </w:r>
           </w:p>
         </w:tc>
@@ -1896,7 +1896,7 @@
           <w:i/>
           <w:sz w:val="20"/>
         </w:rPr>
-        <w:t>Figure 1. Community cascade to FCHIP to national digital health systems (chart; excluded from page limit).</w:t>
+        <w:t>Figure 1. From community visits through FCHIP into national digital health systems (chart; not counted in the page limit).</w:t>
       </w:r>
     </w:p>
     <w:p>
@@ -2016,7 +2016,7 @@
                 <w:i w:val="0"/>
                 <w:sz w:val="20"/>
               </w:rPr>
-              <w:t>Design for MoH/NDHA alignment and staged transfer of operations</w:t>
+              <w:t>Build with MoH/NDHA rules and plan a clear handoff over time</w:t>
             </w:r>
           </w:p>
         </w:tc>
@@ -2064,7 +2064,7 @@
                 <w:i w:val="0"/>
                 <w:sz w:val="20"/>
               </w:rPr>
-              <w:t>Digital workflows reinforce HIV, TB, malaria, MNCH, immunisation</w:t>
+              <w:t>Digital tools support HIV, TB, malaria, maternal/child care, and immunisation</w:t>
             </w:r>
           </w:p>
         </w:tc>
@@ -2112,7 +2112,7 @@
                 <w:i w:val="0"/>
                 <w:sz w:val="20"/>
               </w:rPr>
-              <w:t>Quality data into GOU systems - used for decisions, not parallel burden</w:t>
+              <w:t>Good data into government systems that people actually use to decide</w:t>
             </w:r>
           </w:p>
         </w:tc>
@@ -2160,7 +2160,7 @@
                 <w:i w:val="0"/>
                 <w:sz w:val="20"/>
               </w:rPr>
-              <w:t>One community-to-facility loop; less fragmentation</w:t>
+              <w:t>One community-to-clinic loop; less fragmented work</w:t>
             </w:r>
           </w:p>
         </w:tc>
@@ -2208,7 +2208,7 @@
                 <w:i w:val="0"/>
                 <w:sz w:val="20"/>
               </w:rPr>
-              <w:t>Government, CHWs/VHTs, CBOs, academic and NGO partners</w:t>
+              <w:t>Government, CHWs/VHTs, community groups, schools, and NGO partners</w:t>
             </w:r>
           </w:p>
         </w:tc>
@@ -2256,7 +2256,7 @@
                 <w:i w:val="0"/>
                 <w:sz w:val="20"/>
               </w:rPr>
-              <w:t>Pilot in live catchments; measure; refine before scale</w:t>
+              <w:t>Try in real communities; measure; improve before wider use</w:t>
             </w:r>
           </w:p>
         </w:tc>
@@ -2304,7 +2304,7 @@
                 <w:i w:val="0"/>
                 <w:sz w:val="20"/>
               </w:rPr>
-              <w:t>Align with MoH priorities and designated review platforms</w:t>
+              <w:t>Stay aligned with Ministry priorities and joint review meetings</w:t>
             </w:r>
           </w:p>
         </w:tc>
@@ -2322,7 +2322,7 @@
           <w:i w:val="0"/>
           <w:sz w:val="24"/>
         </w:rPr>
-        <w:t>7. List of Partner Roles and Responsibilities (preliminary)</w:t>
+        <w:t>7. Partner Roles (early list)</w:t>
       </w:r>
     </w:p>
     <w:p>
@@ -2337,7 +2337,7 @@
           <w:i w:val="0"/>
           <w:sz w:val="24"/>
         </w:rPr>
-        <w:t>Partners below are preliminary characterisations for Phase 1. Roles, contacts, and any subrecipient federal-share splits will be refined in Phase 2 / co-design if invited. At SOI stage, FairBanks Medical Centre is proposed as prime applicant.</w:t>
+        <w:t>The partners below are early ideas for this stage. Names, contacts, and any shared budget amounts can change in Phase 2 or joint design if we are invited. For this Statement of Interest, FairBanks Medical Centre is the lead applicant.</w:t>
       </w:r>
     </w:p>
     <w:tbl>
@@ -2395,7 +2395,7 @@
                 <w:i w:val="0"/>
                 <w:sz w:val="20"/>
               </w:rPr>
-              <w:t>Proposed role (summary)</w:t>
+              <w:t>Proposed role</w:t>
             </w:r>
           </w:p>
         </w:tc>
@@ -2443,7 +2443,7 @@
                 <w:i w:val="0"/>
                 <w:sz w:val="20"/>
               </w:rPr>
-              <w:t>Alignment with NDHA, eCHIS, and national reporting; review of interfaces and transfer plan</w:t>
+              <w:t>Align with NDHA, eCHIS, and national reporting; review links and the handoff plan</w:t>
             </w:r>
           </w:p>
         </w:tc>
@@ -2468,7 +2468,7 @@
                 <w:i w:val="0"/>
                 <w:sz w:val="20"/>
               </w:rPr>
-              <w:t>District health teams (pilot geography)</w:t>
+              <w:t>District health teams (pilot areas)</w:t>
             </w:r>
           </w:p>
         </w:tc>
@@ -2491,7 +2491,7 @@
                 <w:i w:val="0"/>
                 <w:sz w:val="20"/>
               </w:rPr>
-              <w:t>Aggregate reporting validation, dashboard use, readiness dialogue</w:t>
+              <w:t>Check summary reports, use dashboards, and discuss readiness</w:t>
             </w:r>
           </w:p>
         </w:tc>
@@ -2539,7 +2539,7 @@
                 <w:i w:val="0"/>
                 <w:sz w:val="20"/>
               </w:rPr>
-              <w:t>Primary data partners; co-design of forms and alerts</w:t>
+              <w:t>Main partners for data; help shape forms and alerts</w:t>
             </w:r>
           </w:p>
         </w:tc>
@@ -2564,7 +2564,7 @@
                 <w:i w:val="0"/>
                 <w:sz w:val="20"/>
               </w:rPr>
-              <w:t>Academic partners (to be confirmed at Phase 2)</w:t>
+              <w:t>Academic partners (to be confirmed later)</w:t>
             </w:r>
           </w:p>
         </w:tc>
@@ -2587,7 +2587,7 @@
                 <w:i w:val="0"/>
                 <w:sz w:val="20"/>
               </w:rPr>
-              <w:t>Evaluation support and interoperability testing</w:t>
+              <w:t>Help with learning and testing how systems share data</w:t>
             </w:r>
           </w:p>
         </w:tc>
@@ -2612,7 +2612,7 @@
                 <w:i w:val="0"/>
                 <w:sz w:val="20"/>
               </w:rPr>
-              <w:t>NGOs / CBOs collaborating with FairBanks Community Reach</w:t>
+              <w:t>NGOs / community groups working with FairBanks Community Reach</w:t>
             </w:r>
           </w:p>
         </w:tc>
@@ -2635,7 +2635,7 @@
                 <w:i w:val="0"/>
                 <w:sz w:val="20"/>
               </w:rPr>
-              <w:t>Outreach coordination and community engagement</w:t>
+              <w:t>Help coordinate outreach and community work</w:t>
             </w:r>
           </w:p>
         </w:tc>
@@ -2668,7 +2668,7 @@
           <w:i w:val="0"/>
           <w:sz w:val="24"/>
         </w:rPr>
-        <w:t>No cost share is proposed at the SOI stage. FairBanks will continue operating its medical centre and community outreach as complementary organisational activity. Opportunities for in-kind or matching contributions can be discussed during co-design or Phase 2 if invited.</w:t>
+        <w:t>We are not proposing cost share at this stage. FairBanks will keep running its medical centre and community outreach as normal. If invited to the next stage, we can discuss any in-kind support or matching help then.</w:t>
       </w:r>
     </w:p>
     <w:p>
@@ -2697,7 +2697,7 @@
           <w:i w:val="0"/>
           <w:sz w:val="24"/>
         </w:rPr>
-        <w:t>This Statement of Interest confirms FairBanks' intent to advance Track 2, Objective 4 with a community-rooted, interoperable, government-aligned digital health proposal. We seek invitation to Phase 2 (full proposal) and/or consultative program design, where we will detail workplans, budgets, M&amp;E, partnership letters, and a clear transition of staffing and recurrent costs toward sustainable Ugandan ownership.</w:t>
+        <w:t>With this Statement of Interest, FairBanks asks to move Track 2, Objective 4 forward through a digital health approach rooted in community work, built to connect with government systems, and designed for Ugandan ownership. We hope to be invited to Phase 2 (full proposal) or joint programme design, where we will set out workplans, budgets, monitoring, partner letters, and a clear plan to hand over staffing and running costs.</w:t>
       </w:r>
     </w:p>
     <w:p>

</xml_diff>

<commit_message>
Enhance documentation and code for FairBanks Community Health Intelligence Platform (FCHIP)
- Updated `build_dos-uganda_docs.py` to clarify the role of FCHIP in complementing Uganda's national health systems and ensuring data flows into the National Digital Health Architecture (NDHA).
- Revised project documents to reflect a documented transition plan for staffing and recurrent costs to the Ministry of Health by project close.
- Improved clarity in the proposed activities and outcomes, emphasizing collaboration with existing systems and partners.
- Adjusted the presentation of community health data benefits for stakeholders, ensuring alignment with U.S. health security goals.
</commit_message>
<xml_diff>
--- a/applications/dos-uganda/documents/dos-uganda_word.docx
+++ b/applications/dos-uganda/documents/dos-uganda_word.docx
@@ -594,7 +594,7 @@
           <w:i w:val="0"/>
           <w:sz w:val="24"/>
         </w:rPr>
-        <w:t>We want to trial, then hand over, a practical tool - the FairBanks Community Health Intelligence Platform (FCHIP) - that lets CHWs and VHTs record household and visit information on phones even offline, sync it safely, match it to national reporting needs, and help the clinic and district act. FCHIP is not meant to replace Uganda's national systems. It is a bridge so community work shows up where it should and helps prevent problems earlier.</w:t>
+        <w:t>We want to trial, then hand over, a practical tool - the FairBanks Community Health Intelligence Platform (FCHIP) - that lets CHWs and VHTs record household and visit information on phones even offline, sync it safely, match it to national reporting needs, and help the clinic and district act. FCHIP is not meant to replace Uganda's national systems or duplicate existing U.S.-supported digital health work. It is a complementary bridge so community work shows up where it should and helps prevent problems earlier - without creating a parallel silo.</w:t>
       </w:r>
     </w:p>
     <w:p>
@@ -609,7 +609,7 @@
           <w:i w:val="0"/>
           <w:sz w:val="24"/>
         </w:rPr>
-        <w:t>We will focus on the links that matter most for our catchments: household and visit data in line with eCHIS; referral and visit handoff into clinic systems (such as eAfya or ClinicMaster where used); summary reporting into DHIS2 and alerts that support eIDSR; readiness to feed the National Data Warehouse; and CHW/VHT workforce lists that can align with iHRIS where the rules allow. We will follow NDHA and OpenHIE-style sharing rules, under Ministry of Health guidance.</w:t>
+        <w:t>We deliberately focus on a feasible subset of Objective 4 systems for our catchments: household and visit data in line with eCHIS; referral and visit handoff into clinic systems (such as eAfya or ClinicMaster where used); summary reporting into DHIS2 and alerts that support eIDSR; readiness to feed the National Data Warehouse; and CHW/VHT workforce lists that can align with iHRIS where the rules allow. Laboratory, warehouse, and other named national systems stay under Ministry and partner lead; we coordinate rather than rebuild them. We will follow NDHA and OpenHIE-style sharing rules, under Ministry of Health guidance.</w:t>
       </w:r>
     </w:p>
     <w:p>
@@ -730,7 +730,7 @@
                 <w:i w:val="0"/>
                 <w:sz w:val="20"/>
               </w:rPr>
-              <w:t>More complete community data in eCHIS, DHIS2/eIDSR, and related national systems; clearer proof that referrals were closed; and a written plan to hand over staff roles and running costs to government by the end of the project.</w:t>
+              <w:t>More complete community data in eCHIS, DHIS2/eIDSR, and related national systems; clearer proof that referrals were closed; and documented transition of staffing and recurrent operating costs to MoH by project close.</w:t>
             </w:r>
           </w:p>
         </w:tc>
@@ -1016,7 +1016,7 @@
           <w:i w:val="0"/>
           <w:sz w:val="24"/>
         </w:rPr>
-        <w:t>A5. Write the sharing rules, data-handling guides, training materials, and a step-by-step government handoff plan (including staff roles and running costs) ready for a full proposal if we are invited.</w:t>
+        <w:t>A5. Write the sharing rules, data-handling guides, training materials, and a documented transition plan for staffing and recurrent operating costs to the Ministry of Health by project close - ready for a full proposal if we are invited.</w:t>
       </w:r>
     </w:p>
     <w:p>
@@ -1061,7 +1061,7 @@
           <w:i w:val="0"/>
           <w:sz w:val="24"/>
         </w:rPr>
-        <w:t>We will build for sharing, not for locking data away. Priority links are eCHIS, DHIS2/eIDSR, clinic record systems (eAfya or ClinicMaster where used), and the National Data Warehouse when the national formats are confirmed.</w:t>
+        <w:t>We will build for sharing, not for locking data away. Priority links are eCHIS, DHIS2/eIDSR, clinic record systems (eAfya or ClinicMaster where used), and the National Data Warehouse when the national formats are confirmed. We will coordinate with incumbent digital health investments so FCHIP feeds government systems rather than competing with them.</w:t>
       </w:r>
     </w:p>
     <w:p>
@@ -1091,7 +1091,7 @@
           <w:i w:val="0"/>
           <w:sz w:val="24"/>
         </w:rPr>
-        <w:t>We will shape forms and alerts with CHWs, clinic staff, and local leaders; train Ugandan staff who will keep the system going; and write every link clearly for Ministry of Health review.</w:t>
+        <w:t>We will shape forms and alerts with CHWs, clinic staff, and local leaders; train Ugandan staff who will keep the system going; and write every link clearly for Ministry of Health review, including how progressive GOU responsibility, staffing, and recurrent costs move off the award by close.</w:t>
       </w:r>
     </w:p>
     <w:p>
@@ -1135,7 +1135,7 @@
           <w:i w:val="0"/>
           <w:sz w:val="24"/>
         </w:rPr>
-        <w:t>Success means people get help earlier, government systems get stronger, work runs with less waste, Uganda can carry more of the load, and U.S. health investments stay protected:</w:t>
+        <w:t>Success advances the Department of State America First Global Health Strategy: save lives, strengthen health systems, enhance efficiency, foster self-reliance, and protect U.S. health investments that support American safety, strength, and prosperity:</w:t>
       </w:r>
     </w:p>
     <w:tbl>
@@ -1385,7 +1385,7 @@
                 <w:i w:val="0"/>
                 <w:sz w:val="20"/>
               </w:rPr>
-              <w:t>A handoff package with guides, standard procedures, training, hosting options, and a costed path to move running costs onto domestic systems by project close.</w:t>
+              <w:t>Documented transition of staffing and recurrent operating costs to the Ministry of Health by project close, with guides, training, and hosting options that Ugandan teams can run.</w:t>
             </w:r>
           </w:p>
         </w:tc>
@@ -1512,6 +1512,21 @@
           <w:sz w:val="24"/>
         </w:rPr>
         <w:t>We already keep digital clinic records and pharmacy dispensing data that support day-to-day facility work.</w:t>
+      </w:r>
+    </w:p>
+    <w:p>
+      <w:pPr>
+        <w:pStyle w:val="ListBullet"/>
+        <w:spacing w:after="60" w:line="240" w:lineRule="auto"/>
+      </w:pPr>
+      <w:r>
+        <w:rPr>
+          <w:rFonts w:ascii="Times New Roman" w:hAnsi="Times New Roman" w:eastAsia="Times New Roman"/>
+          <w:b w:val="0"/>
+          <w:i w:val="0"/>
+          <w:sz w:val="24"/>
+        </w:rPr>
+        <w:t>Community Health Insurance (CHIS) and livelihood links already run inside FairBanks Community Reach - useful context for sustainable community financing, though this SOI asks only for Objective 4 digital interoperability work.</w:t>
       </w:r>
     </w:p>
     <w:p>
@@ -1852,7 +1867,7 @@
       <w:r>
         <w:drawing>
           <wp:inline xmlns:a="http://schemas.openxmlformats.org/drawingml/2006/main" xmlns:pic="http://schemas.openxmlformats.org/drawingml/2006/picture">
-            <wp:extent cx="4665106" cy="3108960"/>
+            <wp:extent cx="4663440" cy="3108960"/>
             <wp:docPr id="1" name="Picture 1"/>
             <wp:cNvGraphicFramePr>
               <a:graphicFrameLocks noChangeAspect="1"/>
@@ -1861,7 +1876,7 @@
               <a:graphicData uri="http://schemas.openxmlformats.org/drawingml/2006/picture">
                 <pic:pic>
                   <pic:nvPicPr>
-                    <pic:cNvPr id="0" name="data_flow_iso_labeled_opt.jpg"/>
+                    <pic:cNvPr id="0" name="data_flow_iso_labeled_opt_fchip.jpg"/>
                     <pic:cNvPicPr/>
                   </pic:nvPicPr>
                   <pic:blipFill>
@@ -1873,7 +1888,7 @@
                   <pic:spPr>
                     <a:xfrm>
                       <a:off x="0" y="0"/>
-                      <a:ext cx="4665106" cy="3108960"/>
+                      <a:ext cx="4663440" cy="3108960"/>
                     </a:xfrm>
                     <a:prstGeom prst="rect"/>
                   </pic:spPr>
@@ -2337,7 +2352,7 @@
           <w:i w:val="0"/>
           <w:sz w:val="24"/>
         </w:rPr>
-        <w:t>The partners below are early ideas for this stage. Names, contacts, and any shared budget amounts can change in Phase 2 or joint design if we are invited. For this Statement of Interest, FairBanks Medical Centre is the lead applicant.</w:t>
+        <w:t>The partners below are coordination partners for Phase 1, not proposed subrecipients. FairBanks Medical Centre is the sole lead applicant; no federal share is allocated to partners at this stage. If Phase 2 or joint design proposes subawards, we will provide organisation names, points of contact (phone and email), federal share, cost share, and refined roles then.</w:t>
       </w:r>
     </w:p>
     <w:tbl>

</xml_diff>